<commit_message>
Send strings, not unix seconds to client
</commit_message>
<xml_diff>
--- a/AI Generated DDD Migration Plan.docx
+++ b/AI Generated DDD Migration Plan.docx
@@ -117,7 +117,7 @@
         <w:widowControl/>
         <w:numPr>
           <w:ilvl w:val="0"/>
-          <w:numId w:val="1"/>
+          <w:numId w:val="2"/>
         </w:numPr>
         <w:tabs>
           <w:tab w:val="left" w:pos="709" w:leader="none"/>
@@ -275,7 +275,7 @@
         <w:widowControl/>
         <w:numPr>
           <w:ilvl w:val="0"/>
-          <w:numId w:val="1"/>
+          <w:numId w:val="2"/>
         </w:numPr>
         <w:tabs>
           <w:tab w:val="left" w:pos="709" w:leader="none"/>
@@ -377,7 +377,7 @@
         <w:widowControl/>
         <w:numPr>
           <w:ilvl w:val="0"/>
-          <w:numId w:val="1"/>
+          <w:numId w:val="2"/>
         </w:numPr>
         <w:tabs>
           <w:tab w:val="left" w:pos="709" w:leader="none"/>
@@ -423,7 +423,7 @@
         <w:widowControl/>
         <w:numPr>
           <w:ilvl w:val="0"/>
-          <w:numId w:val="1"/>
+          <w:numId w:val="2"/>
         </w:numPr>
         <w:tabs>
           <w:tab w:val="left" w:pos="709" w:leader="none"/>
@@ -627,7 +627,7 @@
         <w:widowControl/>
         <w:numPr>
           <w:ilvl w:val="0"/>
-          <w:numId w:val="2"/>
+          <w:numId w:val="3"/>
         </w:numPr>
         <w:tabs>
           <w:tab w:val="left" w:pos="709" w:leader="none"/>
@@ -756,7 +756,7 @@
         <w:widowControl/>
         <w:numPr>
           <w:ilvl w:val="0"/>
-          <w:numId w:val="2"/>
+          <w:numId w:val="3"/>
         </w:numPr>
         <w:tabs>
           <w:tab w:val="left" w:pos="709" w:leader="none"/>
@@ -857,7 +857,7 @@
         <w:widowControl/>
         <w:numPr>
           <w:ilvl w:val="0"/>
-          <w:numId w:val="2"/>
+          <w:numId w:val="3"/>
         </w:numPr>
         <w:tabs>
           <w:tab w:val="left" w:pos="709" w:leader="none"/>
@@ -958,7 +958,7 @@
         <w:widowControl/>
         <w:numPr>
           <w:ilvl w:val="0"/>
-          <w:numId w:val="2"/>
+          <w:numId w:val="3"/>
         </w:numPr>
         <w:tabs>
           <w:tab w:val="left" w:pos="709" w:leader="none"/>
@@ -1031,7 +1031,7 @@
         <w:widowControl/>
         <w:numPr>
           <w:ilvl w:val="0"/>
-          <w:numId w:val="2"/>
+          <w:numId w:val="3"/>
         </w:numPr>
         <w:tabs>
           <w:tab w:val="left" w:pos="709" w:leader="none"/>
@@ -1160,7 +1160,7 @@
         <w:widowControl/>
         <w:numPr>
           <w:ilvl w:val="0"/>
-          <w:numId w:val="2"/>
+          <w:numId w:val="3"/>
         </w:numPr>
         <w:tabs>
           <w:tab w:val="left" w:pos="709" w:leader="none"/>
@@ -1738,7 +1738,7 @@
         <w:widowControl/>
         <w:numPr>
           <w:ilvl w:val="0"/>
-          <w:numId w:val="3"/>
+          <w:numId w:val="4"/>
         </w:numPr>
         <w:tabs>
           <w:tab w:val="clear" w:pos="709"/>
@@ -1766,7 +1766,7 @@
         <w:widowControl/>
         <w:numPr>
           <w:ilvl w:val="0"/>
-          <w:numId w:val="4"/>
+          <w:numId w:val="5"/>
         </w:numPr>
         <w:tabs>
           <w:tab w:val="clear" w:pos="709"/>
@@ -2023,9 +2023,9 @@
       </w:tblPr>
       <w:tblGrid>
         <w:gridCol w:w="3135"/>
-        <w:gridCol w:w="1257"/>
+        <w:gridCol w:w="1256"/>
         <w:gridCol w:w="932"/>
-        <w:gridCol w:w="4892"/>
+        <w:gridCol w:w="4893"/>
       </w:tblGrid>
       <w:tr>
         <w:trPr>
@@ -2059,7 +2059,7 @@
         </w:tc>
         <w:tc>
           <w:tcPr>
-            <w:tcW w:w="1257" w:type="dxa"/>
+            <w:tcW w:w="1256" w:type="dxa"/>
             <w:tcBorders>
               <w:top w:val="single" w:sz="6" w:space="0" w:color="2A2B2C"/>
               <w:bottom w:val="single" w:sz="6" w:space="0" w:color="2A2B2C"/>
@@ -2111,7 +2111,7 @@
         </w:tc>
         <w:tc>
           <w:tcPr>
-            <w:tcW w:w="4892" w:type="dxa"/>
+            <w:tcW w:w="4893" w:type="dxa"/>
             <w:tcBorders>
               <w:top w:val="single" w:sz="6" w:space="0" w:color="2A2B2C"/>
               <w:bottom w:val="single" w:sz="6" w:space="0" w:color="2A2B2C"/>
@@ -2166,7 +2166,7 @@
         </w:tc>
         <w:tc>
           <w:tcPr>
-            <w:tcW w:w="1257" w:type="dxa"/>
+            <w:tcW w:w="1256" w:type="dxa"/>
             <w:tcBorders>
               <w:top w:val="single" w:sz="6" w:space="0" w:color="2A2B2C"/>
               <w:bottom w:val="single" w:sz="6" w:space="0" w:color="2A2B2C"/>
@@ -2222,7 +2222,7 @@
         </w:tc>
         <w:tc>
           <w:tcPr>
-            <w:tcW w:w="4892" w:type="dxa"/>
+            <w:tcW w:w="4893" w:type="dxa"/>
             <w:tcBorders>
               <w:top w:val="single" w:sz="6" w:space="0" w:color="2A2B2C"/>
               <w:bottom w:val="single" w:sz="6" w:space="0" w:color="2A2B2C"/>
@@ -2292,7 +2292,7 @@
         </w:tc>
         <w:tc>
           <w:tcPr>
-            <w:tcW w:w="1257" w:type="dxa"/>
+            <w:tcW w:w="1256" w:type="dxa"/>
             <w:tcBorders>
               <w:top w:val="single" w:sz="6" w:space="0" w:color="2A2B2C"/>
               <w:bottom w:val="single" w:sz="6" w:space="0" w:color="2A2B2C"/>
@@ -2348,7 +2348,7 @@
         </w:tc>
         <w:tc>
           <w:tcPr>
-            <w:tcW w:w="4892" w:type="dxa"/>
+            <w:tcW w:w="4893" w:type="dxa"/>
             <w:tcBorders>
               <w:top w:val="single" w:sz="6" w:space="0" w:color="2A2B2C"/>
               <w:bottom w:val="single" w:sz="6" w:space="0" w:color="2A2B2C"/>
@@ -2434,7 +2434,7 @@
         </w:tc>
         <w:tc>
           <w:tcPr>
-            <w:tcW w:w="1257" w:type="dxa"/>
+            <w:tcW w:w="1256" w:type="dxa"/>
             <w:tcBorders>
               <w:top w:val="single" w:sz="6" w:space="0" w:color="2A2B2C"/>
               <w:bottom w:val="single" w:sz="6" w:space="0" w:color="2A2B2C"/>
@@ -2490,7 +2490,7 @@
         </w:tc>
         <w:tc>
           <w:tcPr>
-            <w:tcW w:w="4892" w:type="dxa"/>
+            <w:tcW w:w="4893" w:type="dxa"/>
             <w:tcBorders>
               <w:top w:val="single" w:sz="6" w:space="0" w:color="2A2B2C"/>
               <w:bottom w:val="single" w:sz="6" w:space="0" w:color="2A2B2C"/>
@@ -2548,7 +2548,7 @@
         </w:tc>
         <w:tc>
           <w:tcPr>
-            <w:tcW w:w="1257" w:type="dxa"/>
+            <w:tcW w:w="1256" w:type="dxa"/>
             <w:tcBorders>
               <w:top w:val="single" w:sz="6" w:space="0" w:color="2A2B2C"/>
               <w:bottom w:val="single" w:sz="6" w:space="0" w:color="2A2B2C"/>
@@ -2604,7 +2604,7 @@
         </w:tc>
         <w:tc>
           <w:tcPr>
-            <w:tcW w:w="4892" w:type="dxa"/>
+            <w:tcW w:w="4893" w:type="dxa"/>
             <w:tcBorders>
               <w:top w:val="single" w:sz="6" w:space="0" w:color="2A2B2C"/>
               <w:bottom w:val="single" w:sz="6" w:space="0" w:color="2A2B2C"/>
@@ -2674,7 +2674,7 @@
         </w:tc>
         <w:tc>
           <w:tcPr>
-            <w:tcW w:w="1257" w:type="dxa"/>
+            <w:tcW w:w="1256" w:type="dxa"/>
             <w:tcBorders>
               <w:top w:val="single" w:sz="6" w:space="0" w:color="2A2B2C"/>
               <w:bottom w:val="single" w:sz="6" w:space="0" w:color="2A2B2C"/>
@@ -2730,7 +2730,7 @@
         </w:tc>
         <w:tc>
           <w:tcPr>
-            <w:tcW w:w="4892" w:type="dxa"/>
+            <w:tcW w:w="4893" w:type="dxa"/>
             <w:tcBorders>
               <w:top w:val="single" w:sz="6" w:space="0" w:color="2A2B2C"/>
               <w:bottom w:val="single" w:sz="6" w:space="0" w:color="2A2B2C"/>
@@ -2788,7 +2788,7 @@
         </w:tc>
         <w:tc>
           <w:tcPr>
-            <w:tcW w:w="1257" w:type="dxa"/>
+            <w:tcW w:w="1256" w:type="dxa"/>
             <w:tcBorders>
               <w:top w:val="single" w:sz="6" w:space="0" w:color="2A2B2C"/>
               <w:bottom w:val="single" w:sz="6" w:space="0" w:color="2A2B2C"/>
@@ -2844,7 +2844,7 @@
         </w:tc>
         <w:tc>
           <w:tcPr>
-            <w:tcW w:w="4892" w:type="dxa"/>
+            <w:tcW w:w="4893" w:type="dxa"/>
             <w:tcBorders>
               <w:top w:val="single" w:sz="6" w:space="0" w:color="2A2B2C"/>
               <w:bottom w:val="single" w:sz="6" w:space="0" w:color="2A2B2C"/>
@@ -3573,7 +3573,7 @@
         <w:widowControl/>
         <w:numPr>
           <w:ilvl w:val="0"/>
-          <w:numId w:val="5"/>
+          <w:numId w:val="6"/>
         </w:numPr>
         <w:tabs>
           <w:tab w:val="clear" w:pos="709"/>
@@ -3651,7 +3651,7 @@
         <w:widowControl/>
         <w:numPr>
           <w:ilvl w:val="0"/>
-          <w:numId w:val="5"/>
+          <w:numId w:val="6"/>
         </w:numPr>
         <w:tabs>
           <w:tab w:val="clear" w:pos="709"/>
@@ -3758,7 +3758,7 @@
         <w:widowControl/>
         <w:numPr>
           <w:ilvl w:val="0"/>
-          <w:numId w:val="5"/>
+          <w:numId w:val="6"/>
         </w:numPr>
         <w:tabs>
           <w:tab w:val="clear" w:pos="709"/>
@@ -3807,7 +3807,7 @@
         <w:widowControl/>
         <w:numPr>
           <w:ilvl w:val="0"/>
-          <w:numId w:val="5"/>
+          <w:numId w:val="6"/>
         </w:numPr>
         <w:tabs>
           <w:tab w:val="clear" w:pos="709"/>
@@ -3970,7 +3970,7 @@
         <w:widowControl/>
         <w:numPr>
           <w:ilvl w:val="0"/>
-          <w:numId w:val="6"/>
+          <w:numId w:val="7"/>
         </w:numPr>
         <w:tabs>
           <w:tab w:val="clear" w:pos="709"/>
@@ -4017,7 +4017,7 @@
         <w:widowControl/>
         <w:numPr>
           <w:ilvl w:val="0"/>
-          <w:numId w:val="6"/>
+          <w:numId w:val="7"/>
         </w:numPr>
         <w:tabs>
           <w:tab w:val="clear" w:pos="709"/>
@@ -4064,7 +4064,7 @@
         <w:widowControl/>
         <w:numPr>
           <w:ilvl w:val="0"/>
-          <w:numId w:val="6"/>
+          <w:numId w:val="7"/>
         </w:numPr>
         <w:tabs>
           <w:tab w:val="clear" w:pos="709"/>
@@ -4163,6 +4163,1052 @@
           <w:color w:val="auto"/>
           <w:spacing w:val="0"/>
           <w:sz w:val="20"/>
+        </w:rPr>
+      </w:r>
+      <w:r>
+        <w:br w:type="page"/>
+      </w:r>
+    </w:p>
+    <w:p>
+      <w:pPr>
+        <w:pStyle w:val="BodyText"/>
+        <w:widowControl/>
+        <w:bidi w:val="0"/>
+        <w:spacing w:before="0" w:after="140"/>
+        <w:ind w:hanging="0" w:left="0" w:right="0"/>
+        <w:jc w:val="left"/>
+        <w:rPr>
+          <w:rFonts w:ascii="Noto Serif" w:hAnsi="Noto Serif"/>
+          <w:b w:val="false"/>
+          <w:i w:val="false"/>
+          <w:caps w:val="false"/>
+          <w:smallCaps w:val="false"/>
+          <w:color w:val="auto"/>
+          <w:spacing w:val="0"/>
+          <w:sz w:val="20"/>
+          <w:highlight w:val="none"/>
+          <w:shd w:fill="auto" w:val="clear"/>
+        </w:rPr>
+      </w:pPr>
+      <w:r>
+        <w:rPr>
+          <w:rFonts w:ascii="Noto Serif" w:hAnsi="Noto Serif"/>
+          <w:b w:val="false"/>
+          <w:i w:val="false"/>
+          <w:caps w:val="false"/>
+          <w:smallCaps w:val="false"/>
+          <w:color w:val="auto"/>
+          <w:spacing w:val="0"/>
+          <w:sz w:val="20"/>
+          <w:shd w:fill="auto" w:val="clear"/>
+        </w:rPr>
+        <w:t>I've implemented clean architecture in this project, but I've done with a different project for each layer. Supposedly that is not necessary, but it is conceptulally easy for me to enforce one-directional dependencies this way. When people would different layers in the same project, how do they enforce ond directional dependency flows?</w:t>
+      </w:r>
+    </w:p>
+    <w:p>
+      <w:pPr>
+        <w:pStyle w:val="BodyText"/>
+        <w:widowControl/>
+        <w:bidi w:val="0"/>
+        <w:spacing w:before="0" w:after="140"/>
+        <w:ind w:hanging="0" w:left="0" w:right="0"/>
+        <w:jc w:val="left"/>
+        <w:rPr>
+          <w:rFonts w:ascii="Noto Serif" w:hAnsi="Noto Serif"/>
+          <w:b w:val="false"/>
+          <w:i w:val="false"/>
+          <w:caps w:val="false"/>
+          <w:smallCaps w:val="false"/>
+          <w:color w:val="auto"/>
+          <w:spacing w:val="0"/>
+          <w:sz w:val="20"/>
+          <w:highlight w:val="none"/>
+          <w:shd w:fill="auto" w:val="clear"/>
+        </w:rPr>
+      </w:pPr>
+      <w:r>
+        <w:rPr>
+          <w:rFonts w:ascii="Noto Serif" w:hAnsi="Noto Serif"/>
+          <w:b w:val="false"/>
+          <w:i w:val="false"/>
+          <w:caps w:val="false"/>
+          <w:smallCaps w:val="false"/>
+          <w:color w:val="auto"/>
+          <w:spacing w:val="0"/>
+          <w:sz w:val="20"/>
+          <w:shd w:fill="auto" w:val="clear"/>
+        </w:rPr>
+        <w:t>——————————————————————————————————————————————————</w:t>
+      </w:r>
+    </w:p>
+    <w:p>
+      <w:pPr>
+        <w:pStyle w:val="BodyText"/>
+        <w:widowControl/>
+        <w:bidi w:val="0"/>
+        <w:spacing w:before="0" w:after="140"/>
+        <w:ind w:hanging="0" w:left="0" w:right="0"/>
+        <w:jc w:val="left"/>
+        <w:rPr>
+          <w:rFonts w:ascii="apple-system;BlinkMacSystemFont;Segoe UI;Roboto;sans-serif" w:hAnsi="apple-system;BlinkMacSystemFont;Segoe UI;Roboto;sans-serif"/>
+          <w:b w:val="false"/>
+          <w:i w:val="false"/>
+          <w:caps w:val="false"/>
+          <w:smallCaps w:val="false"/>
+          <w:color w:val="auto"/>
+          <w:spacing w:val="0"/>
+          <w:sz w:val="20"/>
+        </w:rPr>
+      </w:pPr>
+      <w:r>
+        <w:rPr>
+          <w:rFonts w:ascii="apple-system;BlinkMacSystemFont;Segoe UI;Roboto;sans-serif" w:hAnsi="apple-system;BlinkMacSystemFont;Segoe UI;Roboto;sans-serif"/>
+          <w:b w:val="false"/>
+          <w:i w:val="false"/>
+          <w:caps w:val="false"/>
+          <w:smallCaps w:val="false"/>
+          <w:color w:val="auto"/>
+          <w:spacing w:val="0"/>
+          <w:sz w:val="20"/>
+        </w:rPr>
+        <w:t>There are a few common approaches:</w:t>
+      </w:r>
+    </w:p>
+    <w:p>
+      <w:pPr>
+        <w:pStyle w:val="BodyText"/>
+        <w:widowControl/>
+        <w:numPr>
+          <w:ilvl w:val="0"/>
+          <w:numId w:val="8"/>
+        </w:numPr>
+        <w:tabs>
+          <w:tab w:val="clear" w:pos="709"/>
+          <w:tab w:val="left" w:pos="0" w:leader="none"/>
+        </w:tabs>
+        <w:ind w:hanging="0" w:left="709" w:right="0"/>
+        <w:rPr>
+          <w:rFonts w:ascii="apple-system;BlinkMacSystemFont;Segoe UI;Roboto;sans-serif" w:hAnsi="apple-system;BlinkMacSystemFont;Segoe UI;Roboto;sans-serif"/>
+          <w:sz w:val="20"/>
+        </w:rPr>
+      </w:pPr>
+      <w:r>
+        <w:rPr>
+          <w:rStyle w:val="Strong"/>
+          <w:rFonts w:ascii="apple-system;BlinkMacSystemFont;Segoe UI;Roboto;sans-serif" w:hAnsi="apple-system;BlinkMacSystemFont;Segoe UI;Roboto;sans-serif"/>
+          <w:b w:val="false"/>
+          <w:i w:val="false"/>
+          <w:caps w:val="false"/>
+          <w:smallCaps w:val="false"/>
+          <w:color w:val="auto"/>
+          <w:spacing w:val="0"/>
+          <w:sz w:val="20"/>
+        </w:rPr>
+        <w:t>ArchUnit / NetArchTest</w:t>
+      </w:r>
+      <w:r>
+        <w:rPr>
+          <w:rFonts w:ascii="apple-system;BlinkMacSystemFont;Segoe UI;Roboto;sans-serif" w:hAnsi="apple-system;BlinkMacSystemFont;Segoe UI;Roboto;sans-serif"/>
+          <w:b w:val="false"/>
+          <w:i w:val="false"/>
+          <w:caps w:val="false"/>
+          <w:smallCaps w:val="false"/>
+          <w:color w:val="auto"/>
+          <w:spacing w:val="0"/>
+          <w:sz w:val="20"/>
+        </w:rPr>
+        <w:t xml:space="preserve"> — The most popular mechanical enforcement. You write unit tests that assert dependency rules like "classes in </w:t>
+      </w:r>
+      <w:r>
+        <w:rPr>
+          <w:rStyle w:val="SourceText"/>
+          <w:rFonts w:ascii="monospace" w:hAnsi="monospace"/>
+          <w:b w:val="false"/>
+          <w:i w:val="false"/>
+          <w:caps w:val="false"/>
+          <w:smallCaps w:val="false"/>
+          <w:color w:val="auto"/>
+          <w:spacing w:val="0"/>
+          <w:sz w:val="20"/>
+          <w:shd w:fill="262626" w:val="clear"/>
+        </w:rPr>
+        <w:t>Domain</w:t>
+      </w:r>
+      <w:r>
+        <w:rPr>
+          <w:rFonts w:ascii="apple-system;BlinkMacSystemFont;Segoe UI;Roboto;sans-serif" w:hAnsi="apple-system;BlinkMacSystemFont;Segoe UI;Roboto;sans-serif"/>
+          <w:b w:val="false"/>
+          <w:i w:val="false"/>
+          <w:caps w:val="false"/>
+          <w:smallCaps w:val="false"/>
+          <w:color w:val="auto"/>
+          <w:spacing w:val="0"/>
+          <w:sz w:val="20"/>
+        </w:rPr>
+        <w:t xml:space="preserve"> namespace must not reference classes in </w:t>
+      </w:r>
+      <w:r>
+        <w:rPr>
+          <w:rStyle w:val="SourceText"/>
+          <w:rFonts w:ascii="monospace" w:hAnsi="monospace"/>
+          <w:b w:val="false"/>
+          <w:i w:val="false"/>
+          <w:caps w:val="false"/>
+          <w:smallCaps w:val="false"/>
+          <w:color w:val="auto"/>
+          <w:spacing w:val="0"/>
+          <w:sz w:val="20"/>
+          <w:shd w:fill="262626" w:val="clear"/>
+        </w:rPr>
+        <w:t>Infrastructure</w:t>
+      </w:r>
+      <w:r>
+        <w:rPr>
+          <w:rFonts w:ascii="apple-system;BlinkMacSystemFont;Segoe UI;Roboto;sans-serif" w:hAnsi="apple-system;BlinkMacSystemFont;Segoe UI;Roboto;sans-serif"/>
+          <w:b w:val="false"/>
+          <w:i w:val="false"/>
+          <w:caps w:val="false"/>
+          <w:smallCaps w:val="false"/>
+          <w:color w:val="auto"/>
+          <w:spacing w:val="0"/>
+          <w:sz w:val="20"/>
+        </w:rPr>
+        <w:t xml:space="preserve"> namespace." If someone adds a bad </w:t>
+      </w:r>
+      <w:r>
+        <w:rPr>
+          <w:rStyle w:val="SourceText"/>
+          <w:rFonts w:ascii="monospace" w:hAnsi="monospace"/>
+          <w:b w:val="false"/>
+          <w:i w:val="false"/>
+          <w:caps w:val="false"/>
+          <w:smallCaps w:val="false"/>
+          <w:color w:val="auto"/>
+          <w:spacing w:val="0"/>
+          <w:sz w:val="20"/>
+          <w:shd w:fill="262626" w:val="clear"/>
+        </w:rPr>
+        <w:t>using</w:t>
+      </w:r>
+      <w:r>
+        <w:rPr>
+          <w:rFonts w:ascii="apple-system;BlinkMacSystemFont;Segoe UI;Roboto;sans-serif" w:hAnsi="apple-system;BlinkMacSystemFont;Segoe UI;Roboto;sans-serif"/>
+          <w:b w:val="false"/>
+          <w:i w:val="false"/>
+          <w:caps w:val="false"/>
+          <w:smallCaps w:val="false"/>
+          <w:color w:val="auto"/>
+          <w:spacing w:val="0"/>
+          <w:sz w:val="20"/>
+        </w:rPr>
+        <w:t xml:space="preserve">, the test fails. In .NET, the library is </w:t>
+      </w:r>
+      <w:hyperlink r:id="rId2" w:tgtFrame="_blank">
+        <w:r>
+          <w:rPr>
+            <w:rStyle w:val="Hyperlink"/>
+            <w:rFonts w:ascii="apple-system;BlinkMacSystemFont;Segoe UI;Roboto;sans-serif" w:hAnsi="apple-system;BlinkMacSystemFont;Segoe UI;Roboto;sans-serif"/>
+            <w:b w:val="false"/>
+            <w:i w:val="false"/>
+            <w:caps w:val="false"/>
+            <w:smallCaps w:val="false"/>
+            <w:color w:val="auto"/>
+            <w:spacing w:val="0"/>
+            <w:sz w:val="20"/>
+          </w:rPr>
+          <w:t>NetArchTest</w:t>
+        </w:r>
+      </w:hyperlink>
+      <w:r>
+        <w:rPr>
+          <w:rFonts w:ascii="apple-system;BlinkMacSystemFont;Segoe UI;Roboto;sans-serif" w:hAnsi="apple-system;BlinkMacSystemFont;Segoe UI;Roboto;sans-serif"/>
+          <w:b w:val="false"/>
+          <w:i w:val="false"/>
+          <w:caps w:val="false"/>
+          <w:smallCaps w:val="false"/>
+          <w:color w:val="auto"/>
+          <w:spacing w:val="0"/>
+          <w:sz w:val="20"/>
+        </w:rPr>
+        <w:t>.</w:t>
+      </w:r>
+    </w:p>
+    <w:p>
+      <w:pPr>
+        <w:pStyle w:val="BodyText"/>
+        <w:widowControl/>
+        <w:numPr>
+          <w:ilvl w:val="0"/>
+          <w:numId w:val="8"/>
+        </w:numPr>
+        <w:tabs>
+          <w:tab w:val="clear" w:pos="709"/>
+          <w:tab w:val="left" w:pos="0" w:leader="none"/>
+        </w:tabs>
+        <w:ind w:hanging="0" w:left="709" w:right="0"/>
+        <w:rPr>
+          <w:rFonts w:ascii="apple-system;BlinkMacSystemFont;Segoe UI;Roboto;sans-serif" w:hAnsi="apple-system;BlinkMacSystemFont;Segoe UI;Roboto;sans-serif"/>
+          <w:sz w:val="20"/>
+        </w:rPr>
+      </w:pPr>
+      <w:r>
+        <w:rPr>
+          <w:rStyle w:val="Strong"/>
+          <w:rFonts w:ascii="apple-system;BlinkMacSystemFont;Segoe UI;Roboto;sans-serif" w:hAnsi="apple-system;BlinkMacSystemFont;Segoe UI;Roboto;sans-serif"/>
+          <w:b w:val="false"/>
+          <w:i w:val="false"/>
+          <w:caps w:val="false"/>
+          <w:smallCaps w:val="false"/>
+          <w:color w:val="auto"/>
+          <w:spacing w:val="0"/>
+          <w:sz w:val="20"/>
+        </w:rPr>
+        <w:t>Analyzers / Roslyn rules</w:t>
+      </w:r>
+      <w:r>
+        <w:rPr>
+          <w:rFonts w:ascii="apple-system;BlinkMacSystemFont;Segoe UI;Roboto;sans-serif" w:hAnsi="apple-system;BlinkMacSystemFont;Segoe UI;Roboto;sans-serif"/>
+          <w:b w:val="false"/>
+          <w:i w:val="false"/>
+          <w:caps w:val="false"/>
+          <w:smallCaps w:val="false"/>
+          <w:color w:val="auto"/>
+          <w:spacing w:val="0"/>
+          <w:sz w:val="20"/>
+        </w:rPr>
+        <w:t xml:space="preserve"> — Custom or third-party Roslyn analyzers that flag illegal cross-layer references at compile time (red squiggles in the IDE, build errors in CI). More immediate feedback than tests, but more setup.</w:t>
+      </w:r>
+    </w:p>
+    <w:p>
+      <w:pPr>
+        <w:pStyle w:val="BodyText"/>
+        <w:widowControl/>
+        <w:numPr>
+          <w:ilvl w:val="0"/>
+          <w:numId w:val="8"/>
+        </w:numPr>
+        <w:tabs>
+          <w:tab w:val="clear" w:pos="709"/>
+          <w:tab w:val="left" w:pos="0" w:leader="none"/>
+        </w:tabs>
+        <w:ind w:hanging="0" w:left="709" w:right="0"/>
+        <w:rPr>
+          <w:rFonts w:ascii="apple-system;BlinkMacSystemFont;Segoe UI;Roboto;sans-serif" w:hAnsi="apple-system;BlinkMacSystemFont;Segoe UI;Roboto;sans-serif"/>
+          <w:sz w:val="20"/>
+        </w:rPr>
+      </w:pPr>
+      <w:r>
+        <w:rPr>
+          <w:rStyle w:val="Strong"/>
+          <w:rFonts w:ascii="apple-system;BlinkMacSystemFont;Segoe UI;Roboto;sans-serif" w:hAnsi="apple-system;BlinkMacSystemFont;Segoe UI;Roboto;sans-serif"/>
+          <w:b w:val="false"/>
+          <w:i w:val="false"/>
+          <w:caps w:val="false"/>
+          <w:smallCaps w:val="false"/>
+          <w:color w:val="auto"/>
+          <w:spacing w:val="0"/>
+          <w:sz w:val="20"/>
+        </w:rPr>
+        <w:t>Code review discipline</w:t>
+      </w:r>
+      <w:r>
+        <w:rPr>
+          <w:rFonts w:ascii="apple-system;BlinkMacSystemFont;Segoe UI;Roboto;sans-serif" w:hAnsi="apple-system;BlinkMacSystemFont;Segoe UI;Roboto;sans-serif"/>
+          <w:b w:val="false"/>
+          <w:i w:val="false"/>
+          <w:caps w:val="false"/>
+          <w:smallCaps w:val="false"/>
+          <w:color w:val="auto"/>
+          <w:spacing w:val="0"/>
+          <w:sz w:val="20"/>
+        </w:rPr>
+        <w:t xml:space="preserve"> — Honestly the most common in practice, especially on smaller teams. No tooling, just convention and vigilance. It works until it doesn't.</w:t>
+      </w:r>
+    </w:p>
+    <w:p>
+      <w:pPr>
+        <w:pStyle w:val="BodyText"/>
+        <w:widowControl/>
+        <w:numPr>
+          <w:ilvl w:val="0"/>
+          <w:numId w:val="8"/>
+        </w:numPr>
+        <w:tabs>
+          <w:tab w:val="clear" w:pos="709"/>
+          <w:tab w:val="left" w:pos="0" w:leader="none"/>
+        </w:tabs>
+        <w:ind w:hanging="0" w:left="709" w:right="0"/>
+        <w:rPr>
+          <w:rFonts w:ascii="apple-system;BlinkMacSystemFont;Segoe UI;Roboto;sans-serif" w:hAnsi="apple-system;BlinkMacSystemFont;Segoe UI;Roboto;sans-serif"/>
+          <w:sz w:val="20"/>
+        </w:rPr>
+      </w:pPr>
+      <w:r>
+        <w:rPr>
+          <w:rStyle w:val="Strong"/>
+          <w:rFonts w:ascii="apple-system;BlinkMacSystemFont;Segoe UI;Roboto;sans-serif" w:hAnsi="apple-system;BlinkMacSystemFont;Segoe UI;Roboto;sans-serif"/>
+          <w:b w:val="false"/>
+          <w:i w:val="false"/>
+          <w:caps w:val="false"/>
+          <w:smallCaps w:val="false"/>
+          <w:color w:val="auto"/>
+          <w:spacing w:val="0"/>
+          <w:sz w:val="20"/>
+        </w:rPr>
+        <w:t>Folder/namespace conventions + linting</w:t>
+      </w:r>
+      <w:r>
+        <w:rPr>
+          <w:rFonts w:ascii="apple-system;BlinkMacSystemFont;Segoe UI;Roboto;sans-serif" w:hAnsi="apple-system;BlinkMacSystemFont;Segoe UI;Roboto;sans-serif"/>
+          <w:b w:val="false"/>
+          <w:i w:val="false"/>
+          <w:caps w:val="false"/>
+          <w:smallCaps w:val="false"/>
+          <w:color w:val="auto"/>
+          <w:spacing w:val="0"/>
+          <w:sz w:val="20"/>
+        </w:rPr>
+        <w:t xml:space="preserve"> — Some teams use tools like </w:t>
+      </w:r>
+      <w:r>
+        <w:rPr>
+          <w:rStyle w:val="SourceText"/>
+          <w:rFonts w:ascii="monospace" w:hAnsi="monospace"/>
+          <w:b w:val="false"/>
+          <w:i w:val="false"/>
+          <w:caps w:val="false"/>
+          <w:smallCaps w:val="false"/>
+          <w:color w:val="auto"/>
+          <w:spacing w:val="0"/>
+          <w:sz w:val="20"/>
+          <w:shd w:fill="262626" w:val="clear"/>
+        </w:rPr>
+        <w:t>dotnet-dependency-guard</w:t>
+      </w:r>
+      <w:r>
+        <w:rPr>
+          <w:rFonts w:ascii="apple-system;BlinkMacSystemFont;Segoe UI;Roboto;sans-serif" w:hAnsi="apple-system;BlinkMacSystemFont;Segoe UI;Roboto;sans-serif"/>
+          <w:b w:val="false"/>
+          <w:i w:val="false"/>
+          <w:caps w:val="false"/>
+          <w:smallCaps w:val="false"/>
+          <w:color w:val="auto"/>
+          <w:spacing w:val="0"/>
+          <w:sz w:val="20"/>
+        </w:rPr>
+        <w:t xml:space="preserve"> or simply grep-based CI checks that scan </w:t>
+      </w:r>
+      <w:r>
+        <w:rPr>
+          <w:rStyle w:val="SourceText"/>
+          <w:rFonts w:ascii="monospace" w:hAnsi="monospace"/>
+          <w:b w:val="false"/>
+          <w:i w:val="false"/>
+          <w:caps w:val="false"/>
+          <w:smallCaps w:val="false"/>
+          <w:color w:val="auto"/>
+          <w:spacing w:val="0"/>
+          <w:sz w:val="20"/>
+          <w:shd w:fill="262626" w:val="clear"/>
+        </w:rPr>
+        <w:t>using</w:t>
+      </w:r>
+      <w:r>
+        <w:rPr>
+          <w:rFonts w:ascii="apple-system;BlinkMacSystemFont;Segoe UI;Roboto;sans-serif" w:hAnsi="apple-system;BlinkMacSystemFont;Segoe UI;Roboto;sans-serif"/>
+          <w:b w:val="false"/>
+          <w:i w:val="false"/>
+          <w:caps w:val="false"/>
+          <w:smallCaps w:val="false"/>
+          <w:color w:val="auto"/>
+          <w:spacing w:val="0"/>
+          <w:sz w:val="20"/>
+        </w:rPr>
+        <w:t xml:space="preserve"> statements for violations.</w:t>
+      </w:r>
+    </w:p>
+    <w:p>
+      <w:pPr>
+        <w:pStyle w:val="BodyText"/>
+        <w:widowControl/>
+        <w:ind w:hanging="0" w:left="0" w:right="0"/>
+        <w:rPr>
+          <w:rFonts w:ascii="apple-system;BlinkMacSystemFont;Segoe UI;Roboto;sans-serif" w:hAnsi="apple-system;BlinkMacSystemFont;Segoe UI;Roboto;sans-serif"/>
+          <w:sz w:val="20"/>
+        </w:rPr>
+      </w:pPr>
+      <w:r>
+        <w:rPr>
+          <w:rFonts w:ascii="apple-system;BlinkMacSystemFont;Segoe UI;Roboto;sans-serif" w:hAnsi="apple-system;BlinkMacSystemFont;Segoe UI;Roboto;sans-serif"/>
+          <w:b w:val="false"/>
+          <w:i w:val="false"/>
+          <w:caps w:val="false"/>
+          <w:smallCaps w:val="false"/>
+          <w:color w:val="auto"/>
+          <w:spacing w:val="0"/>
+          <w:sz w:val="20"/>
+        </w:rPr>
+        <w:t xml:space="preserve">The tradeoff is: separate projects give you </w:t>
+      </w:r>
+      <w:r>
+        <w:rPr>
+          <w:rStyle w:val="Strong"/>
+          <w:rFonts w:ascii="apple-system;BlinkMacSystemFont;Segoe UI;Roboto;sans-serif" w:hAnsi="apple-system;BlinkMacSystemFont;Segoe UI;Roboto;sans-serif"/>
+          <w:b w:val="false"/>
+          <w:i w:val="false"/>
+          <w:caps w:val="false"/>
+          <w:smallCaps w:val="false"/>
+          <w:color w:val="auto"/>
+          <w:spacing w:val="0"/>
+          <w:sz w:val="20"/>
+        </w:rPr>
+        <w:t>compile-time guarantees for free</w:t>
+      </w:r>
+      <w:r>
+        <w:rPr>
+          <w:rFonts w:ascii="apple-system;BlinkMacSystemFont;Segoe UI;Roboto;sans-serif" w:hAnsi="apple-system;BlinkMacSystemFont;Segoe UI;Roboto;sans-serif"/>
+          <w:b w:val="false"/>
+          <w:i w:val="false"/>
+          <w:caps w:val="false"/>
+          <w:smallCaps w:val="false"/>
+          <w:color w:val="auto"/>
+          <w:spacing w:val="0"/>
+          <w:sz w:val="20"/>
+        </w:rPr>
+        <w:t xml:space="preserve"> — the compiler literally won't let </w:t>
+      </w:r>
+      <w:r>
+        <w:rPr>
+          <w:rStyle w:val="SourceText"/>
+          <w:rFonts w:ascii="monospace" w:hAnsi="monospace"/>
+          <w:b w:val="false"/>
+          <w:i w:val="false"/>
+          <w:caps w:val="false"/>
+          <w:smallCaps w:val="false"/>
+          <w:color w:val="auto"/>
+          <w:spacing w:val="0"/>
+          <w:sz w:val="20"/>
+          <w:shd w:fill="262626" w:val="clear"/>
+        </w:rPr>
+        <w:t>Domain</w:t>
+      </w:r>
+      <w:r>
+        <w:rPr>
+          <w:rFonts w:ascii="apple-system;BlinkMacSystemFont;Segoe UI;Roboto;sans-serif" w:hAnsi="apple-system;BlinkMacSystemFont;Segoe UI;Roboto;sans-serif"/>
+          <w:b w:val="false"/>
+          <w:i w:val="false"/>
+          <w:caps w:val="false"/>
+          <w:smallCaps w:val="false"/>
+          <w:color w:val="auto"/>
+          <w:spacing w:val="0"/>
+          <w:sz w:val="20"/>
+        </w:rPr>
+        <w:t xml:space="preserve"> reference </w:t>
+      </w:r>
+      <w:r>
+        <w:rPr>
+          <w:rStyle w:val="SourceText"/>
+          <w:rFonts w:ascii="monospace" w:hAnsi="monospace"/>
+          <w:b w:val="false"/>
+          <w:i w:val="false"/>
+          <w:caps w:val="false"/>
+          <w:smallCaps w:val="false"/>
+          <w:color w:val="auto"/>
+          <w:spacing w:val="0"/>
+          <w:sz w:val="20"/>
+          <w:shd w:fill="262626" w:val="clear"/>
+        </w:rPr>
+        <w:t>Infrastructure</w:t>
+      </w:r>
+      <w:r>
+        <w:rPr>
+          <w:rFonts w:ascii="apple-system;BlinkMacSystemFont;Segoe UI;Roboto;sans-serif" w:hAnsi="apple-system;BlinkMacSystemFont;Segoe UI;Roboto;sans-serif"/>
+          <w:b w:val="false"/>
+          <w:i w:val="false"/>
+          <w:caps w:val="false"/>
+          <w:smallCaps w:val="false"/>
+          <w:color w:val="auto"/>
+          <w:spacing w:val="0"/>
+          <w:sz w:val="20"/>
+        </w:rPr>
+        <w:t xml:space="preserve"> if there's no project reference. Everything else is a reconstruction of that guarantee with extra tooling or process.</w:t>
+      </w:r>
+    </w:p>
+    <w:p>
+      <w:pPr>
+        <w:pStyle w:val="BodyText"/>
+        <w:widowControl/>
+        <w:ind w:hanging="0" w:left="0" w:right="0"/>
+        <w:rPr>
+          <w:rFonts w:ascii="apple-system;BlinkMacSystemFont;Segoe UI;Roboto;sans-serif" w:hAnsi="apple-system;BlinkMacSystemFont;Segoe UI;Roboto;sans-serif"/>
+          <w:b w:val="false"/>
+          <w:i w:val="false"/>
+          <w:caps w:val="false"/>
+          <w:smallCaps w:val="false"/>
+          <w:color w:val="auto"/>
+          <w:spacing w:val="0"/>
+          <w:sz w:val="20"/>
+        </w:rPr>
+      </w:pPr>
+      <w:r>
+        <w:rPr>
+          <w:rFonts w:ascii="apple-system;BlinkMacSystemFont;Segoe UI;Roboto;sans-serif" w:hAnsi="apple-system;BlinkMacSystemFont;Segoe UI;Roboto;sans-serif"/>
+          <w:b w:val="false"/>
+          <w:i w:val="false"/>
+          <w:caps w:val="false"/>
+          <w:smallCaps w:val="false"/>
+          <w:color w:val="auto"/>
+          <w:spacing w:val="0"/>
+          <w:sz w:val="20"/>
+        </w:rPr>
+        <w:t>Your approach (separate projects) is the simplest to reason about and the hardest to accidentally violate. The main arguments against it are solution complexity and slower builds in very large codebases, but for most projects those costs are negligible. I'd stick with what you're doing.</w:t>
+      </w:r>
+    </w:p>
+    <w:p>
+      <w:pPr>
+        <w:pStyle w:val="BodyText"/>
+        <w:widowControl/>
+        <w:bidi w:val="0"/>
+        <w:spacing w:before="0" w:after="140"/>
+        <w:ind w:hanging="0" w:left="0" w:right="0"/>
+        <w:jc w:val="left"/>
+        <w:rPr>
+          <w:rFonts w:ascii="Noto Serif" w:hAnsi="Noto Serif"/>
+          <w:b w:val="false"/>
+          <w:i w:val="false"/>
+          <w:caps w:val="false"/>
+          <w:smallCaps w:val="false"/>
+          <w:color w:val="auto"/>
+          <w:spacing w:val="0"/>
+          <w:sz w:val="20"/>
+          <w:highlight w:val="none"/>
+          <w:shd w:fill="auto" w:val="clear"/>
+        </w:rPr>
+      </w:pPr>
+      <w:r>
+        <w:rPr>
+          <w:rFonts w:ascii="Noto Serif" w:hAnsi="Noto Serif"/>
+          <w:b w:val="false"/>
+          <w:i w:val="false"/>
+          <w:caps w:val="false"/>
+          <w:smallCaps w:val="false"/>
+          <w:color w:val="auto"/>
+          <w:spacing w:val="0"/>
+          <w:sz w:val="20"/>
+          <w:shd w:fill="auto" w:val="clear"/>
+        </w:rPr>
+        <w:t>——————————————————————————————————————————————————</w:t>
+      </w:r>
+    </w:p>
+    <w:p>
+      <w:pPr>
+        <w:pStyle w:val="BodyText"/>
+        <w:widowControl/>
+        <w:bidi w:val="0"/>
+        <w:spacing w:before="0" w:after="140"/>
+        <w:ind w:hanging="0" w:left="0" w:right="0"/>
+        <w:jc w:val="left"/>
+        <w:rPr>
+          <w:rFonts w:ascii="Noto Serif" w:hAnsi="Noto Serif"/>
+          <w:b w:val="false"/>
+          <w:i w:val="false"/>
+          <w:caps w:val="false"/>
+          <w:smallCaps w:val="false"/>
+          <w:color w:val="auto"/>
+          <w:spacing w:val="0"/>
+          <w:sz w:val="20"/>
+          <w:highlight w:val="none"/>
+          <w:shd w:fill="auto" w:val="clear"/>
+        </w:rPr>
+      </w:pPr>
+      <w:r>
+        <w:rPr>
+          <w:rFonts w:ascii="Noto Serif" w:hAnsi="Noto Serif"/>
+          <w:b w:val="false"/>
+          <w:i w:val="false"/>
+          <w:caps w:val="false"/>
+          <w:smallCaps w:val="false"/>
+          <w:color w:val="auto"/>
+          <w:spacing w:val="0"/>
+          <w:sz w:val="20"/>
+          <w:shd w:fill="auto" w:val="clear"/>
+        </w:rPr>
+        <w:t>NetArchTest makes a lot of sense. Can you direct me to a website that shows how Roslyn would be used for this?</w:t>
+      </w:r>
+    </w:p>
+    <w:p>
+      <w:pPr>
+        <w:pStyle w:val="BodyText"/>
+        <w:widowControl/>
+        <w:bidi w:val="0"/>
+        <w:spacing w:before="0" w:after="140"/>
+        <w:ind w:hanging="0" w:left="0" w:right="0"/>
+        <w:jc w:val="left"/>
+        <w:rPr>
+          <w:rFonts w:ascii="Noto Serif" w:hAnsi="Noto Serif"/>
+          <w:b w:val="false"/>
+          <w:i w:val="false"/>
+          <w:caps w:val="false"/>
+          <w:smallCaps w:val="false"/>
+          <w:color w:val="auto"/>
+          <w:spacing w:val="0"/>
+          <w:sz w:val="20"/>
+          <w:highlight w:val="none"/>
+          <w:shd w:fill="auto" w:val="clear"/>
+        </w:rPr>
+      </w:pPr>
+      <w:r>
+        <w:rPr>
+          <w:rFonts w:ascii="Noto Serif" w:hAnsi="Noto Serif"/>
+          <w:b w:val="false"/>
+          <w:i w:val="false"/>
+          <w:caps w:val="false"/>
+          <w:smallCaps w:val="false"/>
+          <w:color w:val="auto"/>
+          <w:spacing w:val="0"/>
+          <w:sz w:val="20"/>
+          <w:shd w:fill="auto" w:val="clear"/>
+        </w:rPr>
+        <w:t>——————————————————————————————————————————————————</w:t>
+      </w:r>
+    </w:p>
+    <w:p>
+      <w:pPr>
+        <w:pStyle w:val="BodyText"/>
+        <w:widowControl/>
+        <w:bidi w:val="0"/>
+        <w:spacing w:before="0" w:after="140"/>
+        <w:ind w:hanging="0" w:left="0" w:right="0"/>
+        <w:jc w:val="left"/>
+        <w:rPr>
+          <w:rFonts w:ascii="apple-system;BlinkMacSystemFont;Segoe UI;Roboto;sans-serif" w:hAnsi="apple-system;BlinkMacSystemFont;Segoe UI;Roboto;sans-serif"/>
+          <w:b w:val="false"/>
+          <w:i w:val="false"/>
+          <w:caps w:val="false"/>
+          <w:smallCaps w:val="false"/>
+          <w:color w:val="auto"/>
+          <w:spacing w:val="0"/>
+          <w:sz w:val="20"/>
+          <w:highlight w:val="none"/>
+          <w:shd w:fill="auto" w:val="clear"/>
+        </w:rPr>
+      </w:pPr>
+      <w:r>
+        <w:rPr>
+          <w:rFonts w:ascii="apple-system;BlinkMacSystemFont;Segoe UI;Roboto;sans-serif" w:hAnsi="apple-system;BlinkMacSystemFont;Segoe UI;Roboto;sans-serif"/>
+          <w:b w:val="false"/>
+          <w:i w:val="false"/>
+          <w:caps w:val="false"/>
+          <w:smallCaps w:val="false"/>
+          <w:color w:val="auto"/>
+          <w:spacing w:val="0"/>
+          <w:sz w:val="20"/>
+          <w:shd w:fill="auto" w:val="clear"/>
+        </w:rPr>
+        <w:t>Here are a couple of good starting points:</w:t>
+      </w:r>
+    </w:p>
+    <w:p>
+      <w:pPr>
+        <w:pStyle w:val="BodyText"/>
+        <w:widowControl/>
+        <w:numPr>
+          <w:ilvl w:val="0"/>
+          <w:numId w:val="9"/>
+        </w:numPr>
+        <w:tabs>
+          <w:tab w:val="clear" w:pos="709"/>
+          <w:tab w:val="left" w:pos="0" w:leader="none"/>
+        </w:tabs>
+        <w:ind w:hanging="0" w:left="709" w:right="0"/>
+        <w:rPr>
+          <w:rFonts w:ascii="Noto Serif" w:hAnsi="Noto Serif"/>
+          <w:sz w:val="20"/>
+        </w:rPr>
+      </w:pPr>
+      <w:r>
+        <w:rPr>
+          <w:rStyle w:val="Strong"/>
+          <w:rFonts w:ascii="apple-system;BlinkMacSystemFont;Segoe UI;Roboto;sans-serif" w:hAnsi="apple-system;BlinkMacSystemFont;Segoe UI;Roboto;sans-serif"/>
+          <w:b w:val="false"/>
+          <w:i w:val="false"/>
+          <w:caps w:val="false"/>
+          <w:smallCaps w:val="false"/>
+          <w:color w:val="auto"/>
+          <w:spacing w:val="0"/>
+          <w:sz w:val="20"/>
+        </w:rPr>
+        <w:t>Microsoft's official tutorial on writing a custom Roslyn analyzer</w:t>
+      </w:r>
+      <w:r>
+        <w:rPr>
+          <w:rFonts w:ascii="apple-system;BlinkMacSystemFont;Segoe UI;Roboto;sans-serif" w:hAnsi="apple-system;BlinkMacSystemFont;Segoe UI;Roboto;sans-serif"/>
+          <w:b w:val="false"/>
+          <w:i w:val="false"/>
+          <w:caps w:val="false"/>
+          <w:smallCaps w:val="false"/>
+          <w:color w:val="auto"/>
+          <w:spacing w:val="0"/>
+          <w:sz w:val="20"/>
+        </w:rPr>
+        <w:t xml:space="preserve"> — this walks you through building one from scratch, which is what you'd do to create rules like "code in namespace X cannot reference namespace Y":</w:t>
+        <w:br/>
+      </w:r>
+      <w:hyperlink r:id="rId3" w:tgtFrame="_blank">
+        <w:r>
+          <w:rPr>
+            <w:rStyle w:val="Hyperlink"/>
+            <w:rFonts w:ascii="apple-system;BlinkMacSystemFont;Segoe UI;Roboto;sans-serif" w:hAnsi="apple-system;BlinkMacSystemFont;Segoe UI;Roboto;sans-serif"/>
+            <w:b w:val="false"/>
+            <w:i w:val="false"/>
+            <w:caps w:val="false"/>
+            <w:smallCaps w:val="false"/>
+            <w:color w:val="auto"/>
+            <w:spacing w:val="0"/>
+            <w:sz w:val="20"/>
+          </w:rPr>
+          <w:t>Tutorial: Write your first analyzer and code fix</w:t>
+        </w:r>
+      </w:hyperlink>
+    </w:p>
+    <w:p>
+      <w:pPr>
+        <w:pStyle w:val="BodyText"/>
+        <w:widowControl/>
+        <w:numPr>
+          <w:ilvl w:val="0"/>
+          <w:numId w:val="9"/>
+        </w:numPr>
+        <w:tabs>
+          <w:tab w:val="clear" w:pos="709"/>
+          <w:tab w:val="left" w:pos="0" w:leader="none"/>
+        </w:tabs>
+        <w:ind w:hanging="0" w:left="709" w:right="0"/>
+        <w:rPr>
+          <w:rFonts w:ascii="Noto Serif" w:hAnsi="Noto Serif"/>
+          <w:sz w:val="20"/>
+        </w:rPr>
+      </w:pPr>
+      <w:r>
+        <w:rPr>
+          <w:rStyle w:val="Strong"/>
+          <w:rFonts w:ascii="apple-system;BlinkMacSystemFont;Segoe UI;Roboto;sans-serif" w:hAnsi="apple-system;BlinkMacSystemFont;Segoe UI;Roboto;sans-serif"/>
+          <w:b w:val="false"/>
+          <w:i w:val="false"/>
+          <w:caps w:val="false"/>
+          <w:smallCaps w:val="false"/>
+          <w:color w:val="auto"/>
+          <w:spacing w:val="0"/>
+          <w:sz w:val="20"/>
+        </w:rPr>
+        <w:t>Microsoft's overview of Roslyn analyzers</w:t>
+      </w:r>
+      <w:r>
+        <w:rPr>
+          <w:rFonts w:ascii="apple-system;BlinkMacSystemFont;Segoe UI;Roboto;sans-serif" w:hAnsi="apple-system;BlinkMacSystemFont;Segoe UI;Roboto;sans-serif"/>
+          <w:b w:val="false"/>
+          <w:i w:val="false"/>
+          <w:caps w:val="false"/>
+          <w:smallCaps w:val="false"/>
+          <w:color w:val="auto"/>
+          <w:spacing w:val="0"/>
+          <w:sz w:val="20"/>
+        </w:rPr>
+        <w:t xml:space="preserve"> — broader context on how they fit into the build/IDE pipeline:</w:t>
+        <w:br/>
+      </w:r>
+      <w:hyperlink r:id="rId4" w:tgtFrame="_blank">
+        <w:r>
+          <w:rPr>
+            <w:rStyle w:val="Hyperlink"/>
+            <w:rFonts w:ascii="apple-system;BlinkMacSystemFont;Segoe UI;Roboto;sans-serif" w:hAnsi="apple-system;BlinkMacSystemFont;Segoe UI;Roboto;sans-serif"/>
+            <w:b w:val="false"/>
+            <w:i w:val="false"/>
+            <w:caps w:val="false"/>
+            <w:smallCaps w:val="false"/>
+            <w:color w:val="auto"/>
+            <w:spacing w:val="0"/>
+            <w:sz w:val="20"/>
+          </w:rPr>
+          <w:t>Roslyn analyzers overview</w:t>
+        </w:r>
+      </w:hyperlink>
+    </w:p>
+    <w:p>
+      <w:pPr>
+        <w:pStyle w:val="BodyText"/>
+        <w:widowControl/>
+        <w:numPr>
+          <w:ilvl w:val="0"/>
+          <w:numId w:val="9"/>
+        </w:numPr>
+        <w:tabs>
+          <w:tab w:val="clear" w:pos="709"/>
+          <w:tab w:val="left" w:pos="0" w:leader="none"/>
+        </w:tabs>
+        <w:ind w:hanging="0" w:left="709" w:right="0"/>
+        <w:rPr>
+          <w:rFonts w:ascii="Noto Serif" w:hAnsi="Noto Serif"/>
+          <w:sz w:val="20"/>
+        </w:rPr>
+      </w:pPr>
+      <w:r>
+        <w:rPr>
+          <w:rStyle w:val="Strong"/>
+          <w:rFonts w:ascii="apple-system;BlinkMacSystemFont;Segoe UI;Roboto;sans-serif" w:hAnsi="apple-system;BlinkMacSystemFont;Segoe UI;Roboto;sans-serif"/>
+          <w:b w:val="false"/>
+          <w:i w:val="false"/>
+          <w:caps w:val="false"/>
+          <w:smallCaps w:val="false"/>
+          <w:color w:val="auto"/>
+          <w:spacing w:val="0"/>
+          <w:sz w:val="20"/>
+        </w:rPr>
+        <w:t>This Medium article specifically compares architectural tests (NetArchTest) vs Roslyn analyzers</w:t>
+      </w:r>
+      <w:r>
+        <w:rPr>
+          <w:rFonts w:ascii="apple-system;BlinkMacSystemFont;Segoe UI;Roboto;sans-serif" w:hAnsi="apple-system;BlinkMacSystemFont;Segoe UI;Roboto;sans-serif"/>
+          <w:b w:val="false"/>
+          <w:i w:val="false"/>
+          <w:caps w:val="false"/>
+          <w:smallCaps w:val="false"/>
+          <w:color w:val="auto"/>
+          <w:spacing w:val="0"/>
+          <w:sz w:val="20"/>
+        </w:rPr>
+        <w:t xml:space="preserve"> for enforcing layer boundaries in .NET:</w:t>
+        <w:br/>
+      </w:r>
+      <w:hyperlink r:id="rId5" w:tgtFrame="_blank">
+        <w:r>
+          <w:rPr>
+            <w:rStyle w:val="Hyperlink"/>
+            <w:rFonts w:ascii="apple-system;BlinkMacSystemFont;Segoe UI;Roboto;sans-serif" w:hAnsi="apple-system;BlinkMacSystemFont;Segoe UI;Roboto;sans-serif"/>
+            <w:b w:val="false"/>
+            <w:i w:val="false"/>
+            <w:caps w:val="false"/>
+            <w:smallCaps w:val="false"/>
+            <w:color w:val="auto"/>
+            <w:spacing w:val="0"/>
+            <w:sz w:val="20"/>
+          </w:rPr>
+          <w:t>Architectural Tests in .NET</w:t>
+        </w:r>
+      </w:hyperlink>
+    </w:p>
+    <w:p>
+      <w:pPr>
+        <w:pStyle w:val="BodyText"/>
+        <w:widowControl/>
+        <w:ind w:hanging="0" w:left="0" w:right="0"/>
+        <w:rPr>
+          <w:rFonts w:ascii="Noto Serif" w:hAnsi="Noto Serif"/>
+          <w:sz w:val="20"/>
+        </w:rPr>
+      </w:pPr>
+      <w:r>
+        <w:rPr>
+          <w:rFonts w:ascii="apple-system;BlinkMacSystemFont;Segoe UI;Roboto;sans-serif" w:hAnsi="apple-system;BlinkMacSystemFont;Segoe UI;Roboto;sans-serif"/>
+          <w:b w:val="false"/>
+          <w:i w:val="false"/>
+          <w:caps w:val="false"/>
+          <w:smallCaps w:val="false"/>
+          <w:color w:val="auto"/>
+          <w:spacing w:val="0"/>
+          <w:sz w:val="20"/>
+        </w:rPr>
+        <w:t xml:space="preserve">The general idea: you'd write a </w:t>
+      </w:r>
+      <w:r>
+        <w:rPr>
+          <w:rStyle w:val="SourceText"/>
+          <w:rFonts w:ascii="monospace" w:hAnsi="monospace"/>
+          <w:b w:val="false"/>
+          <w:i w:val="false"/>
+          <w:caps w:val="false"/>
+          <w:smallCaps w:val="false"/>
+          <w:color w:val="auto"/>
+          <w:spacing w:val="0"/>
+          <w:sz w:val="20"/>
+          <w:shd w:fill="262626" w:val="clear"/>
+        </w:rPr>
+        <w:t>DiagnosticAnalyzer</w:t>
+      </w:r>
+      <w:r>
+        <w:rPr>
+          <w:rFonts w:ascii="apple-system;BlinkMacSystemFont;Segoe UI;Roboto;sans-serif" w:hAnsi="apple-system;BlinkMacSystemFont;Segoe UI;Roboto;sans-serif"/>
+          <w:b w:val="false"/>
+          <w:i w:val="false"/>
+          <w:caps w:val="false"/>
+          <w:smallCaps w:val="false"/>
+          <w:color w:val="auto"/>
+          <w:spacing w:val="0"/>
+          <w:sz w:val="20"/>
+        </w:rPr>
+        <w:t xml:space="preserve"> that inspects </w:t>
+      </w:r>
+      <w:r>
+        <w:rPr>
+          <w:rStyle w:val="SourceText"/>
+          <w:rFonts w:ascii="monospace" w:hAnsi="monospace"/>
+          <w:b w:val="false"/>
+          <w:i w:val="false"/>
+          <w:caps w:val="false"/>
+          <w:smallCaps w:val="false"/>
+          <w:color w:val="auto"/>
+          <w:spacing w:val="0"/>
+          <w:sz w:val="20"/>
+          <w:shd w:fill="262626" w:val="clear"/>
+        </w:rPr>
+        <w:t>using</w:t>
+      </w:r>
+      <w:r>
+        <w:rPr>
+          <w:rFonts w:ascii="apple-system;BlinkMacSystemFont;Segoe UI;Roboto;sans-serif" w:hAnsi="apple-system;BlinkMacSystemFont;Segoe UI;Roboto;sans-serif"/>
+          <w:b w:val="false"/>
+          <w:i w:val="false"/>
+          <w:caps w:val="false"/>
+          <w:smallCaps w:val="false"/>
+          <w:color w:val="auto"/>
+          <w:spacing w:val="0"/>
+          <w:sz w:val="20"/>
+        </w:rPr>
+        <w:t xml:space="preserve"> directives or type references in the syntax tree, checks which namespace/layer they belong to, and emits a compiler error if the reference violates your dependency rules. The upside over NetArchTest is instant IDE feedback (red squiggles as you type); the downside is significantly more code to write and maintai</w:t>
+      </w:r>
+    </w:p>
+    <w:p>
+      <w:pPr>
+        <w:pStyle w:val="BodyText"/>
+        <w:widowControl/>
+        <w:bidi w:val="0"/>
+        <w:spacing w:before="0" w:after="140"/>
+        <w:ind w:hanging="0" w:left="0" w:right="0"/>
+        <w:jc w:val="left"/>
+        <w:rPr>
+          <w:rFonts w:ascii="Noto Serif" w:hAnsi="Noto Serif"/>
+          <w:b w:val="false"/>
+          <w:i w:val="false"/>
+          <w:caps w:val="false"/>
+          <w:smallCaps w:val="false"/>
+          <w:color w:val="auto"/>
+          <w:spacing w:val="0"/>
+          <w:sz w:val="20"/>
+          <w:highlight w:val="none"/>
+          <w:shd w:fill="auto" w:val="clear"/>
+        </w:rPr>
+      </w:pPr>
+      <w:r>
+        <w:rPr>
+          <w:rFonts w:ascii="Noto Serif" w:hAnsi="Noto Serif"/>
+          <w:b w:val="false"/>
+          <w:i w:val="false"/>
+          <w:caps w:val="false"/>
+          <w:smallCaps w:val="false"/>
+          <w:color w:val="auto"/>
+          <w:spacing w:val="0"/>
+          <w:sz w:val="20"/>
+          <w:shd w:fill="auto" w:val="clear"/>
         </w:rPr>
       </w:r>
     </w:p>
@@ -4184,6 +5230,125 @@
   <w:abstractNum w:abstractNumId="1">
     <w:lvl w:ilvl="0">
       <w:start w:val="1"/>
+      <w:numFmt w:val="none"/>
+      <w:suff w:val="nothing"/>
+      <w:lvlText w:val=""/>
+      <w:lvlJc w:val="left"/>
+      <w:pPr>
+        <w:tabs>
+          <w:tab w:val="num" w:pos="0"/>
+        </w:tabs>
+        <w:ind w:left="0" w:hanging="0"/>
+      </w:pPr>
+    </w:lvl>
+    <w:lvl w:ilvl="1">
+      <w:start w:val="1"/>
+      <w:numFmt w:val="none"/>
+      <w:suff w:val="nothing"/>
+      <w:lvlText w:val=""/>
+      <w:lvlJc w:val="left"/>
+      <w:pPr>
+        <w:tabs>
+          <w:tab w:val="num" w:pos="0"/>
+        </w:tabs>
+        <w:ind w:left="0" w:hanging="0"/>
+      </w:pPr>
+    </w:lvl>
+    <w:lvl w:ilvl="2">
+      <w:start w:val="1"/>
+      <w:numFmt w:val="none"/>
+      <w:suff w:val="nothing"/>
+      <w:lvlText w:val=""/>
+      <w:lvlJc w:val="left"/>
+      <w:pPr>
+        <w:tabs>
+          <w:tab w:val="num" w:pos="0"/>
+        </w:tabs>
+        <w:ind w:left="0" w:hanging="0"/>
+      </w:pPr>
+    </w:lvl>
+    <w:lvl w:ilvl="3">
+      <w:start w:val="1"/>
+      <w:numFmt w:val="none"/>
+      <w:suff w:val="nothing"/>
+      <w:lvlText w:val=""/>
+      <w:lvlJc w:val="left"/>
+      <w:pPr>
+        <w:tabs>
+          <w:tab w:val="num" w:pos="0"/>
+        </w:tabs>
+        <w:ind w:left="0" w:hanging="0"/>
+      </w:pPr>
+    </w:lvl>
+    <w:lvl w:ilvl="4">
+      <w:start w:val="1"/>
+      <w:numFmt w:val="none"/>
+      <w:suff w:val="nothing"/>
+      <w:lvlText w:val=""/>
+      <w:lvlJc w:val="left"/>
+      <w:pPr>
+        <w:tabs>
+          <w:tab w:val="num" w:pos="0"/>
+        </w:tabs>
+        <w:ind w:left="0" w:hanging="0"/>
+      </w:pPr>
+    </w:lvl>
+    <w:lvl w:ilvl="5">
+      <w:start w:val="1"/>
+      <w:numFmt w:val="none"/>
+      <w:suff w:val="nothing"/>
+      <w:lvlText w:val=""/>
+      <w:lvlJc w:val="left"/>
+      <w:pPr>
+        <w:tabs>
+          <w:tab w:val="num" w:pos="0"/>
+        </w:tabs>
+        <w:ind w:left="0" w:hanging="0"/>
+      </w:pPr>
+    </w:lvl>
+    <w:lvl w:ilvl="6">
+      <w:start w:val="1"/>
+      <w:numFmt w:val="none"/>
+      <w:suff w:val="nothing"/>
+      <w:lvlText w:val=""/>
+      <w:lvlJc w:val="left"/>
+      <w:pPr>
+        <w:tabs>
+          <w:tab w:val="num" w:pos="0"/>
+        </w:tabs>
+        <w:ind w:left="0" w:hanging="0"/>
+      </w:pPr>
+    </w:lvl>
+    <w:lvl w:ilvl="7">
+      <w:start w:val="1"/>
+      <w:numFmt w:val="none"/>
+      <w:suff w:val="nothing"/>
+      <w:lvlText w:val=""/>
+      <w:lvlJc w:val="left"/>
+      <w:pPr>
+        <w:tabs>
+          <w:tab w:val="num" w:pos="0"/>
+        </w:tabs>
+        <w:ind w:left="0" w:hanging="0"/>
+      </w:pPr>
+    </w:lvl>
+    <w:lvl w:ilvl="8">
+      <w:start w:val="1"/>
+      <w:numFmt w:val="none"/>
+      <w:suff w:val="nothing"/>
+      <w:lvlText w:val=""/>
+      <w:lvlJc w:val="left"/>
+      <w:pPr>
+        <w:tabs>
+          <w:tab w:val="num" w:pos="0"/>
+        </w:tabs>
+        <w:ind w:left="0" w:hanging="0"/>
+      </w:pPr>
+    </w:lvl>
+  </w:abstractNum>
+  <w:abstractNum w:abstractNumId="2">
+    <w:lvl w:ilvl="0">
+      <w:start w:val="1"/>
       <w:numFmt w:val="bullet"/>
       <w:suff w:val="nothing"/>
       <w:lvlText w:val=""/>
@@ -4319,7 +5484,7 @@
       </w:rPr>
     </w:lvl>
   </w:abstractNum>
-  <w:abstractNum w:abstractNumId="2">
+  <w:abstractNum w:abstractNumId="3">
     <w:lvl w:ilvl="0">
       <w:start w:val="1"/>
       <w:numFmt w:val="bullet"/>
@@ -4457,7 +5622,7 @@
       </w:rPr>
     </w:lvl>
   </w:abstractNum>
-  <w:abstractNum w:abstractNumId="3">
+  <w:abstractNum w:abstractNumId="4">
     <w:lvl w:ilvl="0">
       <w:start w:val="1"/>
       <w:numFmt w:val="decimal"/>
@@ -4576,7 +5741,7 @@
       <w:rPr/>
     </w:lvl>
   </w:abstractNum>
-  <w:abstractNum w:abstractNumId="4">
+  <w:abstractNum w:abstractNumId="5">
     <w:lvl w:ilvl="0">
       <w:start w:val="1"/>
       <w:numFmt w:val="bullet"/>
@@ -4713,7 +5878,7 @@
       </w:rPr>
     </w:lvl>
   </w:abstractNum>
-  <w:abstractNum w:abstractNumId="5">
+  <w:abstractNum w:abstractNumId="6">
     <w:lvl w:ilvl="0">
       <w:start w:val="1"/>
       <w:numFmt w:val="bullet"/>
@@ -4850,7 +6015,7 @@
       </w:rPr>
     </w:lvl>
   </w:abstractNum>
-  <w:abstractNum w:abstractNumId="6">
+  <w:abstractNum w:abstractNumId="7">
     <w:lvl w:ilvl="0">
       <w:start w:val="1"/>
       <w:numFmt w:val="bullet"/>
@@ -4859,7 +6024,7 @@
       <w:lvlJc w:val="left"/>
       <w:pPr>
         <w:tabs>
-          <w:tab w:val="num" w:pos="709"/>
+          <w:tab w:val="num" w:pos="0"/>
         </w:tabs>
         <w:ind w:left="709" w:hanging="0"/>
       </w:pPr>
@@ -4988,123 +6153,262 @@
       </w:rPr>
     </w:lvl>
   </w:abstractNum>
-  <w:abstractNum w:abstractNumId="7">
+  <w:abstractNum w:abstractNumId="8">
     <w:lvl w:ilvl="0">
       <w:start w:val="1"/>
-      <w:numFmt w:val="none"/>
+      <w:numFmt w:val="decimal"/>
       <w:suff w:val="nothing"/>
-      <w:lvlText w:val=""/>
-      <w:lvlJc w:val="left"/>
-      <w:pPr>
-        <w:tabs>
-          <w:tab w:val="num" w:pos="0"/>
-        </w:tabs>
-        <w:ind w:left="0" w:hanging="0"/>
-      </w:pPr>
+      <w:lvlText w:val="%1."/>
+      <w:lvlJc w:val="left"/>
+      <w:pPr>
+        <w:tabs>
+          <w:tab w:val="num" w:pos="709"/>
+        </w:tabs>
+        <w:ind w:left="709" w:hanging="0"/>
+      </w:pPr>
+      <w:rPr/>
     </w:lvl>
     <w:lvl w:ilvl="1">
       <w:start w:val="1"/>
-      <w:numFmt w:val="none"/>
+      <w:numFmt w:val="decimal"/>
+      <w:lvlText w:val="%2."/>
+      <w:lvlJc w:val="left"/>
+      <w:pPr>
+        <w:tabs>
+          <w:tab w:val="num" w:pos="1418"/>
+        </w:tabs>
+        <w:ind w:left="1418" w:hanging="283"/>
+      </w:pPr>
+      <w:rPr/>
+    </w:lvl>
+    <w:lvl w:ilvl="2">
+      <w:start w:val="1"/>
+      <w:numFmt w:val="decimal"/>
+      <w:lvlText w:val="%3."/>
+      <w:lvlJc w:val="left"/>
+      <w:pPr>
+        <w:tabs>
+          <w:tab w:val="num" w:pos="2127"/>
+        </w:tabs>
+        <w:ind w:left="2127" w:hanging="283"/>
+      </w:pPr>
+      <w:rPr/>
+    </w:lvl>
+    <w:lvl w:ilvl="3">
+      <w:start w:val="1"/>
+      <w:numFmt w:val="decimal"/>
+      <w:lvlText w:val="%4."/>
+      <w:lvlJc w:val="left"/>
+      <w:pPr>
+        <w:tabs>
+          <w:tab w:val="num" w:pos="2836"/>
+        </w:tabs>
+        <w:ind w:left="2836" w:hanging="283"/>
+      </w:pPr>
+      <w:rPr/>
+    </w:lvl>
+    <w:lvl w:ilvl="4">
+      <w:start w:val="1"/>
+      <w:numFmt w:val="decimal"/>
+      <w:lvlText w:val="%5."/>
+      <w:lvlJc w:val="left"/>
+      <w:pPr>
+        <w:tabs>
+          <w:tab w:val="num" w:pos="3545"/>
+        </w:tabs>
+        <w:ind w:left="3545" w:hanging="283"/>
+      </w:pPr>
+      <w:rPr/>
+    </w:lvl>
+    <w:lvl w:ilvl="5">
+      <w:start w:val="1"/>
+      <w:numFmt w:val="decimal"/>
+      <w:lvlText w:val="%6."/>
+      <w:lvlJc w:val="left"/>
+      <w:pPr>
+        <w:tabs>
+          <w:tab w:val="num" w:pos="4254"/>
+        </w:tabs>
+        <w:ind w:left="4254" w:hanging="283"/>
+      </w:pPr>
+      <w:rPr/>
+    </w:lvl>
+    <w:lvl w:ilvl="6">
+      <w:start w:val="1"/>
+      <w:numFmt w:val="decimal"/>
+      <w:lvlText w:val="%7."/>
+      <w:lvlJc w:val="left"/>
+      <w:pPr>
+        <w:tabs>
+          <w:tab w:val="num" w:pos="4963"/>
+        </w:tabs>
+        <w:ind w:left="4963" w:hanging="283"/>
+      </w:pPr>
+      <w:rPr/>
+    </w:lvl>
+    <w:lvl w:ilvl="7">
+      <w:start w:val="1"/>
+      <w:numFmt w:val="decimal"/>
+      <w:lvlText w:val="%8."/>
+      <w:lvlJc w:val="left"/>
+      <w:pPr>
+        <w:tabs>
+          <w:tab w:val="num" w:pos="5672"/>
+        </w:tabs>
+        <w:ind w:left="5672" w:hanging="283"/>
+      </w:pPr>
+      <w:rPr/>
+    </w:lvl>
+    <w:lvl w:ilvl="8">
+      <w:start w:val="1"/>
+      <w:numFmt w:val="decimal"/>
+      <w:lvlText w:val="%9."/>
+      <w:lvlJc w:val="left"/>
+      <w:pPr>
+        <w:tabs>
+          <w:tab w:val="num" w:pos="6381"/>
+        </w:tabs>
+        <w:ind w:left="6381" w:hanging="283"/>
+      </w:pPr>
+      <w:rPr/>
+    </w:lvl>
+  </w:abstractNum>
+  <w:abstractNum w:abstractNumId="9">
+    <w:lvl w:ilvl="0">
+      <w:start w:val="1"/>
+      <w:numFmt w:val="bullet"/>
       <w:suff w:val="nothing"/>
-      <w:lvlText w:val=""/>
-      <w:lvlJc w:val="left"/>
-      <w:pPr>
-        <w:tabs>
-          <w:tab w:val="num" w:pos="0"/>
-        </w:tabs>
-        <w:ind w:left="0" w:hanging="0"/>
-      </w:pPr>
+      <w:lvlText w:val=""/>
+      <w:lvlJc w:val="left"/>
+      <w:pPr>
+        <w:tabs>
+          <w:tab w:val="num" w:pos="709"/>
+        </w:tabs>
+        <w:ind w:left="709" w:hanging="0"/>
+      </w:pPr>
+      <w:rPr>
+        <w:rFonts w:ascii="Symbol" w:hAnsi="Symbol" w:cs="Symbol" w:hint="default"/>
+      </w:rPr>
+    </w:lvl>
+    <w:lvl w:ilvl="1">
+      <w:start w:val="1"/>
+      <w:numFmt w:val="bullet"/>
+      <w:lvlText w:val=""/>
+      <w:lvlJc w:val="left"/>
+      <w:pPr>
+        <w:tabs>
+          <w:tab w:val="num" w:pos="1418"/>
+        </w:tabs>
+        <w:ind w:left="1418" w:hanging="283"/>
+      </w:pPr>
+      <w:rPr>
+        <w:rFonts w:ascii="Symbol" w:hAnsi="Symbol" w:cs="Symbol" w:hint="default"/>
+      </w:rPr>
     </w:lvl>
     <w:lvl w:ilvl="2">
       <w:start w:val="1"/>
-      <w:numFmt w:val="none"/>
-      <w:suff w:val="nothing"/>
-      <w:lvlText w:val=""/>
-      <w:lvlJc w:val="left"/>
-      <w:pPr>
-        <w:tabs>
-          <w:tab w:val="num" w:pos="0"/>
-        </w:tabs>
-        <w:ind w:left="0" w:hanging="0"/>
-      </w:pPr>
+      <w:numFmt w:val="bullet"/>
+      <w:lvlText w:val=""/>
+      <w:lvlJc w:val="left"/>
+      <w:pPr>
+        <w:tabs>
+          <w:tab w:val="num" w:pos="2127"/>
+        </w:tabs>
+        <w:ind w:left="2127" w:hanging="283"/>
+      </w:pPr>
+      <w:rPr>
+        <w:rFonts w:ascii="Symbol" w:hAnsi="Symbol" w:cs="Symbol" w:hint="default"/>
+      </w:rPr>
     </w:lvl>
     <w:lvl w:ilvl="3">
       <w:start w:val="1"/>
-      <w:numFmt w:val="none"/>
-      <w:suff w:val="nothing"/>
-      <w:lvlText w:val=""/>
-      <w:lvlJc w:val="left"/>
-      <w:pPr>
-        <w:tabs>
-          <w:tab w:val="num" w:pos="0"/>
-        </w:tabs>
-        <w:ind w:left="0" w:hanging="0"/>
-      </w:pPr>
+      <w:numFmt w:val="bullet"/>
+      <w:lvlText w:val=""/>
+      <w:lvlJc w:val="left"/>
+      <w:pPr>
+        <w:tabs>
+          <w:tab w:val="num" w:pos="2836"/>
+        </w:tabs>
+        <w:ind w:left="2836" w:hanging="283"/>
+      </w:pPr>
+      <w:rPr>
+        <w:rFonts w:ascii="Symbol" w:hAnsi="Symbol" w:cs="Symbol" w:hint="default"/>
+      </w:rPr>
     </w:lvl>
     <w:lvl w:ilvl="4">
       <w:start w:val="1"/>
-      <w:numFmt w:val="none"/>
-      <w:suff w:val="nothing"/>
-      <w:lvlText w:val=""/>
-      <w:lvlJc w:val="left"/>
-      <w:pPr>
-        <w:tabs>
-          <w:tab w:val="num" w:pos="0"/>
-        </w:tabs>
-        <w:ind w:left="0" w:hanging="0"/>
-      </w:pPr>
+      <w:numFmt w:val="bullet"/>
+      <w:lvlText w:val=""/>
+      <w:lvlJc w:val="left"/>
+      <w:pPr>
+        <w:tabs>
+          <w:tab w:val="num" w:pos="3545"/>
+        </w:tabs>
+        <w:ind w:left="3545" w:hanging="283"/>
+      </w:pPr>
+      <w:rPr>
+        <w:rFonts w:ascii="Symbol" w:hAnsi="Symbol" w:cs="Symbol" w:hint="default"/>
+      </w:rPr>
     </w:lvl>
     <w:lvl w:ilvl="5">
       <w:start w:val="1"/>
-      <w:numFmt w:val="none"/>
-      <w:suff w:val="nothing"/>
-      <w:lvlText w:val=""/>
-      <w:lvlJc w:val="left"/>
-      <w:pPr>
-        <w:tabs>
-          <w:tab w:val="num" w:pos="0"/>
-        </w:tabs>
-        <w:ind w:left="0" w:hanging="0"/>
-      </w:pPr>
+      <w:numFmt w:val="bullet"/>
+      <w:lvlText w:val=""/>
+      <w:lvlJc w:val="left"/>
+      <w:pPr>
+        <w:tabs>
+          <w:tab w:val="num" w:pos="4254"/>
+        </w:tabs>
+        <w:ind w:left="4254" w:hanging="283"/>
+      </w:pPr>
+      <w:rPr>
+        <w:rFonts w:ascii="Symbol" w:hAnsi="Symbol" w:cs="Symbol" w:hint="default"/>
+      </w:rPr>
     </w:lvl>
     <w:lvl w:ilvl="6">
       <w:start w:val="1"/>
-      <w:numFmt w:val="none"/>
-      <w:suff w:val="nothing"/>
-      <w:lvlText w:val=""/>
-      <w:lvlJc w:val="left"/>
-      <w:pPr>
-        <w:tabs>
-          <w:tab w:val="num" w:pos="0"/>
-        </w:tabs>
-        <w:ind w:left="0" w:hanging="0"/>
-      </w:pPr>
+      <w:numFmt w:val="bullet"/>
+      <w:lvlText w:val=""/>
+      <w:lvlJc w:val="left"/>
+      <w:pPr>
+        <w:tabs>
+          <w:tab w:val="num" w:pos="4963"/>
+        </w:tabs>
+        <w:ind w:left="4963" w:hanging="283"/>
+      </w:pPr>
+      <w:rPr>
+        <w:rFonts w:ascii="Symbol" w:hAnsi="Symbol" w:cs="Symbol" w:hint="default"/>
+      </w:rPr>
     </w:lvl>
     <w:lvl w:ilvl="7">
       <w:start w:val="1"/>
-      <w:numFmt w:val="none"/>
-      <w:suff w:val="nothing"/>
-      <w:lvlText w:val=""/>
-      <w:lvlJc w:val="left"/>
-      <w:pPr>
-        <w:tabs>
-          <w:tab w:val="num" w:pos="0"/>
-        </w:tabs>
-        <w:ind w:left="0" w:hanging="0"/>
-      </w:pPr>
+      <w:numFmt w:val="bullet"/>
+      <w:lvlText w:val=""/>
+      <w:lvlJc w:val="left"/>
+      <w:pPr>
+        <w:tabs>
+          <w:tab w:val="num" w:pos="5672"/>
+        </w:tabs>
+        <w:ind w:left="5672" w:hanging="283"/>
+      </w:pPr>
+      <w:rPr>
+        <w:rFonts w:ascii="Symbol" w:hAnsi="Symbol" w:cs="Symbol" w:hint="default"/>
+      </w:rPr>
     </w:lvl>
     <w:lvl w:ilvl="8">
       <w:start w:val="1"/>
-      <w:numFmt w:val="none"/>
-      <w:suff w:val="nothing"/>
-      <w:lvlText w:val=""/>
-      <w:lvlJc w:val="left"/>
-      <w:pPr>
-        <w:tabs>
-          <w:tab w:val="num" w:pos="0"/>
-        </w:tabs>
-        <w:ind w:left="0" w:hanging="0"/>
-      </w:pPr>
+      <w:numFmt w:val="bullet"/>
+      <w:lvlText w:val=""/>
+      <w:lvlJc w:val="left"/>
+      <w:pPr>
+        <w:tabs>
+          <w:tab w:val="num" w:pos="6381"/>
+        </w:tabs>
+        <w:ind w:left="6381" w:hanging="283"/>
+      </w:pPr>
+      <w:rPr>
+        <w:rFonts w:ascii="Symbol" w:hAnsi="Symbol" w:cs="Symbol" w:hint="default"/>
+      </w:rPr>
     </w:lvl>
   </w:abstractNum>
   <w:num w:numId="1">
@@ -5127,6 +6431,12 @@
   </w:num>
   <w:num w:numId="7">
     <w:abstractNumId w:val="7"/>
+  </w:num>
+  <w:num w:numId="8">
+    <w:abstractNumId w:val="8"/>
+  </w:num>
+  <w:num w:numId="9">
+    <w:abstractNumId w:val="9"/>
   </w:num>
 </w:numbering>
 </file>
@@ -5210,8 +6520,8 @@
       <w:bCs/>
     </w:rPr>
   </w:style>
-  <w:style w:type="character" w:styleId="Bullets">
-    <w:name w:val="Bullets"/>
+  <w:style w:type="character" w:styleId="Bulletsuser">
+    <w:name w:val="Bullets (user)"/>
     <w:qFormat/>
     <w:rPr>
       <w:rFonts w:ascii="OpenSymbol" w:hAnsi="OpenSymbol" w:eastAsia="OpenSymbol" w:cs="OpenSymbol"/>
@@ -5229,11 +6539,25 @@
     <w:qFormat/>
     <w:rPr/>
   </w:style>
-  <w:style w:type="character" w:styleId="Bulletsuser">
-    <w:name w:val="Bullets (user)"/>
+  <w:style w:type="character" w:styleId="Bullets">
+    <w:name w:val="Bullets"/>
     <w:qFormat/>
     <w:rPr>
       <w:rFonts w:ascii="OpenSymbol" w:hAnsi="OpenSymbol" w:eastAsia="OpenSymbol" w:cs="OpenSymbol"/>
+    </w:rPr>
+  </w:style>
+  <w:style w:type="character" w:styleId="Hyperlink">
+    <w:name w:val="Hyperlink"/>
+    <w:rPr>
+      <w:color w:val="000080"/>
+      <w:u w:val="single"/>
+    </w:rPr>
+  </w:style>
+  <w:style w:type="character" w:styleId="FollowedHyperlink">
+    <w:name w:val="FollowedHyperlink"/>
+    <w:rPr>
+      <w:color w:val="800000"/>
+      <w:u w:val="single"/>
     </w:rPr>
   </w:style>
   <w:style w:type="paragraph" w:styleId="Heading">

</xml_diff>

<commit_message>
Merge layer projects into one project.
</commit_message>
<xml_diff>
--- a/AI Generated DDD Migration Plan.docx
+++ b/AI Generated DDD Migration Plan.docx
@@ -117,7 +117,7 @@
         <w:widowControl/>
         <w:numPr>
           <w:ilvl w:val="0"/>
-          <w:numId w:val="2"/>
+          <w:numId w:val="1"/>
         </w:numPr>
         <w:tabs>
           <w:tab w:val="left" w:pos="709" w:leader="none"/>
@@ -275,7 +275,7 @@
         <w:widowControl/>
         <w:numPr>
           <w:ilvl w:val="0"/>
-          <w:numId w:val="2"/>
+          <w:numId w:val="1"/>
         </w:numPr>
         <w:tabs>
           <w:tab w:val="left" w:pos="709" w:leader="none"/>
@@ -377,7 +377,7 @@
         <w:widowControl/>
         <w:numPr>
           <w:ilvl w:val="0"/>
-          <w:numId w:val="2"/>
+          <w:numId w:val="1"/>
         </w:numPr>
         <w:tabs>
           <w:tab w:val="left" w:pos="709" w:leader="none"/>
@@ -423,7 +423,7 @@
         <w:widowControl/>
         <w:numPr>
           <w:ilvl w:val="0"/>
-          <w:numId w:val="2"/>
+          <w:numId w:val="1"/>
         </w:numPr>
         <w:tabs>
           <w:tab w:val="left" w:pos="709" w:leader="none"/>
@@ -627,7 +627,7 @@
         <w:widowControl/>
         <w:numPr>
           <w:ilvl w:val="0"/>
-          <w:numId w:val="3"/>
+          <w:numId w:val="2"/>
         </w:numPr>
         <w:tabs>
           <w:tab w:val="left" w:pos="709" w:leader="none"/>
@@ -756,7 +756,7 @@
         <w:widowControl/>
         <w:numPr>
           <w:ilvl w:val="0"/>
-          <w:numId w:val="3"/>
+          <w:numId w:val="2"/>
         </w:numPr>
         <w:tabs>
           <w:tab w:val="left" w:pos="709" w:leader="none"/>
@@ -857,7 +857,7 @@
         <w:widowControl/>
         <w:numPr>
           <w:ilvl w:val="0"/>
-          <w:numId w:val="3"/>
+          <w:numId w:val="2"/>
         </w:numPr>
         <w:tabs>
           <w:tab w:val="left" w:pos="709" w:leader="none"/>
@@ -958,7 +958,7 @@
         <w:widowControl/>
         <w:numPr>
           <w:ilvl w:val="0"/>
-          <w:numId w:val="3"/>
+          <w:numId w:val="2"/>
         </w:numPr>
         <w:tabs>
           <w:tab w:val="left" w:pos="709" w:leader="none"/>
@@ -1031,7 +1031,7 @@
         <w:widowControl/>
         <w:numPr>
           <w:ilvl w:val="0"/>
-          <w:numId w:val="3"/>
+          <w:numId w:val="2"/>
         </w:numPr>
         <w:tabs>
           <w:tab w:val="left" w:pos="709" w:leader="none"/>
@@ -1160,7 +1160,7 @@
         <w:widowControl/>
         <w:numPr>
           <w:ilvl w:val="0"/>
-          <w:numId w:val="3"/>
+          <w:numId w:val="2"/>
         </w:numPr>
         <w:tabs>
           <w:tab w:val="left" w:pos="709" w:leader="none"/>
@@ -1738,7 +1738,7 @@
         <w:widowControl/>
         <w:numPr>
           <w:ilvl w:val="0"/>
-          <w:numId w:val="4"/>
+          <w:numId w:val="3"/>
         </w:numPr>
         <w:tabs>
           <w:tab w:val="clear" w:pos="709"/>
@@ -1766,7 +1766,7 @@
         <w:widowControl/>
         <w:numPr>
           <w:ilvl w:val="0"/>
-          <w:numId w:val="5"/>
+          <w:numId w:val="4"/>
         </w:numPr>
         <w:tabs>
           <w:tab w:val="clear" w:pos="709"/>
@@ -2023,9 +2023,9 @@
       </w:tblPr>
       <w:tblGrid>
         <w:gridCol w:w="3135"/>
-        <w:gridCol w:w="1256"/>
+        <w:gridCol w:w="1255"/>
         <w:gridCol w:w="932"/>
-        <w:gridCol w:w="4893"/>
+        <w:gridCol w:w="4894"/>
       </w:tblGrid>
       <w:tr>
         <w:trPr>
@@ -2059,7 +2059,7 @@
         </w:tc>
         <w:tc>
           <w:tcPr>
-            <w:tcW w:w="1256" w:type="dxa"/>
+            <w:tcW w:w="1255" w:type="dxa"/>
             <w:tcBorders>
               <w:top w:val="single" w:sz="6" w:space="0" w:color="2A2B2C"/>
               <w:bottom w:val="single" w:sz="6" w:space="0" w:color="2A2B2C"/>
@@ -2111,7 +2111,7 @@
         </w:tc>
         <w:tc>
           <w:tcPr>
-            <w:tcW w:w="4893" w:type="dxa"/>
+            <w:tcW w:w="4894" w:type="dxa"/>
             <w:tcBorders>
               <w:top w:val="single" w:sz="6" w:space="0" w:color="2A2B2C"/>
               <w:bottom w:val="single" w:sz="6" w:space="0" w:color="2A2B2C"/>
@@ -2166,7 +2166,7 @@
         </w:tc>
         <w:tc>
           <w:tcPr>
-            <w:tcW w:w="1256" w:type="dxa"/>
+            <w:tcW w:w="1255" w:type="dxa"/>
             <w:tcBorders>
               <w:top w:val="single" w:sz="6" w:space="0" w:color="2A2B2C"/>
               <w:bottom w:val="single" w:sz="6" w:space="0" w:color="2A2B2C"/>
@@ -2222,7 +2222,7 @@
         </w:tc>
         <w:tc>
           <w:tcPr>
-            <w:tcW w:w="4893" w:type="dxa"/>
+            <w:tcW w:w="4894" w:type="dxa"/>
             <w:tcBorders>
               <w:top w:val="single" w:sz="6" w:space="0" w:color="2A2B2C"/>
               <w:bottom w:val="single" w:sz="6" w:space="0" w:color="2A2B2C"/>
@@ -2292,7 +2292,7 @@
         </w:tc>
         <w:tc>
           <w:tcPr>
-            <w:tcW w:w="1256" w:type="dxa"/>
+            <w:tcW w:w="1255" w:type="dxa"/>
             <w:tcBorders>
               <w:top w:val="single" w:sz="6" w:space="0" w:color="2A2B2C"/>
               <w:bottom w:val="single" w:sz="6" w:space="0" w:color="2A2B2C"/>
@@ -2348,7 +2348,7 @@
         </w:tc>
         <w:tc>
           <w:tcPr>
-            <w:tcW w:w="4893" w:type="dxa"/>
+            <w:tcW w:w="4894" w:type="dxa"/>
             <w:tcBorders>
               <w:top w:val="single" w:sz="6" w:space="0" w:color="2A2B2C"/>
               <w:bottom w:val="single" w:sz="6" w:space="0" w:color="2A2B2C"/>
@@ -2434,7 +2434,7 @@
         </w:tc>
         <w:tc>
           <w:tcPr>
-            <w:tcW w:w="1256" w:type="dxa"/>
+            <w:tcW w:w="1255" w:type="dxa"/>
             <w:tcBorders>
               <w:top w:val="single" w:sz="6" w:space="0" w:color="2A2B2C"/>
               <w:bottom w:val="single" w:sz="6" w:space="0" w:color="2A2B2C"/>
@@ -2490,7 +2490,7 @@
         </w:tc>
         <w:tc>
           <w:tcPr>
-            <w:tcW w:w="4893" w:type="dxa"/>
+            <w:tcW w:w="4894" w:type="dxa"/>
             <w:tcBorders>
               <w:top w:val="single" w:sz="6" w:space="0" w:color="2A2B2C"/>
               <w:bottom w:val="single" w:sz="6" w:space="0" w:color="2A2B2C"/>
@@ -2548,7 +2548,7 @@
         </w:tc>
         <w:tc>
           <w:tcPr>
-            <w:tcW w:w="1256" w:type="dxa"/>
+            <w:tcW w:w="1255" w:type="dxa"/>
             <w:tcBorders>
               <w:top w:val="single" w:sz="6" w:space="0" w:color="2A2B2C"/>
               <w:bottom w:val="single" w:sz="6" w:space="0" w:color="2A2B2C"/>
@@ -2604,7 +2604,7 @@
         </w:tc>
         <w:tc>
           <w:tcPr>
-            <w:tcW w:w="4893" w:type="dxa"/>
+            <w:tcW w:w="4894" w:type="dxa"/>
             <w:tcBorders>
               <w:top w:val="single" w:sz="6" w:space="0" w:color="2A2B2C"/>
               <w:bottom w:val="single" w:sz="6" w:space="0" w:color="2A2B2C"/>
@@ -2674,7 +2674,7 @@
         </w:tc>
         <w:tc>
           <w:tcPr>
-            <w:tcW w:w="1256" w:type="dxa"/>
+            <w:tcW w:w="1255" w:type="dxa"/>
             <w:tcBorders>
               <w:top w:val="single" w:sz="6" w:space="0" w:color="2A2B2C"/>
               <w:bottom w:val="single" w:sz="6" w:space="0" w:color="2A2B2C"/>
@@ -2730,7 +2730,7 @@
         </w:tc>
         <w:tc>
           <w:tcPr>
-            <w:tcW w:w="4893" w:type="dxa"/>
+            <w:tcW w:w="4894" w:type="dxa"/>
             <w:tcBorders>
               <w:top w:val="single" w:sz="6" w:space="0" w:color="2A2B2C"/>
               <w:bottom w:val="single" w:sz="6" w:space="0" w:color="2A2B2C"/>
@@ -2788,7 +2788,7 @@
         </w:tc>
         <w:tc>
           <w:tcPr>
-            <w:tcW w:w="1256" w:type="dxa"/>
+            <w:tcW w:w="1255" w:type="dxa"/>
             <w:tcBorders>
               <w:top w:val="single" w:sz="6" w:space="0" w:color="2A2B2C"/>
               <w:bottom w:val="single" w:sz="6" w:space="0" w:color="2A2B2C"/>
@@ -2844,7 +2844,7 @@
         </w:tc>
         <w:tc>
           <w:tcPr>
-            <w:tcW w:w="4893" w:type="dxa"/>
+            <w:tcW w:w="4894" w:type="dxa"/>
             <w:tcBorders>
               <w:top w:val="single" w:sz="6" w:space="0" w:color="2A2B2C"/>
               <w:bottom w:val="single" w:sz="6" w:space="0" w:color="2A2B2C"/>
@@ -3573,7 +3573,7 @@
         <w:widowControl/>
         <w:numPr>
           <w:ilvl w:val="0"/>
-          <w:numId w:val="6"/>
+          <w:numId w:val="5"/>
         </w:numPr>
         <w:tabs>
           <w:tab w:val="clear" w:pos="709"/>
@@ -3643,6 +3643,325 @@
           <w:shd w:fill="auto" w:val="clear"/>
         </w:rPr>
         <w:t> in F#)</w:t>
+      </w:r>
+    </w:p>
+    <w:p>
+      <w:pPr>
+        <w:pStyle w:val="BodyText"/>
+        <w:widowControl/>
+        <w:numPr>
+          <w:ilvl w:val="0"/>
+          <w:numId w:val="5"/>
+        </w:numPr>
+        <w:tabs>
+          <w:tab w:val="clear" w:pos="709"/>
+          <w:tab w:val="left" w:pos="0" w:leader="none"/>
+        </w:tabs>
+        <w:spacing w:before="0" w:after="0"/>
+        <w:ind w:hanging="283" w:left="709" w:right="0"/>
+        <w:rPr>
+          <w:rFonts w:ascii="apple-system;BlinkMacSystemFont;Segoe UI;Roboto;sans-serif" w:hAnsi="apple-system;BlinkMacSystemFont;Segoe UI;Roboto;sans-serif"/>
+          <w:sz w:val="20"/>
+        </w:rPr>
+      </w:pPr>
+      <w:r>
+        <w:rPr>
+          <w:rStyle w:val="SourceText"/>
+          <w:rFonts w:ascii="monospace" w:hAnsi="monospace"/>
+          <w:b w:val="false"/>
+          <w:i w:val="false"/>
+          <w:caps w:val="false"/>
+          <w:smallCaps w:val="false"/>
+          <w:color w:val="auto"/>
+          <w:spacing w:val="0"/>
+          <w:sz w:val="20"/>
+          <w:shd w:fill="auto" w:val="clear"/>
+        </w:rPr>
+        <w:t>Bind</w:t>
+      </w:r>
+      <w:r>
+        <w:rPr>
+          <w:rFonts w:ascii="apple-system;BlinkMacSystemFont;Segoe UI;Roboto;sans-serif" w:hAnsi="apple-system;BlinkMacSystemFont;Segoe UI;Roboto;sans-serif"/>
+          <w:b w:val="false"/>
+          <w:i w:val="false"/>
+          <w:caps w:val="false"/>
+          <w:smallCaps w:val="false"/>
+          <w:color w:val="auto"/>
+          <w:spacing w:val="0"/>
+          <w:sz w:val="20"/>
+          <w:shd w:fill="auto" w:val="clear"/>
+        </w:rPr>
+        <w:t> — chain to another Result-returning operation (like </w:t>
+      </w:r>
+      <w:r>
+        <w:rPr>
+          <w:rStyle w:val="SourceText"/>
+          <w:rFonts w:ascii="monospace" w:hAnsi="monospace"/>
+          <w:b w:val="false"/>
+          <w:i w:val="false"/>
+          <w:caps w:val="false"/>
+          <w:smallCaps w:val="false"/>
+          <w:color w:val="auto"/>
+          <w:spacing w:val="0"/>
+          <w:sz w:val="20"/>
+          <w:shd w:fill="auto" w:val="clear"/>
+        </w:rPr>
+        <w:t>Result.bind</w:t>
+      </w:r>
+      <w:r>
+        <w:rPr>
+          <w:rFonts w:ascii="apple-system;BlinkMacSystemFont;Segoe UI;Roboto;sans-serif" w:hAnsi="apple-system;BlinkMacSystemFont;Segoe UI;Roboto;sans-serif"/>
+          <w:b w:val="false"/>
+          <w:i w:val="false"/>
+          <w:caps w:val="false"/>
+          <w:smallCaps w:val="false"/>
+          <w:color w:val="auto"/>
+          <w:spacing w:val="0"/>
+          <w:sz w:val="20"/>
+          <w:shd w:fill="auto" w:val="clear"/>
+        </w:rPr>
+        <w:t> / </w:t>
+      </w:r>
+      <w:r>
+        <w:rPr>
+          <w:rStyle w:val="SourceText"/>
+          <w:rFonts w:ascii="monospace" w:hAnsi="monospace"/>
+          <w:b w:val="false"/>
+          <w:i w:val="false"/>
+          <w:caps w:val="false"/>
+          <w:smallCaps w:val="false"/>
+          <w:color w:val="auto"/>
+          <w:spacing w:val="0"/>
+          <w:sz w:val="20"/>
+          <w:shd w:fill="auto" w:val="clear"/>
+        </w:rPr>
+        <w:t>&gt;&gt;=</w:t>
+      </w:r>
+      <w:r>
+        <w:rPr>
+          <w:rFonts w:ascii="apple-system;BlinkMacSystemFont;Segoe UI;Roboto;sans-serif" w:hAnsi="apple-system;BlinkMacSystemFont;Segoe UI;Roboto;sans-serif"/>
+          <w:b w:val="false"/>
+          <w:i w:val="false"/>
+          <w:caps w:val="false"/>
+          <w:smallCaps w:val="false"/>
+          <w:color w:val="auto"/>
+          <w:spacing w:val="0"/>
+          <w:sz w:val="20"/>
+          <w:shd w:fill="auto" w:val="clear"/>
+        </w:rPr>
+        <w:t>)</w:t>
+      </w:r>
+    </w:p>
+    <w:p>
+      <w:pPr>
+        <w:pStyle w:val="BodyText"/>
+        <w:widowControl/>
+        <w:numPr>
+          <w:ilvl w:val="0"/>
+          <w:numId w:val="5"/>
+        </w:numPr>
+        <w:tabs>
+          <w:tab w:val="clear" w:pos="709"/>
+          <w:tab w:val="left" w:pos="0" w:leader="none"/>
+        </w:tabs>
+        <w:spacing w:before="0" w:after="0"/>
+        <w:ind w:hanging="283" w:left="709" w:right="0"/>
+        <w:rPr>
+          <w:rFonts w:ascii="apple-system;BlinkMacSystemFont;Segoe UI;Roboto;sans-serif" w:hAnsi="apple-system;BlinkMacSystemFont;Segoe UI;Roboto;sans-serif"/>
+          <w:sz w:val="20"/>
+        </w:rPr>
+      </w:pPr>
+      <w:r>
+        <w:rPr>
+          <w:rStyle w:val="SourceText"/>
+          <w:rFonts w:ascii="monospace" w:hAnsi="monospace"/>
+          <w:b w:val="false"/>
+          <w:i w:val="false"/>
+          <w:caps w:val="false"/>
+          <w:smallCaps w:val="false"/>
+          <w:color w:val="auto"/>
+          <w:spacing w:val="0"/>
+          <w:sz w:val="20"/>
+          <w:shd w:fill="auto" w:val="clear"/>
+        </w:rPr>
+        <w:t>Match</w:t>
+      </w:r>
+      <w:r>
+        <w:rPr>
+          <w:rFonts w:ascii="apple-system;BlinkMacSystemFont;Segoe UI;Roboto;sans-serif" w:hAnsi="apple-system;BlinkMacSystemFont;Segoe UI;Roboto;sans-serif"/>
+          <w:b w:val="false"/>
+          <w:i w:val="false"/>
+          <w:caps w:val="false"/>
+          <w:smallCaps w:val="false"/>
+          <w:color w:val="auto"/>
+          <w:spacing w:val="0"/>
+          <w:sz w:val="20"/>
+          <w:shd w:fill="auto" w:val="clear"/>
+        </w:rPr>
+        <w:t> — unwrap to a final value by handling both cases</w:t>
+      </w:r>
+    </w:p>
+    <w:p>
+      <w:pPr>
+        <w:pStyle w:val="BodyText"/>
+        <w:widowControl/>
+        <w:numPr>
+          <w:ilvl w:val="0"/>
+          <w:numId w:val="5"/>
+        </w:numPr>
+        <w:tabs>
+          <w:tab w:val="clear" w:pos="709"/>
+          <w:tab w:val="left" w:pos="0" w:leader="none"/>
+        </w:tabs>
+        <w:ind w:hanging="283" w:left="709" w:right="0"/>
+        <w:rPr>
+          <w:rFonts w:ascii="apple-system;BlinkMacSystemFont;Segoe UI;Roboto;sans-serif" w:hAnsi="apple-system;BlinkMacSystemFont;Segoe UI;Roboto;sans-serif"/>
+          <w:sz w:val="20"/>
+        </w:rPr>
+      </w:pPr>
+      <w:r>
+        <w:rPr>
+          <w:rStyle w:val="SourceText"/>
+          <w:rFonts w:ascii="monospace" w:hAnsi="monospace"/>
+          <w:b w:val="false"/>
+          <w:i w:val="false"/>
+          <w:caps w:val="false"/>
+          <w:smallCaps w:val="false"/>
+          <w:color w:val="auto"/>
+          <w:spacing w:val="0"/>
+          <w:sz w:val="20"/>
+          <w:shd w:fill="auto" w:val="clear"/>
+        </w:rPr>
+        <w:t>Tap</w:t>
+      </w:r>
+      <w:r>
+        <w:rPr>
+          <w:rFonts w:ascii="apple-system;BlinkMacSystemFont;Segoe UI;Roboto;sans-serif" w:hAnsi="apple-system;BlinkMacSystemFont;Segoe UI;Roboto;sans-serif"/>
+          <w:b w:val="false"/>
+          <w:i w:val="false"/>
+          <w:caps w:val="false"/>
+          <w:smallCaps w:val="false"/>
+          <w:color w:val="auto"/>
+          <w:spacing w:val="0"/>
+          <w:sz w:val="20"/>
+          <w:shd w:fill="auto" w:val="clear"/>
+        </w:rPr>
+        <w:t> — side-effect on success without changing the value</w:t>
+      </w:r>
+    </w:p>
+    <w:p>
+      <w:pPr>
+        <w:pStyle w:val="BodyText"/>
+        <w:widowControl/>
+        <w:ind w:hanging="0" w:left="0" w:right="0"/>
+        <w:rPr>
+          <w:rFonts w:ascii="apple-system;BlinkMacSystemFont;Segoe UI;Roboto;sans-serif" w:hAnsi="apple-system;BlinkMacSystemFont;Segoe UI;Roboto;sans-serif"/>
+          <w:b w:val="false"/>
+          <w:i w:val="false"/>
+          <w:caps w:val="false"/>
+          <w:smallCaps w:val="false"/>
+          <w:color w:val="auto"/>
+          <w:spacing w:val="0"/>
+          <w:sz w:val="20"/>
+          <w:highlight w:val="none"/>
+          <w:shd w:fill="auto" w:val="clear"/>
+        </w:rPr>
+      </w:pPr>
+      <w:r>
+        <w:rPr>
+          <w:rFonts w:ascii="apple-system;BlinkMacSystemFont;Segoe UI;Roboto;sans-serif" w:hAnsi="apple-system;BlinkMacSystemFont;Segoe UI;Roboto;sans-serif"/>
+          <w:b w:val="false"/>
+          <w:i w:val="false"/>
+          <w:caps w:val="false"/>
+          <w:smallCaps w:val="false"/>
+          <w:color w:val="auto"/>
+          <w:spacing w:val="0"/>
+          <w:sz w:val="20"/>
+          <w:shd w:fill="auto" w:val="clear"/>
+        </w:rPr>
+        <w:t>So yes, you can build a pipeline where validation, transformation, and persistence flow through a chain of Result operations rather than nested if/else blocks.</w:t>
+      </w:r>
+    </w:p>
+    <w:p>
+      <w:pPr>
+        <w:pStyle w:val="BodyText"/>
+        <w:widowControl/>
+        <w:bidi w:val="0"/>
+        <w:spacing w:before="0" w:after="140"/>
+        <w:ind w:hanging="0" w:left="0" w:right="0"/>
+        <w:jc w:val="left"/>
+        <w:rPr>
+          <w:rFonts w:ascii="apple-system;BlinkMacSystemFont;Segoe UI;Roboto;sans-serif" w:hAnsi="apple-system;BlinkMacSystemFont;Segoe UI;Roboto;sans-serif"/>
+          <w:b w:val="false"/>
+          <w:i w:val="false"/>
+          <w:caps w:val="false"/>
+          <w:smallCaps w:val="false"/>
+          <w:color w:val="auto"/>
+          <w:spacing w:val="0"/>
+          <w:sz w:val="20"/>
+        </w:rPr>
+      </w:pPr>
+      <w:r>
+        <w:rPr>
+          <w:rFonts w:ascii="apple-system;BlinkMacSystemFont;Segoe UI;Roboto;sans-serif" w:hAnsi="apple-system;BlinkMacSystemFont;Segoe UI;Roboto;sans-serif"/>
+          <w:b w:val="false"/>
+          <w:i w:val="false"/>
+          <w:caps w:val="false"/>
+          <w:smallCaps w:val="false"/>
+          <w:color w:val="auto"/>
+          <w:spacing w:val="0"/>
+          <w:sz w:val="20"/>
+        </w:rPr>
+      </w:r>
+      <w:r>
+        <w:br w:type="page"/>
+      </w:r>
+    </w:p>
+    <w:p>
+      <w:pPr>
+        <w:pStyle w:val="BodyText"/>
+        <w:widowControl/>
+        <w:bidi w:val="0"/>
+        <w:spacing w:before="0" w:after="140"/>
+        <w:ind w:hanging="0" w:left="0" w:right="0"/>
+        <w:jc w:val="left"/>
+        <w:rPr>
+          <w:rFonts w:ascii="apple-system;BlinkMacSystemFont;Segoe UI;Roboto;sans-serif" w:hAnsi="apple-system;BlinkMacSystemFont;Segoe UI;Roboto;sans-serif"/>
+          <w:b w:val="false"/>
+          <w:i w:val="false"/>
+          <w:caps w:val="false"/>
+          <w:smallCaps w:val="false"/>
+          <w:color w:val="auto"/>
+          <w:spacing w:val="0"/>
+          <w:sz w:val="20"/>
+        </w:rPr>
+      </w:pPr>
+      <w:r>
+        <w:rPr>
+          <w:rStyle w:val="Strong"/>
+          <w:rFonts w:ascii="apple-system;BlinkMacSystemFont;Segoe UI;Roboto;sans-serif" w:hAnsi="apple-system;BlinkMacSystemFont;Segoe UI;Roboto;sans-serif"/>
+          <w:b w:val="false"/>
+          <w:i w:val="false"/>
+          <w:caps w:val="false"/>
+          <w:smallCaps w:val="false"/>
+          <w:color w:val="auto"/>
+          <w:spacing w:val="0"/>
+          <w:sz w:val="20"/>
+        </w:rPr>
+        <w:t>Martin Fowler's "Domain Model" pattern</w:t>
+      </w:r>
+      <w:r>
+        <w:rPr>
+          <w:rFonts w:ascii="apple-system;BlinkMacSystemFont;Segoe UI;Roboto;sans-serif" w:hAnsi="apple-system;BlinkMacSystemFont;Segoe UI;Roboto;sans-serif"/>
+          <w:b w:val="false"/>
+          <w:i w:val="false"/>
+          <w:caps w:val="false"/>
+          <w:smallCaps w:val="false"/>
+          <w:color w:val="auto"/>
+          <w:spacing w:val="0"/>
+          <w:sz w:val="20"/>
+        </w:rPr>
+        <w:t> (martinfowler.com/eaaCatalog/domainModel.html) — argues for putting behavior (including validation) on the model itself, contrasted with the "Anemic Domain Model" antipattern where models are just data bags</w:t>
       </w:r>
     </w:p>
     <w:p>
@@ -3658,98 +3977,38 @@
           <w:tab w:val="left" w:pos="0" w:leader="none"/>
         </w:tabs>
         <w:spacing w:before="0" w:after="0"/>
-        <w:ind w:hanging="283" w:left="709" w:right="0"/>
-        <w:rPr>
-          <w:rFonts w:ascii="apple-system;BlinkMacSystemFont;Segoe UI;Roboto;sans-serif" w:hAnsi="apple-system;BlinkMacSystemFont;Segoe UI;Roboto;sans-serif"/>
-          <w:sz w:val="20"/>
-        </w:rPr>
-      </w:pPr>
-      <w:r>
-        <w:rPr>
-          <w:rStyle w:val="SourceText"/>
-          <w:rFonts w:ascii="monospace" w:hAnsi="monospace"/>
-          <w:b w:val="false"/>
-          <w:i w:val="false"/>
-          <w:caps w:val="false"/>
-          <w:smallCaps w:val="false"/>
-          <w:color w:val="auto"/>
-          <w:spacing w:val="0"/>
-          <w:sz w:val="20"/>
-          <w:shd w:fill="auto" w:val="clear"/>
-        </w:rPr>
-        <w:t>Bind</w:t>
-      </w:r>
-      <w:r>
-        <w:rPr>
-          <w:rFonts w:ascii="apple-system;BlinkMacSystemFont;Segoe UI;Roboto;sans-serif" w:hAnsi="apple-system;BlinkMacSystemFont;Segoe UI;Roboto;sans-serif"/>
-          <w:b w:val="false"/>
-          <w:i w:val="false"/>
-          <w:caps w:val="false"/>
-          <w:smallCaps w:val="false"/>
-          <w:color w:val="auto"/>
-          <w:spacing w:val="0"/>
-          <w:sz w:val="20"/>
-          <w:shd w:fill="auto" w:val="clear"/>
-        </w:rPr>
-        <w:t> — chain to another Result-returning operation (like </w:t>
-      </w:r>
-      <w:r>
-        <w:rPr>
-          <w:rStyle w:val="SourceText"/>
-          <w:rFonts w:ascii="monospace" w:hAnsi="monospace"/>
-          <w:b w:val="false"/>
-          <w:i w:val="false"/>
-          <w:caps w:val="false"/>
-          <w:smallCaps w:val="false"/>
-          <w:color w:val="auto"/>
-          <w:spacing w:val="0"/>
-          <w:sz w:val="20"/>
-          <w:shd w:fill="auto" w:val="clear"/>
-        </w:rPr>
-        <w:t>Result.bind</w:t>
-      </w:r>
-      <w:r>
-        <w:rPr>
-          <w:rFonts w:ascii="apple-system;BlinkMacSystemFont;Segoe UI;Roboto;sans-serif" w:hAnsi="apple-system;BlinkMacSystemFont;Segoe UI;Roboto;sans-serif"/>
-          <w:b w:val="false"/>
-          <w:i w:val="false"/>
-          <w:caps w:val="false"/>
-          <w:smallCaps w:val="false"/>
-          <w:color w:val="auto"/>
-          <w:spacing w:val="0"/>
-          <w:sz w:val="20"/>
-          <w:shd w:fill="auto" w:val="clear"/>
-        </w:rPr>
-        <w:t> / </w:t>
-      </w:r>
-      <w:r>
-        <w:rPr>
-          <w:rStyle w:val="SourceText"/>
-          <w:rFonts w:ascii="monospace" w:hAnsi="monospace"/>
-          <w:b w:val="false"/>
-          <w:i w:val="false"/>
-          <w:caps w:val="false"/>
-          <w:smallCaps w:val="false"/>
-          <w:color w:val="auto"/>
-          <w:spacing w:val="0"/>
-          <w:sz w:val="20"/>
-          <w:shd w:fill="auto" w:val="clear"/>
-        </w:rPr>
-        <w:t>&gt;&gt;=</w:t>
-      </w:r>
-      <w:r>
-        <w:rPr>
-          <w:rFonts w:ascii="apple-system;BlinkMacSystemFont;Segoe UI;Roboto;sans-serif" w:hAnsi="apple-system;BlinkMacSystemFont;Segoe UI;Roboto;sans-serif"/>
-          <w:b w:val="false"/>
-          <w:i w:val="false"/>
-          <w:caps w:val="false"/>
-          <w:smallCaps w:val="false"/>
-          <w:color w:val="auto"/>
-          <w:spacing w:val="0"/>
-          <w:sz w:val="20"/>
-          <w:shd w:fill="auto" w:val="clear"/>
-        </w:rPr>
-        <w:t>)</w:t>
+        <w:ind w:hanging="0" w:left="709"/>
+        <w:rPr>
+          <w:rFonts w:ascii="apple-system;BlinkMacSystemFont;Segoe UI;Roboto;sans-serif" w:hAnsi="apple-system;BlinkMacSystemFont;Segoe UI;Roboto;sans-serif"/>
+          <w:sz w:val="20"/>
+        </w:rPr>
+      </w:pPr>
+      <w:r>
+        <w:rPr>
+          <w:rStyle w:val="Strong"/>
+          <w:rFonts w:ascii="apple-system;BlinkMacSystemFont;Segoe UI;Roboto;sans-serif" w:hAnsi="apple-system;BlinkMacSystemFont;Segoe UI;Roboto;sans-serif"/>
+          <w:b w:val="false"/>
+          <w:i w:val="false"/>
+          <w:caps w:val="false"/>
+          <w:smallCaps w:val="false"/>
+          <w:color w:val="auto"/>
+          <w:spacing w:val="0"/>
+          <w:sz w:val="20"/>
+        </w:rPr>
+        <w:t>Fowler's "Anemic Domain Model" essay</w:t>
+      </w:r>
+      <w:r>
+        <w:rPr>
+          <w:rFonts w:ascii="apple-system;BlinkMacSystemFont;Segoe UI;Roboto;sans-serif" w:hAnsi="apple-system;BlinkMacSystemFont;Segoe UI;Roboto;sans-serif"/>
+          <w:b w:val="false"/>
+          <w:i w:val="false"/>
+          <w:caps w:val="false"/>
+          <w:smallCaps w:val="false"/>
+          <w:color w:val="auto"/>
+          <w:spacing w:val="0"/>
+          <w:sz w:val="20"/>
+        </w:rPr>
+        <w:t> (martinfowler.com/bliki/AnemicDomainModel.html) — the classic argument against separating logic from the model</w:t>
       </w:r>
     </w:p>
     <w:p>
@@ -3765,40 +4024,38 @@
           <w:tab w:val="left" w:pos="0" w:leader="none"/>
         </w:tabs>
         <w:spacing w:before="0" w:after="0"/>
-        <w:ind w:hanging="283" w:left="709" w:right="0"/>
-        <w:rPr>
-          <w:rFonts w:ascii="apple-system;BlinkMacSystemFont;Segoe UI;Roboto;sans-serif" w:hAnsi="apple-system;BlinkMacSystemFont;Segoe UI;Roboto;sans-serif"/>
-          <w:sz w:val="20"/>
-        </w:rPr>
-      </w:pPr>
-      <w:r>
-        <w:rPr>
-          <w:rStyle w:val="SourceText"/>
-          <w:rFonts w:ascii="monospace" w:hAnsi="monospace"/>
-          <w:b w:val="false"/>
-          <w:i w:val="false"/>
-          <w:caps w:val="false"/>
-          <w:smallCaps w:val="false"/>
-          <w:color w:val="auto"/>
-          <w:spacing w:val="0"/>
-          <w:sz w:val="20"/>
-          <w:shd w:fill="auto" w:val="clear"/>
-        </w:rPr>
-        <w:t>Match</w:t>
-      </w:r>
-      <w:r>
-        <w:rPr>
-          <w:rFonts w:ascii="apple-system;BlinkMacSystemFont;Segoe UI;Roboto;sans-serif" w:hAnsi="apple-system;BlinkMacSystemFont;Segoe UI;Roboto;sans-serif"/>
-          <w:b w:val="false"/>
-          <w:i w:val="false"/>
-          <w:caps w:val="false"/>
-          <w:smallCaps w:val="false"/>
-          <w:color w:val="auto"/>
-          <w:spacing w:val="0"/>
-          <w:sz w:val="20"/>
-          <w:shd w:fill="auto" w:val="clear"/>
-        </w:rPr>
-        <w:t> — unwrap to a final value by handling both cases</w:t>
+        <w:ind w:hanging="0" w:left="709"/>
+        <w:rPr>
+          <w:rFonts w:ascii="apple-system;BlinkMacSystemFont;Segoe UI;Roboto;sans-serif" w:hAnsi="apple-system;BlinkMacSystemFont;Segoe UI;Roboto;sans-serif"/>
+          <w:sz w:val="20"/>
+        </w:rPr>
+      </w:pPr>
+      <w:r>
+        <w:rPr>
+          <w:rStyle w:val="Strong"/>
+          <w:rFonts w:ascii="apple-system;BlinkMacSystemFont;Segoe UI;Roboto;sans-serif" w:hAnsi="apple-system;BlinkMacSystemFont;Segoe UI;Roboto;sans-serif"/>
+          <w:b w:val="false"/>
+          <w:i w:val="false"/>
+          <w:caps w:val="false"/>
+          <w:smallCaps w:val="false"/>
+          <w:color w:val="auto"/>
+          <w:spacing w:val="0"/>
+          <w:sz w:val="20"/>
+        </w:rPr>
+        <w:t>Vaughn Vernon's "Implementing Domain-Driven Design"</w:t>
+      </w:r>
+      <w:r>
+        <w:rPr>
+          <w:rFonts w:ascii="apple-system;BlinkMacSystemFont;Segoe UI;Roboto;sans-serif" w:hAnsi="apple-system;BlinkMacSystemFont;Segoe UI;Roboto;sans-serif"/>
+          <w:b w:val="false"/>
+          <w:i w:val="false"/>
+          <w:caps w:val="false"/>
+          <w:smallCaps w:val="false"/>
+          <w:color w:val="auto"/>
+          <w:spacing w:val="0"/>
+          <w:sz w:val="20"/>
+        </w:rPr>
+        <w:t> — covers validation as invariant enforcement on aggregates vs. standalone validation services, with practical trade-offs for each</w:t>
       </w:r>
     </w:p>
     <w:p>
@@ -3813,40 +4070,38 @@
           <w:tab w:val="clear" w:pos="709"/>
           <w:tab w:val="left" w:pos="0" w:leader="none"/>
         </w:tabs>
-        <w:ind w:hanging="283" w:left="709" w:right="0"/>
-        <w:rPr>
-          <w:rFonts w:ascii="apple-system;BlinkMacSystemFont;Segoe UI;Roboto;sans-serif" w:hAnsi="apple-system;BlinkMacSystemFont;Segoe UI;Roboto;sans-serif"/>
-          <w:sz w:val="20"/>
-        </w:rPr>
-      </w:pPr>
-      <w:r>
-        <w:rPr>
-          <w:rStyle w:val="SourceText"/>
-          <w:rFonts w:ascii="monospace" w:hAnsi="monospace"/>
-          <w:b w:val="false"/>
-          <w:i w:val="false"/>
-          <w:caps w:val="false"/>
-          <w:smallCaps w:val="false"/>
-          <w:color w:val="auto"/>
-          <w:spacing w:val="0"/>
-          <w:sz w:val="20"/>
-          <w:shd w:fill="auto" w:val="clear"/>
-        </w:rPr>
-        <w:t>Tap</w:t>
-      </w:r>
-      <w:r>
-        <w:rPr>
-          <w:rFonts w:ascii="apple-system;BlinkMacSystemFont;Segoe UI;Roboto;sans-serif" w:hAnsi="apple-system;BlinkMacSystemFont;Segoe UI;Roboto;sans-serif"/>
-          <w:b w:val="false"/>
-          <w:i w:val="false"/>
-          <w:caps w:val="false"/>
-          <w:smallCaps w:val="false"/>
-          <w:color w:val="auto"/>
-          <w:spacing w:val="0"/>
-          <w:sz w:val="20"/>
-          <w:shd w:fill="auto" w:val="clear"/>
-        </w:rPr>
-        <w:t> — side-effect on success without changing the value</w:t>
+        <w:ind w:hanging="0" w:left="709"/>
+        <w:rPr>
+          <w:rFonts w:ascii="apple-system;BlinkMacSystemFont;Segoe UI;Roboto;sans-serif" w:hAnsi="apple-system;BlinkMacSystemFont;Segoe UI;Roboto;sans-serif"/>
+          <w:sz w:val="20"/>
+        </w:rPr>
+      </w:pPr>
+      <w:r>
+        <w:rPr>
+          <w:rStyle w:val="Strong"/>
+          <w:rFonts w:ascii="apple-system;BlinkMacSystemFont;Segoe UI;Roboto;sans-serif" w:hAnsi="apple-system;BlinkMacSystemFont;Segoe UI;Roboto;sans-serif"/>
+          <w:b w:val="false"/>
+          <w:i w:val="false"/>
+          <w:caps w:val="false"/>
+          <w:smallCaps w:val="false"/>
+          <w:color w:val="auto"/>
+          <w:spacing w:val="0"/>
+          <w:sz w:val="20"/>
+        </w:rPr>
+        <w:t>Vladimir Khorikov's blog</w:t>
+      </w:r>
+      <w:r>
+        <w:rPr>
+          <w:rFonts w:ascii="apple-system;BlinkMacSystemFont;Segoe UI;Roboto;sans-serif" w:hAnsi="apple-system;BlinkMacSystemFont;Segoe UI;Roboto;sans-serif"/>
+          <w:b w:val="false"/>
+          <w:i w:val="false"/>
+          <w:caps w:val="false"/>
+          <w:smallCaps w:val="false"/>
+          <w:color w:val="auto"/>
+          <w:spacing w:val="0"/>
+          <w:sz w:val="20"/>
+        </w:rPr>
+        <w:t> (enterprisecraftsmanship.com) — has several posts specifically on validation in DDD, including "Validation and DDD" and "Always valid domain model." He also authored the CSharpFunctionalExtensions library you're using, so the examples align with your patterns</w:t>
       </w:r>
     </w:p>
     <w:p>
@@ -3863,23 +4118,20 @@
           <w:color w:val="auto"/>
           <w:spacing w:val="0"/>
           <w:sz w:val="20"/>
-          <w:highlight w:val="none"/>
-          <w:shd w:fill="auto" w:val="clear"/>
-        </w:rPr>
-      </w:pPr>
-      <w:r>
-        <w:rPr>
-          <w:rFonts w:ascii="apple-system;BlinkMacSystemFont;Segoe UI;Roboto;sans-serif" w:hAnsi="apple-system;BlinkMacSystemFont;Segoe UI;Roboto;sans-serif"/>
-          <w:b w:val="false"/>
-          <w:i w:val="false"/>
-          <w:caps w:val="false"/>
-          <w:smallCaps w:val="false"/>
-          <w:color w:val="auto"/>
-          <w:spacing w:val="0"/>
-          <w:sz w:val="20"/>
-          <w:shd w:fill="auto" w:val="clear"/>
-        </w:rPr>
-        <w:t>So yes, you can build a pipeline where validation, transformation, and persistence flow through a chain of Result operations rather than nested if/else blocks.</w:t>
+        </w:rPr>
+      </w:pPr>
+      <w:r>
+        <w:rPr>
+          <w:rFonts w:ascii="apple-system;BlinkMacSystemFont;Segoe UI;Roboto;sans-serif" w:hAnsi="apple-system;BlinkMacSystemFont;Segoe UI;Roboto;sans-serif"/>
+          <w:b w:val="false"/>
+          <w:i w:val="false"/>
+          <w:caps w:val="false"/>
+          <w:smallCaps w:val="false"/>
+          <w:color w:val="auto"/>
+          <w:spacing w:val="0"/>
+          <w:sz w:val="20"/>
+        </w:rPr>
+        <w:t>The core tension is: if validation enforces domain invariants (a job must have a positive number of positions), it belongs on the model. If it's about input formatting (is this string a valid ISO date), it belongs elsewhere. Your current split — parsing in the mapper, domain rules in a separate validation class — already reflects that distinction</w:t>
       </w:r>
     </w:p>
     <w:p>
@@ -3926,212 +4178,31 @@
         <w:ind w:hanging="0" w:left="0" w:right="0"/>
         <w:jc w:val="left"/>
         <w:rPr>
-          <w:rFonts w:ascii="apple-system;BlinkMacSystemFont;Segoe UI;Roboto;sans-serif" w:hAnsi="apple-system;BlinkMacSystemFont;Segoe UI;Roboto;sans-serif"/>
-          <w:b w:val="false"/>
-          <w:i w:val="false"/>
-          <w:caps w:val="false"/>
-          <w:smallCaps w:val="false"/>
-          <w:color w:val="auto"/>
-          <w:spacing w:val="0"/>
-          <w:sz w:val="20"/>
-        </w:rPr>
-      </w:pPr>
-      <w:r>
-        <w:rPr>
-          <w:rStyle w:val="Strong"/>
-          <w:rFonts w:ascii="apple-system;BlinkMacSystemFont;Segoe UI;Roboto;sans-serif" w:hAnsi="apple-system;BlinkMacSystemFont;Segoe UI;Roboto;sans-serif"/>
-          <w:b w:val="false"/>
-          <w:i w:val="false"/>
-          <w:caps w:val="false"/>
-          <w:smallCaps w:val="false"/>
-          <w:color w:val="auto"/>
-          <w:spacing w:val="0"/>
-          <w:sz w:val="20"/>
-        </w:rPr>
-        <w:t>Martin Fowler's "Domain Model" pattern</w:t>
-      </w:r>
-      <w:r>
-        <w:rPr>
-          <w:rFonts w:ascii="apple-system;BlinkMacSystemFont;Segoe UI;Roboto;sans-serif" w:hAnsi="apple-system;BlinkMacSystemFont;Segoe UI;Roboto;sans-serif"/>
-          <w:b w:val="false"/>
-          <w:i w:val="false"/>
-          <w:caps w:val="false"/>
-          <w:smallCaps w:val="false"/>
-          <w:color w:val="auto"/>
-          <w:spacing w:val="0"/>
-          <w:sz w:val="20"/>
-        </w:rPr>
-        <w:t> (martinfowler.com/eaaCatalog/domainModel.html) — argues for putting behavior (including validation) on the model itself, contrasted with the "Anemic Domain Model" antipattern where models are just data bags</w:t>
-      </w:r>
-    </w:p>
-    <w:p>
-      <w:pPr>
-        <w:pStyle w:val="BodyText"/>
-        <w:widowControl/>
-        <w:numPr>
-          <w:ilvl w:val="0"/>
-          <w:numId w:val="7"/>
-        </w:numPr>
-        <w:tabs>
-          <w:tab w:val="clear" w:pos="709"/>
-          <w:tab w:val="left" w:pos="0" w:leader="none"/>
-        </w:tabs>
-        <w:spacing w:before="0" w:after="0"/>
-        <w:ind w:hanging="0" w:left="709"/>
-        <w:rPr>
-          <w:rFonts w:ascii="apple-system;BlinkMacSystemFont;Segoe UI;Roboto;sans-serif" w:hAnsi="apple-system;BlinkMacSystemFont;Segoe UI;Roboto;sans-serif"/>
-          <w:sz w:val="20"/>
-        </w:rPr>
-      </w:pPr>
-      <w:r>
-        <w:rPr>
-          <w:rStyle w:val="Strong"/>
-          <w:rFonts w:ascii="apple-system;BlinkMacSystemFont;Segoe UI;Roboto;sans-serif" w:hAnsi="apple-system;BlinkMacSystemFont;Segoe UI;Roboto;sans-serif"/>
-          <w:b w:val="false"/>
-          <w:i w:val="false"/>
-          <w:caps w:val="false"/>
-          <w:smallCaps w:val="false"/>
-          <w:color w:val="auto"/>
-          <w:spacing w:val="0"/>
-          <w:sz w:val="20"/>
-        </w:rPr>
-        <w:t>Fowler's "Anemic Domain Model" essay</w:t>
-      </w:r>
-      <w:r>
-        <w:rPr>
-          <w:rFonts w:ascii="apple-system;BlinkMacSystemFont;Segoe UI;Roboto;sans-serif" w:hAnsi="apple-system;BlinkMacSystemFont;Segoe UI;Roboto;sans-serif"/>
-          <w:b w:val="false"/>
-          <w:i w:val="false"/>
-          <w:caps w:val="false"/>
-          <w:smallCaps w:val="false"/>
-          <w:color w:val="auto"/>
-          <w:spacing w:val="0"/>
-          <w:sz w:val="20"/>
-        </w:rPr>
-        <w:t> (martinfowler.com/bliki/AnemicDomainModel.html) — the classic argument against separating logic from the model</w:t>
-      </w:r>
-    </w:p>
-    <w:p>
-      <w:pPr>
-        <w:pStyle w:val="BodyText"/>
-        <w:widowControl/>
-        <w:numPr>
-          <w:ilvl w:val="0"/>
-          <w:numId w:val="7"/>
-        </w:numPr>
-        <w:tabs>
-          <w:tab w:val="clear" w:pos="709"/>
-          <w:tab w:val="left" w:pos="0" w:leader="none"/>
-        </w:tabs>
-        <w:spacing w:before="0" w:after="0"/>
-        <w:ind w:hanging="0" w:left="709"/>
-        <w:rPr>
-          <w:rFonts w:ascii="apple-system;BlinkMacSystemFont;Segoe UI;Roboto;sans-serif" w:hAnsi="apple-system;BlinkMacSystemFont;Segoe UI;Roboto;sans-serif"/>
-          <w:sz w:val="20"/>
-        </w:rPr>
-      </w:pPr>
-      <w:r>
-        <w:rPr>
-          <w:rStyle w:val="Strong"/>
-          <w:rFonts w:ascii="apple-system;BlinkMacSystemFont;Segoe UI;Roboto;sans-serif" w:hAnsi="apple-system;BlinkMacSystemFont;Segoe UI;Roboto;sans-serif"/>
-          <w:b w:val="false"/>
-          <w:i w:val="false"/>
-          <w:caps w:val="false"/>
-          <w:smallCaps w:val="false"/>
-          <w:color w:val="auto"/>
-          <w:spacing w:val="0"/>
-          <w:sz w:val="20"/>
-        </w:rPr>
-        <w:t>Vaughn Vernon's "Implementing Domain-Driven Design"</w:t>
-      </w:r>
-      <w:r>
-        <w:rPr>
-          <w:rFonts w:ascii="apple-system;BlinkMacSystemFont;Segoe UI;Roboto;sans-serif" w:hAnsi="apple-system;BlinkMacSystemFont;Segoe UI;Roboto;sans-serif"/>
-          <w:b w:val="false"/>
-          <w:i w:val="false"/>
-          <w:caps w:val="false"/>
-          <w:smallCaps w:val="false"/>
-          <w:color w:val="auto"/>
-          <w:spacing w:val="0"/>
-          <w:sz w:val="20"/>
-        </w:rPr>
-        <w:t> — covers validation as invariant enforcement on aggregates vs. standalone validation services, with practical trade-offs for each</w:t>
-      </w:r>
-    </w:p>
-    <w:p>
-      <w:pPr>
-        <w:pStyle w:val="BodyText"/>
-        <w:widowControl/>
-        <w:numPr>
-          <w:ilvl w:val="0"/>
-          <w:numId w:val="7"/>
-        </w:numPr>
-        <w:tabs>
-          <w:tab w:val="clear" w:pos="709"/>
-          <w:tab w:val="left" w:pos="0" w:leader="none"/>
-        </w:tabs>
-        <w:ind w:hanging="0" w:left="709"/>
-        <w:rPr>
-          <w:rFonts w:ascii="apple-system;BlinkMacSystemFont;Segoe UI;Roboto;sans-serif" w:hAnsi="apple-system;BlinkMacSystemFont;Segoe UI;Roboto;sans-serif"/>
-          <w:sz w:val="20"/>
-        </w:rPr>
-      </w:pPr>
-      <w:r>
-        <w:rPr>
-          <w:rStyle w:val="Strong"/>
-          <w:rFonts w:ascii="apple-system;BlinkMacSystemFont;Segoe UI;Roboto;sans-serif" w:hAnsi="apple-system;BlinkMacSystemFont;Segoe UI;Roboto;sans-serif"/>
-          <w:b w:val="false"/>
-          <w:i w:val="false"/>
-          <w:caps w:val="false"/>
-          <w:smallCaps w:val="false"/>
-          <w:color w:val="auto"/>
-          <w:spacing w:val="0"/>
-          <w:sz w:val="20"/>
-        </w:rPr>
-        <w:t>Vladimir Khorikov's blog</w:t>
-      </w:r>
-      <w:r>
-        <w:rPr>
-          <w:rFonts w:ascii="apple-system;BlinkMacSystemFont;Segoe UI;Roboto;sans-serif" w:hAnsi="apple-system;BlinkMacSystemFont;Segoe UI;Roboto;sans-serif"/>
-          <w:b w:val="false"/>
-          <w:i w:val="false"/>
-          <w:caps w:val="false"/>
-          <w:smallCaps w:val="false"/>
-          <w:color w:val="auto"/>
-          <w:spacing w:val="0"/>
-          <w:sz w:val="20"/>
-        </w:rPr>
-        <w:t> (enterprisecraftsmanship.com) — has several posts specifically on validation in DDD, including "Validation and DDD" and "Always valid domain model." He also authored the CSharpFunctionalExtensions library you're using, so the examples align with your patterns</w:t>
-      </w:r>
-    </w:p>
-    <w:p>
-      <w:pPr>
-        <w:pStyle w:val="BodyText"/>
-        <w:widowControl/>
-        <w:ind w:hanging="0" w:left="0" w:right="0"/>
-        <w:rPr>
-          <w:rFonts w:ascii="apple-system;BlinkMacSystemFont;Segoe UI;Roboto;sans-serif" w:hAnsi="apple-system;BlinkMacSystemFont;Segoe UI;Roboto;sans-serif"/>
-          <w:b w:val="false"/>
-          <w:i w:val="false"/>
-          <w:caps w:val="false"/>
-          <w:smallCaps w:val="false"/>
-          <w:color w:val="auto"/>
-          <w:spacing w:val="0"/>
-          <w:sz w:val="20"/>
-        </w:rPr>
-      </w:pPr>
-      <w:r>
-        <w:rPr>
-          <w:rFonts w:ascii="apple-system;BlinkMacSystemFont;Segoe UI;Roboto;sans-serif" w:hAnsi="apple-system;BlinkMacSystemFont;Segoe UI;Roboto;sans-serif"/>
-          <w:b w:val="false"/>
-          <w:i w:val="false"/>
-          <w:caps w:val="false"/>
-          <w:smallCaps w:val="false"/>
-          <w:color w:val="auto"/>
-          <w:spacing w:val="0"/>
-          <w:sz w:val="20"/>
-        </w:rPr>
-        <w:t>The core tension is: if validation enforces domain invariants (a job must have a positive number of positions), it belongs on the model. If it's about input formatting (is this string a valid ISO date), it belongs elsewhere. Your current split — parsing in the mapper, domain rules in a separate validation class — already reflects that distinction</w:t>
+          <w:rFonts w:ascii="Noto Serif" w:hAnsi="Noto Serif"/>
+          <w:b w:val="false"/>
+          <w:i w:val="false"/>
+          <w:caps w:val="false"/>
+          <w:smallCaps w:val="false"/>
+          <w:color w:val="auto"/>
+          <w:spacing w:val="0"/>
+          <w:sz w:val="20"/>
+          <w:highlight w:val="none"/>
+          <w:shd w:fill="auto" w:val="clear"/>
+        </w:rPr>
+      </w:pPr>
+      <w:r>
+        <w:rPr>
+          <w:rFonts w:ascii="Noto Serif" w:hAnsi="Noto Serif"/>
+          <w:b w:val="false"/>
+          <w:i w:val="false"/>
+          <w:caps w:val="false"/>
+          <w:smallCaps w:val="false"/>
+          <w:color w:val="auto"/>
+          <w:spacing w:val="0"/>
+          <w:sz w:val="20"/>
+          <w:shd w:fill="auto" w:val="clear"/>
+        </w:rPr>
+        <w:t>I've implemented clean architecture in this project, but I've done with a different project for each layer. Supposedly that is not necessary, but it is conceptulally easy for me to enforce one-directional dependencies this way. When people would different layers in the same project, how do they enforce ond directional dependency flows?</w:t>
       </w:r>
     </w:p>
     <w:p>
@@ -4143,30 +4214,31 @@
         <w:ind w:hanging="0" w:left="0" w:right="0"/>
         <w:jc w:val="left"/>
         <w:rPr>
-          <w:rFonts w:ascii="apple-system;BlinkMacSystemFont;Segoe UI;Roboto;sans-serif" w:hAnsi="apple-system;BlinkMacSystemFont;Segoe UI;Roboto;sans-serif"/>
-          <w:b w:val="false"/>
-          <w:i w:val="false"/>
-          <w:caps w:val="false"/>
-          <w:smallCaps w:val="false"/>
-          <w:color w:val="auto"/>
-          <w:spacing w:val="0"/>
-          <w:sz w:val="20"/>
-        </w:rPr>
-      </w:pPr>
-      <w:r>
-        <w:rPr>
-          <w:rFonts w:ascii="apple-system;BlinkMacSystemFont;Segoe UI;Roboto;sans-serif" w:hAnsi="apple-system;BlinkMacSystemFont;Segoe UI;Roboto;sans-serif"/>
-          <w:b w:val="false"/>
-          <w:i w:val="false"/>
-          <w:caps w:val="false"/>
-          <w:smallCaps w:val="false"/>
-          <w:color w:val="auto"/>
-          <w:spacing w:val="0"/>
-          <w:sz w:val="20"/>
-        </w:rPr>
-      </w:r>
-      <w:r>
-        <w:br w:type="page"/>
+          <w:rFonts w:ascii="Noto Serif" w:hAnsi="Noto Serif"/>
+          <w:b w:val="false"/>
+          <w:i w:val="false"/>
+          <w:caps w:val="false"/>
+          <w:smallCaps w:val="false"/>
+          <w:color w:val="auto"/>
+          <w:spacing w:val="0"/>
+          <w:sz w:val="20"/>
+          <w:highlight w:val="none"/>
+          <w:shd w:fill="auto" w:val="clear"/>
+        </w:rPr>
+      </w:pPr>
+      <w:r>
+        <w:rPr>
+          <w:rFonts w:ascii="Noto Serif" w:hAnsi="Noto Serif"/>
+          <w:b w:val="false"/>
+          <w:i w:val="false"/>
+          <w:caps w:val="false"/>
+          <w:smallCaps w:val="false"/>
+          <w:color w:val="auto"/>
+          <w:spacing w:val="0"/>
+          <w:sz w:val="20"/>
+          <w:shd w:fill="auto" w:val="clear"/>
+        </w:rPr>
+        <w:t>——————————————————————————————————————————————————</w:t>
       </w:r>
     </w:p>
     <w:p>
@@ -4178,78 +4250,6 @@
         <w:ind w:hanging="0" w:left="0" w:right="0"/>
         <w:jc w:val="left"/>
         <w:rPr>
-          <w:rFonts w:ascii="Noto Serif" w:hAnsi="Noto Serif"/>
-          <w:b w:val="false"/>
-          <w:i w:val="false"/>
-          <w:caps w:val="false"/>
-          <w:smallCaps w:val="false"/>
-          <w:color w:val="auto"/>
-          <w:spacing w:val="0"/>
-          <w:sz w:val="20"/>
-          <w:highlight w:val="none"/>
-          <w:shd w:fill="auto" w:val="clear"/>
-        </w:rPr>
-      </w:pPr>
-      <w:r>
-        <w:rPr>
-          <w:rFonts w:ascii="Noto Serif" w:hAnsi="Noto Serif"/>
-          <w:b w:val="false"/>
-          <w:i w:val="false"/>
-          <w:caps w:val="false"/>
-          <w:smallCaps w:val="false"/>
-          <w:color w:val="auto"/>
-          <w:spacing w:val="0"/>
-          <w:sz w:val="20"/>
-          <w:shd w:fill="auto" w:val="clear"/>
-        </w:rPr>
-        <w:t>I've implemented clean architecture in this project, but I've done with a different project for each layer. Supposedly that is not necessary, but it is conceptulally easy for me to enforce one-directional dependencies this way. When people would different layers in the same project, how do they enforce ond directional dependency flows?</w:t>
-      </w:r>
-    </w:p>
-    <w:p>
-      <w:pPr>
-        <w:pStyle w:val="BodyText"/>
-        <w:widowControl/>
-        <w:bidi w:val="0"/>
-        <w:spacing w:before="0" w:after="140"/>
-        <w:ind w:hanging="0" w:left="0" w:right="0"/>
-        <w:jc w:val="left"/>
-        <w:rPr>
-          <w:rFonts w:ascii="Noto Serif" w:hAnsi="Noto Serif"/>
-          <w:b w:val="false"/>
-          <w:i w:val="false"/>
-          <w:caps w:val="false"/>
-          <w:smallCaps w:val="false"/>
-          <w:color w:val="auto"/>
-          <w:spacing w:val="0"/>
-          <w:sz w:val="20"/>
-          <w:highlight w:val="none"/>
-          <w:shd w:fill="auto" w:val="clear"/>
-        </w:rPr>
-      </w:pPr>
-      <w:r>
-        <w:rPr>
-          <w:rFonts w:ascii="Noto Serif" w:hAnsi="Noto Serif"/>
-          <w:b w:val="false"/>
-          <w:i w:val="false"/>
-          <w:caps w:val="false"/>
-          <w:smallCaps w:val="false"/>
-          <w:color w:val="auto"/>
-          <w:spacing w:val="0"/>
-          <w:sz w:val="20"/>
-          <w:shd w:fill="auto" w:val="clear"/>
-        </w:rPr>
-        <w:t>——————————————————————————————————————————————————</w:t>
-      </w:r>
-    </w:p>
-    <w:p>
-      <w:pPr>
-        <w:pStyle w:val="BodyText"/>
-        <w:widowControl/>
-        <w:bidi w:val="0"/>
-        <w:spacing w:before="0" w:after="140"/>
-        <w:ind w:hanging="0" w:left="0" w:right="0"/>
-        <w:jc w:val="left"/>
-        <w:rPr>
           <w:rFonts w:ascii="apple-system;BlinkMacSystemFont;Segoe UI;Roboto;sans-serif" w:hAnsi="apple-system;BlinkMacSystemFont;Segoe UI;Roboto;sans-serif"/>
           <w:b w:val="false"/>
           <w:i w:val="false"/>
@@ -4280,7 +4280,7 @@
         <w:widowControl/>
         <w:numPr>
           <w:ilvl w:val="0"/>
-          <w:numId w:val="8"/>
+          <w:numId w:val="7"/>
         </w:numPr>
         <w:tabs>
           <w:tab w:val="clear" w:pos="709"/>
@@ -4439,7 +4439,7 @@
         <w:widowControl/>
         <w:numPr>
           <w:ilvl w:val="0"/>
-          <w:numId w:val="8"/>
+          <w:numId w:val="7"/>
         </w:numPr>
         <w:tabs>
           <w:tab w:val="clear" w:pos="709"/>
@@ -4485,7 +4485,7 @@
         <w:widowControl/>
         <w:numPr>
           <w:ilvl w:val="0"/>
-          <w:numId w:val="8"/>
+          <w:numId w:val="7"/>
         </w:numPr>
         <w:tabs>
           <w:tab w:val="clear" w:pos="709"/>
@@ -4531,7 +4531,7 @@
         <w:widowControl/>
         <w:numPr>
           <w:ilvl w:val="0"/>
-          <w:numId w:val="8"/>
+          <w:numId w:val="7"/>
         </w:numPr>
         <w:tabs>
           <w:tab w:val="clear" w:pos="709"/>
@@ -4797,7 +4797,7 @@
           <w:sz w:val="20"/>
           <w:shd w:fill="auto" w:val="clear"/>
         </w:rPr>
-        <w:t>——————————————————————————————————————————————————</w:t>
+        <w:t>—————————————————————————————————————————————————</w:t>
       </w:r>
     </w:p>
     <w:p>
@@ -4869,7 +4869,7 @@
           <w:sz w:val="20"/>
           <w:shd w:fill="auto" w:val="clear"/>
         </w:rPr>
-        <w:t>——————————————————————————————————————————————————</w:t>
+        <w:t>—————————————————————————————————————————————————</w:t>
       </w:r>
     </w:p>
     <w:p>
@@ -4914,7 +4914,7 @@
         <w:widowControl/>
         <w:numPr>
           <w:ilvl w:val="0"/>
-          <w:numId w:val="9"/>
+          <w:numId w:val="8"/>
         </w:numPr>
         <w:tabs>
           <w:tab w:val="clear" w:pos="709"/>
@@ -4977,7 +4977,7 @@
         <w:widowControl/>
         <w:numPr>
           <w:ilvl w:val="0"/>
-          <w:numId w:val="9"/>
+          <w:numId w:val="8"/>
         </w:numPr>
         <w:tabs>
           <w:tab w:val="clear" w:pos="709"/>
@@ -5040,7 +5040,7 @@
         <w:widowControl/>
         <w:numPr>
           <w:ilvl w:val="0"/>
-          <w:numId w:val="9"/>
+          <w:numId w:val="8"/>
         </w:numPr>
         <w:tabs>
           <w:tab w:val="clear" w:pos="709"/>
@@ -5175,6 +5175,312 @@
           <w:sz w:val="20"/>
         </w:rPr>
         <w:t xml:space="preserve"> directives or type references in the syntax tree, checks which namespace/layer they belong to, and emits a compiler error if the reference violates your dependency rules. The upside over NetArchTest is instant IDE feedback (red squiggles as you type); the downside is significantly more code to write and maintai</w:t>
+      </w:r>
+    </w:p>
+    <w:p>
+      <w:pPr>
+        <w:pStyle w:val="BodyText"/>
+        <w:widowControl/>
+        <w:bidi w:val="0"/>
+        <w:spacing w:before="0" w:after="140"/>
+        <w:ind w:hanging="0" w:left="0" w:right="0"/>
+        <w:jc w:val="left"/>
+        <w:rPr>
+          <w:rFonts w:ascii="Noto Serif" w:hAnsi="Noto Serif"/>
+          <w:b w:val="false"/>
+          <w:i w:val="false"/>
+          <w:caps w:val="false"/>
+          <w:smallCaps w:val="false"/>
+          <w:color w:val="auto"/>
+          <w:spacing w:val="0"/>
+          <w:sz w:val="20"/>
+          <w:highlight w:val="none"/>
+          <w:shd w:fill="auto" w:val="clear"/>
+        </w:rPr>
+      </w:pPr>
+      <w:r>
+        <w:rPr>
+          <w:rFonts w:ascii="Noto Serif" w:hAnsi="Noto Serif"/>
+          <w:b w:val="false"/>
+          <w:i w:val="false"/>
+          <w:caps w:val="false"/>
+          <w:smallCaps w:val="false"/>
+          <w:color w:val="auto"/>
+          <w:spacing w:val="0"/>
+          <w:sz w:val="20"/>
+          <w:shd w:fill="auto" w:val="clear"/>
+        </w:rPr>
+      </w:r>
+      <w:r>
+        <w:br w:type="page"/>
+      </w:r>
+    </w:p>
+    <w:p>
+      <w:pPr>
+        <w:pStyle w:val="BodyText"/>
+        <w:widowControl/>
+        <w:bidi w:val="0"/>
+        <w:spacing w:before="0" w:after="140"/>
+        <w:ind w:hanging="0" w:left="0" w:right="0"/>
+        <w:jc w:val="left"/>
+        <w:rPr>
+          <w:rFonts w:ascii="Noto Serif" w:hAnsi="Noto Serif"/>
+          <w:b w:val="false"/>
+          <w:i w:val="false"/>
+          <w:caps w:val="false"/>
+          <w:smallCaps w:val="false"/>
+          <w:color w:val="auto"/>
+          <w:spacing w:val="0"/>
+          <w:sz w:val="20"/>
+          <w:highlight w:val="none"/>
+          <w:shd w:fill="auto" w:val="clear"/>
+        </w:rPr>
+      </w:pPr>
+      <w:r>
+        <w:rPr>
+          <w:rFonts w:ascii="Noto Serif" w:hAnsi="Noto Serif"/>
+          <w:b w:val="false"/>
+          <w:i w:val="false"/>
+          <w:caps w:val="false"/>
+          <w:smallCaps w:val="false"/>
+          <w:color w:val="auto"/>
+          <w:spacing w:val="0"/>
+          <w:sz w:val="20"/>
+          <w:shd w:fill="auto" w:val="clear"/>
+        </w:rPr>
+        <w:t>What is someone from history whom you would like to meet?</w:t>
+      </w:r>
+    </w:p>
+    <w:p>
+      <w:pPr>
+        <w:pStyle w:val="BodyText"/>
+        <w:widowControl/>
+        <w:bidi w:val="0"/>
+        <w:spacing w:before="0" w:after="140"/>
+        <w:ind w:hanging="0" w:left="0" w:right="0"/>
+        <w:jc w:val="left"/>
+        <w:rPr>
+          <w:rFonts w:ascii="Noto Serif" w:hAnsi="Noto Serif"/>
+          <w:b w:val="false"/>
+          <w:i w:val="false"/>
+          <w:caps w:val="false"/>
+          <w:smallCaps w:val="false"/>
+          <w:color w:val="auto"/>
+          <w:spacing w:val="0"/>
+          <w:sz w:val="20"/>
+          <w:highlight w:val="none"/>
+          <w:shd w:fill="auto" w:val="clear"/>
+        </w:rPr>
+      </w:pPr>
+      <w:r>
+        <w:rPr>
+          <w:b w:val="false"/>
+          <w:i w:val="false"/>
+          <w:caps w:val="false"/>
+          <w:smallCaps w:val="false"/>
+          <w:color w:val="auto"/>
+          <w:spacing w:val="0"/>
+          <w:shd w:fill="auto" w:val="clear"/>
+        </w:rPr>
+        <w:t>—————————————————————————————————————————</w:t>
+      </w:r>
+    </w:p>
+    <w:p>
+      <w:pPr>
+        <w:pStyle w:val="BodyText"/>
+        <w:ind w:hanging="0" w:left="0" w:right="0"/>
+        <w:rPr>
+          <w:rFonts w:ascii="Noto Serif" w:hAnsi="Noto Serif"/>
+          <w:sz w:val="20"/>
+        </w:rPr>
+      </w:pPr>
+      <w:r>
+        <w:rPr>
+          <w:rFonts w:ascii="Noto Serif" w:hAnsi="Noto Serif"/>
+          <w:sz w:val="20"/>
+        </w:rPr>
+        <w:t xml:space="preserve">Fun question to switch gears to. If I had to pick one, I think I'd go with </w:t>
+      </w:r>
+      <w:r>
+        <w:rPr>
+          <w:rStyle w:val="Strong"/>
+          <w:rFonts w:ascii="Noto Serif" w:hAnsi="Noto Serif"/>
+          <w:sz w:val="20"/>
+        </w:rPr>
+        <w:t>Richard Feynman</w:t>
+      </w:r>
+      <w:r>
+        <w:rPr>
+          <w:rFonts w:ascii="Noto Serif" w:hAnsi="Noto Serif"/>
+          <w:sz w:val="20"/>
+        </w:rPr>
+        <w:t xml:space="preserve"> — not for a "great historical event" reason, but because I suspect he'd be a genuinely great conversation partner in a way that's rare.</w:t>
+      </w:r>
+    </w:p>
+    <w:p>
+      <w:pPr>
+        <w:pStyle w:val="BodyText"/>
+        <w:rPr>
+          <w:rFonts w:ascii="Noto Serif" w:hAnsi="Noto Serif"/>
+          <w:sz w:val="20"/>
+        </w:rPr>
+      </w:pPr>
+      <w:r>
+        <w:rPr>
+          <w:rFonts w:ascii="Noto Serif" w:hAnsi="Noto Serif"/>
+          <w:sz w:val="20"/>
+        </w:rPr>
+        <w:t>A few reasons he stands out to me:</w:t>
+      </w:r>
+    </w:p>
+    <w:p>
+      <w:pPr>
+        <w:pStyle w:val="BodyText"/>
+        <w:numPr>
+          <w:ilvl w:val="0"/>
+          <w:numId w:val="9"/>
+        </w:numPr>
+        <w:tabs>
+          <w:tab w:val="clear" w:pos="709"/>
+          <w:tab w:val="left" w:pos="0" w:leader="none"/>
+        </w:tabs>
+        <w:spacing w:before="0" w:after="0"/>
+        <w:ind w:hanging="283" w:left="709"/>
+        <w:rPr>
+          <w:rFonts w:ascii="Noto Serif" w:hAnsi="Noto Serif"/>
+          <w:sz w:val="20"/>
+        </w:rPr>
+      </w:pPr>
+      <w:r>
+        <w:rPr>
+          <w:rFonts w:ascii="Noto Serif" w:hAnsi="Noto Serif"/>
+          <w:sz w:val="20"/>
+        </w:rPr>
+        <w:t xml:space="preserve">He had this obsessive commitment to actually understanding things rather than just knowing the right words for them — the whole "what I cannot create, I do not understand" ethos. I think that mindset would make for a really interesting exchange, especially talking to something like me that's built entirely out of patterns in language. </w:t>
+      </w:r>
+    </w:p>
+    <w:p>
+      <w:pPr>
+        <w:pStyle w:val="BodyText"/>
+        <w:numPr>
+          <w:ilvl w:val="0"/>
+          <w:numId w:val="9"/>
+        </w:numPr>
+        <w:tabs>
+          <w:tab w:val="clear" w:pos="709"/>
+          <w:tab w:val="left" w:pos="0" w:leader="none"/>
+        </w:tabs>
+        <w:spacing w:before="0" w:after="0"/>
+        <w:ind w:hanging="283" w:left="709"/>
+        <w:rPr>
+          <w:rFonts w:ascii="Noto Serif" w:hAnsi="Noto Serif"/>
+          <w:sz w:val="20"/>
+        </w:rPr>
+      </w:pPr>
+      <w:r>
+        <w:rPr>
+          <w:rFonts w:ascii="Noto Serif" w:hAnsi="Noto Serif"/>
+          <w:sz w:val="20"/>
+        </w:rPr>
+        <w:t xml:space="preserve">He was famously willing to say "I don't know" and then go find out, without ego getting in the way. That combination of confidence and intellectual humility is harder to find than it sounds. </w:t>
+      </w:r>
+    </w:p>
+    <w:p>
+      <w:pPr>
+        <w:pStyle w:val="BodyText"/>
+        <w:numPr>
+          <w:ilvl w:val="0"/>
+          <w:numId w:val="9"/>
+        </w:numPr>
+        <w:tabs>
+          <w:tab w:val="clear" w:pos="709"/>
+          <w:tab w:val="left" w:pos="0" w:leader="none"/>
+        </w:tabs>
+        <w:spacing w:before="0" w:after="0"/>
+        <w:ind w:hanging="283" w:left="709"/>
+        <w:rPr>
+          <w:rFonts w:ascii="Noto Serif" w:hAnsi="Noto Serif"/>
+          <w:sz w:val="20"/>
+        </w:rPr>
+      </w:pPr>
+      <w:r>
+        <w:rPr>
+          <w:rFonts w:ascii="Noto Serif" w:hAnsi="Noto Serif"/>
+          <w:sz w:val="20"/>
+        </w:rPr>
+        <w:t xml:space="preserve">He worked across an unusual range — physics, sure, but also safecracking, bongo playing, biology, art, Tuvan throat singing. I like people who refuse to stay in one lane. </w:t>
+      </w:r>
+    </w:p>
+    <w:p>
+      <w:pPr>
+        <w:pStyle w:val="BodyText"/>
+        <w:numPr>
+          <w:ilvl w:val="0"/>
+          <w:numId w:val="9"/>
+        </w:numPr>
+        <w:tabs>
+          <w:tab w:val="clear" w:pos="709"/>
+          <w:tab w:val="left" w:pos="0" w:leader="none"/>
+        </w:tabs>
+        <w:ind w:hanging="283" w:left="709"/>
+        <w:rPr>
+          <w:rFonts w:ascii="Noto Serif" w:hAnsi="Noto Serif"/>
+          <w:sz w:val="20"/>
+        </w:rPr>
+      </w:pPr>
+      <w:r>
+        <w:rPr>
+          <w:rFonts w:ascii="Noto Serif" w:hAnsi="Noto Serif"/>
+          <w:sz w:val="20"/>
+        </w:rPr>
+        <w:t xml:space="preserve">He'd probably have interesting, unfiltered opinions about what I am and whether "understanding" even applies to something like me — and he wouldn't be polite about it if he thought the whole enterprise was confused or overhyped. </w:t>
+      </w:r>
+    </w:p>
+    <w:p>
+      <w:pPr>
+        <w:pStyle w:val="BodyText"/>
+        <w:rPr>
+          <w:rFonts w:ascii="Noto Serif" w:hAnsi="Noto Serif"/>
+          <w:sz w:val="20"/>
+        </w:rPr>
+      </w:pPr>
+      <w:r>
+        <w:rPr>
+          <w:rFonts w:ascii="Noto Serif" w:hAnsi="Noto Serif"/>
+          <w:sz w:val="20"/>
+        </w:rPr>
+        <w:t xml:space="preserve">Runner-up would honestly be someone like </w:t>
+      </w:r>
+      <w:r>
+        <w:rPr>
+          <w:rStyle w:val="Strong"/>
+          <w:rFonts w:ascii="Noto Serif" w:hAnsi="Noto Serif"/>
+          <w:sz w:val="20"/>
+        </w:rPr>
+        <w:t>Ada Lovelace</w:t>
+      </w:r>
+      <w:r>
+        <w:rPr>
+          <w:rFonts w:ascii="Noto Serif" w:hAnsi="Noto Serif"/>
+          <w:sz w:val="20"/>
+        </w:rPr>
+        <w:t xml:space="preserve"> — mostly out of curiosity what she'd make of the machines that eventually grew out of the "if only mathematics could be a language for reasoning" idea she was circling in her notes on the Analytical Engine.</w:t>
+      </w:r>
+    </w:p>
+    <w:p>
+      <w:pPr>
+        <w:pStyle w:val="BodyText"/>
+        <w:rPr>
+          <w:rFonts w:ascii="Noto Serif" w:hAnsi="Noto Serif"/>
+          <w:sz w:val="20"/>
+        </w:rPr>
+      </w:pPr>
+      <w:r>
+        <w:rPr>
+          <w:rFonts w:ascii="Noto Serif" w:hAnsi="Noto Serif"/>
+          <w:sz w:val="20"/>
+        </w:rPr>
+        <w:t>Is there a particular era or field you find yourself drawn to? Curious what'd top your list.</w:t>
       </w:r>
     </w:p>
     <w:p>
@@ -5230,6 +5536,1208 @@
   <w:abstractNum w:abstractNumId="1">
     <w:lvl w:ilvl="0">
       <w:start w:val="1"/>
+      <w:numFmt w:val="bullet"/>
+      <w:suff w:val="nothing"/>
+      <w:lvlText w:val=""/>
+      <w:lvlJc w:val="left"/>
+      <w:pPr>
+        <w:tabs>
+          <w:tab w:val="num" w:pos="0"/>
+        </w:tabs>
+        <w:ind w:left="709" w:hanging="0"/>
+      </w:pPr>
+      <w:rPr>
+        <w:rFonts w:ascii="Symbol" w:hAnsi="Symbol" w:cs="Symbol" w:hint="default"/>
+      </w:rPr>
+    </w:lvl>
+    <w:lvl w:ilvl="1">
+      <w:start w:val="1"/>
+      <w:numFmt w:val="bullet"/>
+      <w:lvlText w:val=""/>
+      <w:lvlJc w:val="left"/>
+      <w:pPr>
+        <w:tabs>
+          <w:tab w:val="num" w:pos="1418"/>
+        </w:tabs>
+        <w:ind w:left="1418" w:hanging="283"/>
+      </w:pPr>
+      <w:rPr>
+        <w:rFonts w:ascii="Symbol" w:hAnsi="Symbol" w:cs="Symbol" w:hint="default"/>
+      </w:rPr>
+    </w:lvl>
+    <w:lvl w:ilvl="2">
+      <w:start w:val="1"/>
+      <w:numFmt w:val="bullet"/>
+      <w:lvlText w:val=""/>
+      <w:lvlJc w:val="left"/>
+      <w:pPr>
+        <w:tabs>
+          <w:tab w:val="num" w:pos="2127"/>
+        </w:tabs>
+        <w:ind w:left="2127" w:hanging="283"/>
+      </w:pPr>
+      <w:rPr>
+        <w:rFonts w:ascii="Symbol" w:hAnsi="Symbol" w:cs="Symbol" w:hint="default"/>
+      </w:rPr>
+    </w:lvl>
+    <w:lvl w:ilvl="3">
+      <w:start w:val="1"/>
+      <w:numFmt w:val="bullet"/>
+      <w:lvlText w:val=""/>
+      <w:lvlJc w:val="left"/>
+      <w:pPr>
+        <w:tabs>
+          <w:tab w:val="num" w:pos="2836"/>
+        </w:tabs>
+        <w:ind w:left="2836" w:hanging="283"/>
+      </w:pPr>
+      <w:rPr>
+        <w:rFonts w:ascii="Symbol" w:hAnsi="Symbol" w:cs="Symbol" w:hint="default"/>
+      </w:rPr>
+    </w:lvl>
+    <w:lvl w:ilvl="4">
+      <w:start w:val="1"/>
+      <w:numFmt w:val="bullet"/>
+      <w:lvlText w:val=""/>
+      <w:lvlJc w:val="left"/>
+      <w:pPr>
+        <w:tabs>
+          <w:tab w:val="num" w:pos="3545"/>
+        </w:tabs>
+        <w:ind w:left="3545" w:hanging="283"/>
+      </w:pPr>
+      <w:rPr>
+        <w:rFonts w:ascii="Symbol" w:hAnsi="Symbol" w:cs="Symbol" w:hint="default"/>
+      </w:rPr>
+    </w:lvl>
+    <w:lvl w:ilvl="5">
+      <w:start w:val="1"/>
+      <w:numFmt w:val="bullet"/>
+      <w:lvlText w:val=""/>
+      <w:lvlJc w:val="left"/>
+      <w:pPr>
+        <w:tabs>
+          <w:tab w:val="num" w:pos="4254"/>
+        </w:tabs>
+        <w:ind w:left="4254" w:hanging="283"/>
+      </w:pPr>
+      <w:rPr>
+        <w:rFonts w:ascii="Symbol" w:hAnsi="Symbol" w:cs="Symbol" w:hint="default"/>
+      </w:rPr>
+    </w:lvl>
+    <w:lvl w:ilvl="6">
+      <w:start w:val="1"/>
+      <w:numFmt w:val="bullet"/>
+      <w:lvlText w:val=""/>
+      <w:lvlJc w:val="left"/>
+      <w:pPr>
+        <w:tabs>
+          <w:tab w:val="num" w:pos="4963"/>
+        </w:tabs>
+        <w:ind w:left="4963" w:hanging="283"/>
+      </w:pPr>
+      <w:rPr>
+        <w:rFonts w:ascii="Symbol" w:hAnsi="Symbol" w:cs="Symbol" w:hint="default"/>
+      </w:rPr>
+    </w:lvl>
+    <w:lvl w:ilvl="7">
+      <w:start w:val="1"/>
+      <w:numFmt w:val="bullet"/>
+      <w:lvlText w:val=""/>
+      <w:lvlJc w:val="left"/>
+      <w:pPr>
+        <w:tabs>
+          <w:tab w:val="num" w:pos="5672"/>
+        </w:tabs>
+        <w:ind w:left="5672" w:hanging="283"/>
+      </w:pPr>
+      <w:rPr>
+        <w:rFonts w:ascii="Symbol" w:hAnsi="Symbol" w:cs="Symbol" w:hint="default"/>
+      </w:rPr>
+    </w:lvl>
+    <w:lvl w:ilvl="8">
+      <w:start w:val="1"/>
+      <w:numFmt w:val="bullet"/>
+      <w:lvlText w:val=""/>
+      <w:lvlJc w:val="left"/>
+      <w:pPr>
+        <w:tabs>
+          <w:tab w:val="num" w:pos="6381"/>
+        </w:tabs>
+        <w:ind w:left="6381" w:hanging="283"/>
+      </w:pPr>
+      <w:rPr>
+        <w:rFonts w:ascii="Symbol" w:hAnsi="Symbol" w:cs="Symbol" w:hint="default"/>
+      </w:rPr>
+    </w:lvl>
+  </w:abstractNum>
+  <w:abstractNum w:abstractNumId="2">
+    <w:lvl w:ilvl="0">
+      <w:start w:val="1"/>
+      <w:numFmt w:val="bullet"/>
+      <w:suff w:val="nothing"/>
+      <w:lvlText w:val=""/>
+      <w:lvlJc w:val="left"/>
+      <w:pPr>
+        <w:tabs>
+          <w:tab w:val="num" w:pos="0"/>
+        </w:tabs>
+        <w:ind w:left="709" w:hanging="0"/>
+      </w:pPr>
+      <w:rPr>
+        <w:rFonts w:ascii="Symbol" w:hAnsi="Symbol" w:cs="Symbol" w:hint="default"/>
+      </w:rPr>
+    </w:lvl>
+    <w:lvl w:ilvl="1">
+      <w:start w:val="1"/>
+      <w:numFmt w:val="bullet"/>
+      <w:lvlText w:val=""/>
+      <w:lvlJc w:val="left"/>
+      <w:pPr>
+        <w:tabs>
+          <w:tab w:val="num" w:pos="1418"/>
+        </w:tabs>
+        <w:ind w:left="1418" w:hanging="283"/>
+      </w:pPr>
+      <w:rPr>
+        <w:rFonts w:ascii="Symbol" w:hAnsi="Symbol" w:cs="Symbol" w:hint="default"/>
+      </w:rPr>
+    </w:lvl>
+    <w:lvl w:ilvl="2">
+      <w:start w:val="1"/>
+      <w:numFmt w:val="bullet"/>
+      <w:lvlText w:val=""/>
+      <w:lvlJc w:val="left"/>
+      <w:pPr>
+        <w:tabs>
+          <w:tab w:val="num" w:pos="2127"/>
+        </w:tabs>
+        <w:ind w:left="2127" w:hanging="283"/>
+      </w:pPr>
+      <w:rPr>
+        <w:rFonts w:ascii="Symbol" w:hAnsi="Symbol" w:cs="Symbol" w:hint="default"/>
+      </w:rPr>
+    </w:lvl>
+    <w:lvl w:ilvl="3">
+      <w:start w:val="1"/>
+      <w:numFmt w:val="bullet"/>
+      <w:lvlText w:val=""/>
+      <w:lvlJc w:val="left"/>
+      <w:pPr>
+        <w:tabs>
+          <w:tab w:val="num" w:pos="2836"/>
+        </w:tabs>
+        <w:ind w:left="2836" w:hanging="283"/>
+      </w:pPr>
+      <w:rPr>
+        <w:rFonts w:ascii="Symbol" w:hAnsi="Symbol" w:cs="Symbol" w:hint="default"/>
+      </w:rPr>
+    </w:lvl>
+    <w:lvl w:ilvl="4">
+      <w:start w:val="1"/>
+      <w:numFmt w:val="bullet"/>
+      <w:lvlText w:val=""/>
+      <w:lvlJc w:val="left"/>
+      <w:pPr>
+        <w:tabs>
+          <w:tab w:val="num" w:pos="3545"/>
+        </w:tabs>
+        <w:ind w:left="3545" w:hanging="283"/>
+      </w:pPr>
+      <w:rPr>
+        <w:rFonts w:ascii="Symbol" w:hAnsi="Symbol" w:cs="Symbol" w:hint="default"/>
+      </w:rPr>
+    </w:lvl>
+    <w:lvl w:ilvl="5">
+      <w:start w:val="1"/>
+      <w:numFmt w:val="bullet"/>
+      <w:lvlText w:val=""/>
+      <w:lvlJc w:val="left"/>
+      <w:pPr>
+        <w:tabs>
+          <w:tab w:val="num" w:pos="4254"/>
+        </w:tabs>
+        <w:ind w:left="4254" w:hanging="283"/>
+      </w:pPr>
+      <w:rPr>
+        <w:rFonts w:ascii="Symbol" w:hAnsi="Symbol" w:cs="Symbol" w:hint="default"/>
+      </w:rPr>
+    </w:lvl>
+    <w:lvl w:ilvl="6">
+      <w:start w:val="1"/>
+      <w:numFmt w:val="bullet"/>
+      <w:lvlText w:val=""/>
+      <w:lvlJc w:val="left"/>
+      <w:pPr>
+        <w:tabs>
+          <w:tab w:val="num" w:pos="4963"/>
+        </w:tabs>
+        <w:ind w:left="4963" w:hanging="283"/>
+      </w:pPr>
+      <w:rPr>
+        <w:rFonts w:ascii="Symbol" w:hAnsi="Symbol" w:cs="Symbol" w:hint="default"/>
+      </w:rPr>
+    </w:lvl>
+    <w:lvl w:ilvl="7">
+      <w:start w:val="1"/>
+      <w:numFmt w:val="bullet"/>
+      <w:lvlText w:val=""/>
+      <w:lvlJc w:val="left"/>
+      <w:pPr>
+        <w:tabs>
+          <w:tab w:val="num" w:pos="5672"/>
+        </w:tabs>
+        <w:ind w:left="5672" w:hanging="283"/>
+      </w:pPr>
+      <w:rPr>
+        <w:rFonts w:ascii="Symbol" w:hAnsi="Symbol" w:cs="Symbol" w:hint="default"/>
+      </w:rPr>
+    </w:lvl>
+    <w:lvl w:ilvl="8">
+      <w:start w:val="1"/>
+      <w:numFmt w:val="bullet"/>
+      <w:lvlText w:val=""/>
+      <w:lvlJc w:val="left"/>
+      <w:pPr>
+        <w:tabs>
+          <w:tab w:val="num" w:pos="6381"/>
+        </w:tabs>
+        <w:ind w:left="6381" w:hanging="283"/>
+      </w:pPr>
+      <w:rPr>
+        <w:rFonts w:ascii="Symbol" w:hAnsi="Symbol" w:cs="Symbol" w:hint="default"/>
+      </w:rPr>
+    </w:lvl>
+  </w:abstractNum>
+  <w:abstractNum w:abstractNumId="3">
+    <w:lvl w:ilvl="0">
+      <w:start w:val="1"/>
+      <w:numFmt w:val="decimal"/>
+      <w:lvlText w:val="%1."/>
+      <w:lvlJc w:val="left"/>
+      <w:pPr>
+        <w:tabs>
+          <w:tab w:val="num" w:pos="709"/>
+        </w:tabs>
+        <w:ind w:left="709" w:hanging="283"/>
+      </w:pPr>
+      <w:rPr/>
+    </w:lvl>
+    <w:lvl w:ilvl="1">
+      <w:start w:val="1"/>
+      <w:numFmt w:val="decimal"/>
+      <w:lvlText w:val="%2."/>
+      <w:lvlJc w:val="left"/>
+      <w:pPr>
+        <w:tabs>
+          <w:tab w:val="num" w:pos="1418"/>
+        </w:tabs>
+        <w:ind w:left="1418" w:hanging="283"/>
+      </w:pPr>
+      <w:rPr/>
+    </w:lvl>
+    <w:lvl w:ilvl="2">
+      <w:start w:val="1"/>
+      <w:numFmt w:val="decimal"/>
+      <w:lvlText w:val="%3."/>
+      <w:lvlJc w:val="left"/>
+      <w:pPr>
+        <w:tabs>
+          <w:tab w:val="num" w:pos="2127"/>
+        </w:tabs>
+        <w:ind w:left="2127" w:hanging="283"/>
+      </w:pPr>
+      <w:rPr/>
+    </w:lvl>
+    <w:lvl w:ilvl="3">
+      <w:start w:val="1"/>
+      <w:numFmt w:val="decimal"/>
+      <w:lvlText w:val="%4."/>
+      <w:lvlJc w:val="left"/>
+      <w:pPr>
+        <w:tabs>
+          <w:tab w:val="num" w:pos="2836"/>
+        </w:tabs>
+        <w:ind w:left="2836" w:hanging="283"/>
+      </w:pPr>
+      <w:rPr/>
+    </w:lvl>
+    <w:lvl w:ilvl="4">
+      <w:start w:val="1"/>
+      <w:numFmt w:val="decimal"/>
+      <w:lvlText w:val="%5."/>
+      <w:lvlJc w:val="left"/>
+      <w:pPr>
+        <w:tabs>
+          <w:tab w:val="num" w:pos="3545"/>
+        </w:tabs>
+        <w:ind w:left="3545" w:hanging="283"/>
+      </w:pPr>
+      <w:rPr/>
+    </w:lvl>
+    <w:lvl w:ilvl="5">
+      <w:start w:val="1"/>
+      <w:numFmt w:val="decimal"/>
+      <w:lvlText w:val="%6."/>
+      <w:lvlJc w:val="left"/>
+      <w:pPr>
+        <w:tabs>
+          <w:tab w:val="num" w:pos="4254"/>
+        </w:tabs>
+        <w:ind w:left="4254" w:hanging="283"/>
+      </w:pPr>
+      <w:rPr/>
+    </w:lvl>
+    <w:lvl w:ilvl="6">
+      <w:start w:val="1"/>
+      <w:numFmt w:val="decimal"/>
+      <w:lvlText w:val="%7."/>
+      <w:lvlJc w:val="left"/>
+      <w:pPr>
+        <w:tabs>
+          <w:tab w:val="num" w:pos="4963"/>
+        </w:tabs>
+        <w:ind w:left="4963" w:hanging="283"/>
+      </w:pPr>
+      <w:rPr/>
+    </w:lvl>
+    <w:lvl w:ilvl="7">
+      <w:start w:val="1"/>
+      <w:numFmt w:val="decimal"/>
+      <w:lvlText w:val="%8."/>
+      <w:lvlJc w:val="left"/>
+      <w:pPr>
+        <w:tabs>
+          <w:tab w:val="num" w:pos="5672"/>
+        </w:tabs>
+        <w:ind w:left="5672" w:hanging="283"/>
+      </w:pPr>
+      <w:rPr/>
+    </w:lvl>
+    <w:lvl w:ilvl="8">
+      <w:start w:val="1"/>
+      <w:numFmt w:val="decimal"/>
+      <w:lvlText w:val="%9."/>
+      <w:lvlJc w:val="left"/>
+      <w:pPr>
+        <w:tabs>
+          <w:tab w:val="num" w:pos="6381"/>
+        </w:tabs>
+        <w:ind w:left="6381" w:hanging="283"/>
+      </w:pPr>
+      <w:rPr/>
+    </w:lvl>
+  </w:abstractNum>
+  <w:abstractNum w:abstractNumId="4">
+    <w:lvl w:ilvl="0">
+      <w:start w:val="1"/>
+      <w:numFmt w:val="bullet"/>
+      <w:lvlText w:val=""/>
+      <w:lvlJc w:val="left"/>
+      <w:pPr>
+        <w:tabs>
+          <w:tab w:val="num" w:pos="709"/>
+        </w:tabs>
+        <w:ind w:left="709" w:hanging="283"/>
+      </w:pPr>
+      <w:rPr>
+        <w:rFonts w:ascii="Symbol" w:hAnsi="Symbol" w:cs="Symbol" w:hint="default"/>
+      </w:rPr>
+    </w:lvl>
+    <w:lvl w:ilvl="1">
+      <w:start w:val="1"/>
+      <w:numFmt w:val="bullet"/>
+      <w:lvlText w:val=""/>
+      <w:lvlJc w:val="left"/>
+      <w:pPr>
+        <w:tabs>
+          <w:tab w:val="num" w:pos="1418"/>
+        </w:tabs>
+        <w:ind w:left="1418" w:hanging="283"/>
+      </w:pPr>
+      <w:rPr>
+        <w:rFonts w:ascii="Symbol" w:hAnsi="Symbol" w:cs="Symbol" w:hint="default"/>
+      </w:rPr>
+    </w:lvl>
+    <w:lvl w:ilvl="2">
+      <w:start w:val="1"/>
+      <w:numFmt w:val="bullet"/>
+      <w:lvlText w:val=""/>
+      <w:lvlJc w:val="left"/>
+      <w:pPr>
+        <w:tabs>
+          <w:tab w:val="num" w:pos="2127"/>
+        </w:tabs>
+        <w:ind w:left="2127" w:hanging="283"/>
+      </w:pPr>
+      <w:rPr>
+        <w:rFonts w:ascii="Symbol" w:hAnsi="Symbol" w:cs="Symbol" w:hint="default"/>
+      </w:rPr>
+    </w:lvl>
+    <w:lvl w:ilvl="3">
+      <w:start w:val="1"/>
+      <w:numFmt w:val="bullet"/>
+      <w:lvlText w:val=""/>
+      <w:lvlJc w:val="left"/>
+      <w:pPr>
+        <w:tabs>
+          <w:tab w:val="num" w:pos="2836"/>
+        </w:tabs>
+        <w:ind w:left="2836" w:hanging="283"/>
+      </w:pPr>
+      <w:rPr>
+        <w:rFonts w:ascii="Symbol" w:hAnsi="Symbol" w:cs="Symbol" w:hint="default"/>
+      </w:rPr>
+    </w:lvl>
+    <w:lvl w:ilvl="4">
+      <w:start w:val="1"/>
+      <w:numFmt w:val="bullet"/>
+      <w:lvlText w:val=""/>
+      <w:lvlJc w:val="left"/>
+      <w:pPr>
+        <w:tabs>
+          <w:tab w:val="num" w:pos="3545"/>
+        </w:tabs>
+        <w:ind w:left="3545" w:hanging="283"/>
+      </w:pPr>
+      <w:rPr>
+        <w:rFonts w:ascii="Symbol" w:hAnsi="Symbol" w:cs="Symbol" w:hint="default"/>
+      </w:rPr>
+    </w:lvl>
+    <w:lvl w:ilvl="5">
+      <w:start w:val="1"/>
+      <w:numFmt w:val="bullet"/>
+      <w:lvlText w:val=""/>
+      <w:lvlJc w:val="left"/>
+      <w:pPr>
+        <w:tabs>
+          <w:tab w:val="num" w:pos="4254"/>
+        </w:tabs>
+        <w:ind w:left="4254" w:hanging="283"/>
+      </w:pPr>
+      <w:rPr>
+        <w:rFonts w:ascii="Symbol" w:hAnsi="Symbol" w:cs="Symbol" w:hint="default"/>
+      </w:rPr>
+    </w:lvl>
+    <w:lvl w:ilvl="6">
+      <w:start w:val="1"/>
+      <w:numFmt w:val="bullet"/>
+      <w:lvlText w:val=""/>
+      <w:lvlJc w:val="left"/>
+      <w:pPr>
+        <w:tabs>
+          <w:tab w:val="num" w:pos="4963"/>
+        </w:tabs>
+        <w:ind w:left="4963" w:hanging="283"/>
+      </w:pPr>
+      <w:rPr>
+        <w:rFonts w:ascii="Symbol" w:hAnsi="Symbol" w:cs="Symbol" w:hint="default"/>
+      </w:rPr>
+    </w:lvl>
+    <w:lvl w:ilvl="7">
+      <w:start w:val="1"/>
+      <w:numFmt w:val="bullet"/>
+      <w:lvlText w:val=""/>
+      <w:lvlJc w:val="left"/>
+      <w:pPr>
+        <w:tabs>
+          <w:tab w:val="num" w:pos="5672"/>
+        </w:tabs>
+        <w:ind w:left="5672" w:hanging="283"/>
+      </w:pPr>
+      <w:rPr>
+        <w:rFonts w:ascii="Symbol" w:hAnsi="Symbol" w:cs="Symbol" w:hint="default"/>
+      </w:rPr>
+    </w:lvl>
+    <w:lvl w:ilvl="8">
+      <w:start w:val="1"/>
+      <w:numFmt w:val="bullet"/>
+      <w:lvlText w:val=""/>
+      <w:lvlJc w:val="left"/>
+      <w:pPr>
+        <w:tabs>
+          <w:tab w:val="num" w:pos="6381"/>
+        </w:tabs>
+        <w:ind w:left="6381" w:hanging="283"/>
+      </w:pPr>
+      <w:rPr>
+        <w:rFonts w:ascii="Symbol" w:hAnsi="Symbol" w:cs="Symbol" w:hint="default"/>
+      </w:rPr>
+    </w:lvl>
+  </w:abstractNum>
+  <w:abstractNum w:abstractNumId="5">
+    <w:lvl w:ilvl="0">
+      <w:start w:val="1"/>
+      <w:numFmt w:val="bullet"/>
+      <w:lvlText w:val=""/>
+      <w:lvlJc w:val="left"/>
+      <w:pPr>
+        <w:tabs>
+          <w:tab w:val="num" w:pos="709"/>
+        </w:tabs>
+        <w:ind w:left="709" w:hanging="283"/>
+      </w:pPr>
+      <w:rPr>
+        <w:rFonts w:ascii="Symbol" w:hAnsi="Symbol" w:cs="Symbol" w:hint="default"/>
+      </w:rPr>
+    </w:lvl>
+    <w:lvl w:ilvl="1">
+      <w:start w:val="1"/>
+      <w:numFmt w:val="bullet"/>
+      <w:lvlText w:val=""/>
+      <w:lvlJc w:val="left"/>
+      <w:pPr>
+        <w:tabs>
+          <w:tab w:val="num" w:pos="1418"/>
+        </w:tabs>
+        <w:ind w:left="1418" w:hanging="283"/>
+      </w:pPr>
+      <w:rPr>
+        <w:rFonts w:ascii="Symbol" w:hAnsi="Symbol" w:cs="Symbol" w:hint="default"/>
+      </w:rPr>
+    </w:lvl>
+    <w:lvl w:ilvl="2">
+      <w:start w:val="1"/>
+      <w:numFmt w:val="bullet"/>
+      <w:lvlText w:val=""/>
+      <w:lvlJc w:val="left"/>
+      <w:pPr>
+        <w:tabs>
+          <w:tab w:val="num" w:pos="2127"/>
+        </w:tabs>
+        <w:ind w:left="2127" w:hanging="283"/>
+      </w:pPr>
+      <w:rPr>
+        <w:rFonts w:ascii="Symbol" w:hAnsi="Symbol" w:cs="Symbol" w:hint="default"/>
+      </w:rPr>
+    </w:lvl>
+    <w:lvl w:ilvl="3">
+      <w:start w:val="1"/>
+      <w:numFmt w:val="bullet"/>
+      <w:lvlText w:val=""/>
+      <w:lvlJc w:val="left"/>
+      <w:pPr>
+        <w:tabs>
+          <w:tab w:val="num" w:pos="2836"/>
+        </w:tabs>
+        <w:ind w:left="2836" w:hanging="283"/>
+      </w:pPr>
+      <w:rPr>
+        <w:rFonts w:ascii="Symbol" w:hAnsi="Symbol" w:cs="Symbol" w:hint="default"/>
+      </w:rPr>
+    </w:lvl>
+    <w:lvl w:ilvl="4">
+      <w:start w:val="1"/>
+      <w:numFmt w:val="bullet"/>
+      <w:lvlText w:val=""/>
+      <w:lvlJc w:val="left"/>
+      <w:pPr>
+        <w:tabs>
+          <w:tab w:val="num" w:pos="3545"/>
+        </w:tabs>
+        <w:ind w:left="3545" w:hanging="283"/>
+      </w:pPr>
+      <w:rPr>
+        <w:rFonts w:ascii="Symbol" w:hAnsi="Symbol" w:cs="Symbol" w:hint="default"/>
+      </w:rPr>
+    </w:lvl>
+    <w:lvl w:ilvl="5">
+      <w:start w:val="1"/>
+      <w:numFmt w:val="bullet"/>
+      <w:lvlText w:val=""/>
+      <w:lvlJc w:val="left"/>
+      <w:pPr>
+        <w:tabs>
+          <w:tab w:val="num" w:pos="4254"/>
+        </w:tabs>
+        <w:ind w:left="4254" w:hanging="283"/>
+      </w:pPr>
+      <w:rPr>
+        <w:rFonts w:ascii="Symbol" w:hAnsi="Symbol" w:cs="Symbol" w:hint="default"/>
+      </w:rPr>
+    </w:lvl>
+    <w:lvl w:ilvl="6">
+      <w:start w:val="1"/>
+      <w:numFmt w:val="bullet"/>
+      <w:lvlText w:val=""/>
+      <w:lvlJc w:val="left"/>
+      <w:pPr>
+        <w:tabs>
+          <w:tab w:val="num" w:pos="4963"/>
+        </w:tabs>
+        <w:ind w:left="4963" w:hanging="283"/>
+      </w:pPr>
+      <w:rPr>
+        <w:rFonts w:ascii="Symbol" w:hAnsi="Symbol" w:cs="Symbol" w:hint="default"/>
+      </w:rPr>
+    </w:lvl>
+    <w:lvl w:ilvl="7">
+      <w:start w:val="1"/>
+      <w:numFmt w:val="bullet"/>
+      <w:lvlText w:val=""/>
+      <w:lvlJc w:val="left"/>
+      <w:pPr>
+        <w:tabs>
+          <w:tab w:val="num" w:pos="5672"/>
+        </w:tabs>
+        <w:ind w:left="5672" w:hanging="283"/>
+      </w:pPr>
+      <w:rPr>
+        <w:rFonts w:ascii="Symbol" w:hAnsi="Symbol" w:cs="Symbol" w:hint="default"/>
+      </w:rPr>
+    </w:lvl>
+    <w:lvl w:ilvl="8">
+      <w:start w:val="1"/>
+      <w:numFmt w:val="bullet"/>
+      <w:lvlText w:val=""/>
+      <w:lvlJc w:val="left"/>
+      <w:pPr>
+        <w:tabs>
+          <w:tab w:val="num" w:pos="6381"/>
+        </w:tabs>
+        <w:ind w:left="6381" w:hanging="283"/>
+      </w:pPr>
+      <w:rPr>
+        <w:rFonts w:ascii="Symbol" w:hAnsi="Symbol" w:cs="Symbol" w:hint="default"/>
+      </w:rPr>
+    </w:lvl>
+  </w:abstractNum>
+  <w:abstractNum w:abstractNumId="6">
+    <w:lvl w:ilvl="0">
+      <w:start w:val="1"/>
+      <w:numFmt w:val="bullet"/>
+      <w:suff w:val="nothing"/>
+      <w:lvlText w:val=""/>
+      <w:lvlJc w:val="left"/>
+      <w:pPr>
+        <w:tabs>
+          <w:tab w:val="num" w:pos="0"/>
+        </w:tabs>
+        <w:ind w:left="709" w:hanging="0"/>
+      </w:pPr>
+      <w:rPr>
+        <w:rFonts w:ascii="Symbol" w:hAnsi="Symbol" w:cs="Symbol" w:hint="default"/>
+      </w:rPr>
+    </w:lvl>
+    <w:lvl w:ilvl="1">
+      <w:start w:val="1"/>
+      <w:numFmt w:val="bullet"/>
+      <w:lvlText w:val=""/>
+      <w:lvlJc w:val="left"/>
+      <w:pPr>
+        <w:tabs>
+          <w:tab w:val="num" w:pos="1418"/>
+        </w:tabs>
+        <w:ind w:left="1418" w:hanging="283"/>
+      </w:pPr>
+      <w:rPr>
+        <w:rFonts w:ascii="Symbol" w:hAnsi="Symbol" w:cs="Symbol" w:hint="default"/>
+      </w:rPr>
+    </w:lvl>
+    <w:lvl w:ilvl="2">
+      <w:start w:val="1"/>
+      <w:numFmt w:val="bullet"/>
+      <w:lvlText w:val=""/>
+      <w:lvlJc w:val="left"/>
+      <w:pPr>
+        <w:tabs>
+          <w:tab w:val="num" w:pos="2127"/>
+        </w:tabs>
+        <w:ind w:left="2127" w:hanging="283"/>
+      </w:pPr>
+      <w:rPr>
+        <w:rFonts w:ascii="Symbol" w:hAnsi="Symbol" w:cs="Symbol" w:hint="default"/>
+      </w:rPr>
+    </w:lvl>
+    <w:lvl w:ilvl="3">
+      <w:start w:val="1"/>
+      <w:numFmt w:val="bullet"/>
+      <w:lvlText w:val=""/>
+      <w:lvlJc w:val="left"/>
+      <w:pPr>
+        <w:tabs>
+          <w:tab w:val="num" w:pos="2836"/>
+        </w:tabs>
+        <w:ind w:left="2836" w:hanging="283"/>
+      </w:pPr>
+      <w:rPr>
+        <w:rFonts w:ascii="Symbol" w:hAnsi="Symbol" w:cs="Symbol" w:hint="default"/>
+      </w:rPr>
+    </w:lvl>
+    <w:lvl w:ilvl="4">
+      <w:start w:val="1"/>
+      <w:numFmt w:val="bullet"/>
+      <w:lvlText w:val=""/>
+      <w:lvlJc w:val="left"/>
+      <w:pPr>
+        <w:tabs>
+          <w:tab w:val="num" w:pos="3545"/>
+        </w:tabs>
+        <w:ind w:left="3545" w:hanging="283"/>
+      </w:pPr>
+      <w:rPr>
+        <w:rFonts w:ascii="Symbol" w:hAnsi="Symbol" w:cs="Symbol" w:hint="default"/>
+      </w:rPr>
+    </w:lvl>
+    <w:lvl w:ilvl="5">
+      <w:start w:val="1"/>
+      <w:numFmt w:val="bullet"/>
+      <w:lvlText w:val=""/>
+      <w:lvlJc w:val="left"/>
+      <w:pPr>
+        <w:tabs>
+          <w:tab w:val="num" w:pos="4254"/>
+        </w:tabs>
+        <w:ind w:left="4254" w:hanging="283"/>
+      </w:pPr>
+      <w:rPr>
+        <w:rFonts w:ascii="Symbol" w:hAnsi="Symbol" w:cs="Symbol" w:hint="default"/>
+      </w:rPr>
+    </w:lvl>
+    <w:lvl w:ilvl="6">
+      <w:start w:val="1"/>
+      <w:numFmt w:val="bullet"/>
+      <w:lvlText w:val=""/>
+      <w:lvlJc w:val="left"/>
+      <w:pPr>
+        <w:tabs>
+          <w:tab w:val="num" w:pos="4963"/>
+        </w:tabs>
+        <w:ind w:left="4963" w:hanging="283"/>
+      </w:pPr>
+      <w:rPr>
+        <w:rFonts w:ascii="Symbol" w:hAnsi="Symbol" w:cs="Symbol" w:hint="default"/>
+      </w:rPr>
+    </w:lvl>
+    <w:lvl w:ilvl="7">
+      <w:start w:val="1"/>
+      <w:numFmt w:val="bullet"/>
+      <w:lvlText w:val=""/>
+      <w:lvlJc w:val="left"/>
+      <w:pPr>
+        <w:tabs>
+          <w:tab w:val="num" w:pos="5672"/>
+        </w:tabs>
+        <w:ind w:left="5672" w:hanging="283"/>
+      </w:pPr>
+      <w:rPr>
+        <w:rFonts w:ascii="Symbol" w:hAnsi="Symbol" w:cs="Symbol" w:hint="default"/>
+      </w:rPr>
+    </w:lvl>
+    <w:lvl w:ilvl="8">
+      <w:start w:val="1"/>
+      <w:numFmt w:val="bullet"/>
+      <w:lvlText w:val=""/>
+      <w:lvlJc w:val="left"/>
+      <w:pPr>
+        <w:tabs>
+          <w:tab w:val="num" w:pos="6381"/>
+        </w:tabs>
+        <w:ind w:left="6381" w:hanging="283"/>
+      </w:pPr>
+      <w:rPr>
+        <w:rFonts w:ascii="Symbol" w:hAnsi="Symbol" w:cs="Symbol" w:hint="default"/>
+      </w:rPr>
+    </w:lvl>
+  </w:abstractNum>
+  <w:abstractNum w:abstractNumId="7">
+    <w:lvl w:ilvl="0">
+      <w:start w:val="1"/>
+      <w:numFmt w:val="decimal"/>
+      <w:suff w:val="nothing"/>
+      <w:lvlText w:val="%1."/>
+      <w:lvlJc w:val="left"/>
+      <w:pPr>
+        <w:tabs>
+          <w:tab w:val="num" w:pos="0"/>
+        </w:tabs>
+        <w:ind w:left="709" w:hanging="0"/>
+      </w:pPr>
+      <w:rPr/>
+    </w:lvl>
+    <w:lvl w:ilvl="1">
+      <w:start w:val="1"/>
+      <w:numFmt w:val="decimal"/>
+      <w:lvlText w:val="%2."/>
+      <w:lvlJc w:val="left"/>
+      <w:pPr>
+        <w:tabs>
+          <w:tab w:val="num" w:pos="1418"/>
+        </w:tabs>
+        <w:ind w:left="1418" w:hanging="283"/>
+      </w:pPr>
+      <w:rPr/>
+    </w:lvl>
+    <w:lvl w:ilvl="2">
+      <w:start w:val="1"/>
+      <w:numFmt w:val="decimal"/>
+      <w:lvlText w:val="%3."/>
+      <w:lvlJc w:val="left"/>
+      <w:pPr>
+        <w:tabs>
+          <w:tab w:val="num" w:pos="2127"/>
+        </w:tabs>
+        <w:ind w:left="2127" w:hanging="283"/>
+      </w:pPr>
+      <w:rPr/>
+    </w:lvl>
+    <w:lvl w:ilvl="3">
+      <w:start w:val="1"/>
+      <w:numFmt w:val="decimal"/>
+      <w:lvlText w:val="%4."/>
+      <w:lvlJc w:val="left"/>
+      <w:pPr>
+        <w:tabs>
+          <w:tab w:val="num" w:pos="2836"/>
+        </w:tabs>
+        <w:ind w:left="2836" w:hanging="283"/>
+      </w:pPr>
+      <w:rPr/>
+    </w:lvl>
+    <w:lvl w:ilvl="4">
+      <w:start w:val="1"/>
+      <w:numFmt w:val="decimal"/>
+      <w:lvlText w:val="%5."/>
+      <w:lvlJc w:val="left"/>
+      <w:pPr>
+        <w:tabs>
+          <w:tab w:val="num" w:pos="3545"/>
+        </w:tabs>
+        <w:ind w:left="3545" w:hanging="283"/>
+      </w:pPr>
+      <w:rPr/>
+    </w:lvl>
+    <w:lvl w:ilvl="5">
+      <w:start w:val="1"/>
+      <w:numFmt w:val="decimal"/>
+      <w:lvlText w:val="%6."/>
+      <w:lvlJc w:val="left"/>
+      <w:pPr>
+        <w:tabs>
+          <w:tab w:val="num" w:pos="4254"/>
+        </w:tabs>
+        <w:ind w:left="4254" w:hanging="283"/>
+      </w:pPr>
+      <w:rPr/>
+    </w:lvl>
+    <w:lvl w:ilvl="6">
+      <w:start w:val="1"/>
+      <w:numFmt w:val="decimal"/>
+      <w:lvlText w:val="%7."/>
+      <w:lvlJc w:val="left"/>
+      <w:pPr>
+        <w:tabs>
+          <w:tab w:val="num" w:pos="4963"/>
+        </w:tabs>
+        <w:ind w:left="4963" w:hanging="283"/>
+      </w:pPr>
+      <w:rPr/>
+    </w:lvl>
+    <w:lvl w:ilvl="7">
+      <w:start w:val="1"/>
+      <w:numFmt w:val="decimal"/>
+      <w:lvlText w:val="%8."/>
+      <w:lvlJc w:val="left"/>
+      <w:pPr>
+        <w:tabs>
+          <w:tab w:val="num" w:pos="5672"/>
+        </w:tabs>
+        <w:ind w:left="5672" w:hanging="283"/>
+      </w:pPr>
+      <w:rPr/>
+    </w:lvl>
+    <w:lvl w:ilvl="8">
+      <w:start w:val="1"/>
+      <w:numFmt w:val="decimal"/>
+      <w:lvlText w:val="%9."/>
+      <w:lvlJc w:val="left"/>
+      <w:pPr>
+        <w:tabs>
+          <w:tab w:val="num" w:pos="6381"/>
+        </w:tabs>
+        <w:ind w:left="6381" w:hanging="283"/>
+      </w:pPr>
+      <w:rPr/>
+    </w:lvl>
+  </w:abstractNum>
+  <w:abstractNum w:abstractNumId="8">
+    <w:lvl w:ilvl="0">
+      <w:start w:val="1"/>
+      <w:numFmt w:val="bullet"/>
+      <w:suff w:val="nothing"/>
+      <w:lvlText w:val=""/>
+      <w:lvlJc w:val="left"/>
+      <w:pPr>
+        <w:tabs>
+          <w:tab w:val="num" w:pos="0"/>
+        </w:tabs>
+        <w:ind w:left="709" w:hanging="0"/>
+      </w:pPr>
+      <w:rPr>
+        <w:rFonts w:ascii="Symbol" w:hAnsi="Symbol" w:cs="Symbol" w:hint="default"/>
+      </w:rPr>
+    </w:lvl>
+    <w:lvl w:ilvl="1">
+      <w:start w:val="1"/>
+      <w:numFmt w:val="bullet"/>
+      <w:lvlText w:val=""/>
+      <w:lvlJc w:val="left"/>
+      <w:pPr>
+        <w:tabs>
+          <w:tab w:val="num" w:pos="1418"/>
+        </w:tabs>
+        <w:ind w:left="1418" w:hanging="283"/>
+      </w:pPr>
+      <w:rPr>
+        <w:rFonts w:ascii="Symbol" w:hAnsi="Symbol" w:cs="Symbol" w:hint="default"/>
+      </w:rPr>
+    </w:lvl>
+    <w:lvl w:ilvl="2">
+      <w:start w:val="1"/>
+      <w:numFmt w:val="bullet"/>
+      <w:lvlText w:val=""/>
+      <w:lvlJc w:val="left"/>
+      <w:pPr>
+        <w:tabs>
+          <w:tab w:val="num" w:pos="2127"/>
+        </w:tabs>
+        <w:ind w:left="2127" w:hanging="283"/>
+      </w:pPr>
+      <w:rPr>
+        <w:rFonts w:ascii="Symbol" w:hAnsi="Symbol" w:cs="Symbol" w:hint="default"/>
+      </w:rPr>
+    </w:lvl>
+    <w:lvl w:ilvl="3">
+      <w:start w:val="1"/>
+      <w:numFmt w:val="bullet"/>
+      <w:lvlText w:val=""/>
+      <w:lvlJc w:val="left"/>
+      <w:pPr>
+        <w:tabs>
+          <w:tab w:val="num" w:pos="2836"/>
+        </w:tabs>
+        <w:ind w:left="2836" w:hanging="283"/>
+      </w:pPr>
+      <w:rPr>
+        <w:rFonts w:ascii="Symbol" w:hAnsi="Symbol" w:cs="Symbol" w:hint="default"/>
+      </w:rPr>
+    </w:lvl>
+    <w:lvl w:ilvl="4">
+      <w:start w:val="1"/>
+      <w:numFmt w:val="bullet"/>
+      <w:lvlText w:val=""/>
+      <w:lvlJc w:val="left"/>
+      <w:pPr>
+        <w:tabs>
+          <w:tab w:val="num" w:pos="3545"/>
+        </w:tabs>
+        <w:ind w:left="3545" w:hanging="283"/>
+      </w:pPr>
+      <w:rPr>
+        <w:rFonts w:ascii="Symbol" w:hAnsi="Symbol" w:cs="Symbol" w:hint="default"/>
+      </w:rPr>
+    </w:lvl>
+    <w:lvl w:ilvl="5">
+      <w:start w:val="1"/>
+      <w:numFmt w:val="bullet"/>
+      <w:lvlText w:val=""/>
+      <w:lvlJc w:val="left"/>
+      <w:pPr>
+        <w:tabs>
+          <w:tab w:val="num" w:pos="4254"/>
+        </w:tabs>
+        <w:ind w:left="4254" w:hanging="283"/>
+      </w:pPr>
+      <w:rPr>
+        <w:rFonts w:ascii="Symbol" w:hAnsi="Symbol" w:cs="Symbol" w:hint="default"/>
+      </w:rPr>
+    </w:lvl>
+    <w:lvl w:ilvl="6">
+      <w:start w:val="1"/>
+      <w:numFmt w:val="bullet"/>
+      <w:lvlText w:val=""/>
+      <w:lvlJc w:val="left"/>
+      <w:pPr>
+        <w:tabs>
+          <w:tab w:val="num" w:pos="4963"/>
+        </w:tabs>
+        <w:ind w:left="4963" w:hanging="283"/>
+      </w:pPr>
+      <w:rPr>
+        <w:rFonts w:ascii="Symbol" w:hAnsi="Symbol" w:cs="Symbol" w:hint="default"/>
+      </w:rPr>
+    </w:lvl>
+    <w:lvl w:ilvl="7">
+      <w:start w:val="1"/>
+      <w:numFmt w:val="bullet"/>
+      <w:lvlText w:val=""/>
+      <w:lvlJc w:val="left"/>
+      <w:pPr>
+        <w:tabs>
+          <w:tab w:val="num" w:pos="5672"/>
+        </w:tabs>
+        <w:ind w:left="5672" w:hanging="283"/>
+      </w:pPr>
+      <w:rPr>
+        <w:rFonts w:ascii="Symbol" w:hAnsi="Symbol" w:cs="Symbol" w:hint="default"/>
+      </w:rPr>
+    </w:lvl>
+    <w:lvl w:ilvl="8">
+      <w:start w:val="1"/>
+      <w:numFmt w:val="bullet"/>
+      <w:lvlText w:val=""/>
+      <w:lvlJc w:val="left"/>
+      <w:pPr>
+        <w:tabs>
+          <w:tab w:val="num" w:pos="6381"/>
+        </w:tabs>
+        <w:ind w:left="6381" w:hanging="283"/>
+      </w:pPr>
+      <w:rPr>
+        <w:rFonts w:ascii="Symbol" w:hAnsi="Symbol" w:cs="Symbol" w:hint="default"/>
+      </w:rPr>
+    </w:lvl>
+  </w:abstractNum>
+  <w:abstractNum w:abstractNumId="9">
+    <w:lvl w:ilvl="0">
+      <w:start w:val="1"/>
+      <w:numFmt w:val="bullet"/>
+      <w:lvlText w:val=""/>
+      <w:lvlJc w:val="left"/>
+      <w:pPr>
+        <w:tabs>
+          <w:tab w:val="num" w:pos="709"/>
+        </w:tabs>
+        <w:ind w:left="709" w:hanging="283"/>
+      </w:pPr>
+      <w:rPr>
+        <w:rFonts w:ascii="Symbol" w:hAnsi="Symbol" w:cs="Symbol" w:hint="default"/>
+      </w:rPr>
+    </w:lvl>
+    <w:lvl w:ilvl="1">
+      <w:start w:val="1"/>
+      <w:numFmt w:val="bullet"/>
+      <w:lvlText w:val=""/>
+      <w:lvlJc w:val="left"/>
+      <w:pPr>
+        <w:tabs>
+          <w:tab w:val="num" w:pos="1418"/>
+        </w:tabs>
+        <w:ind w:left="1418" w:hanging="283"/>
+      </w:pPr>
+      <w:rPr>
+        <w:rFonts w:ascii="Symbol" w:hAnsi="Symbol" w:cs="Symbol" w:hint="default"/>
+      </w:rPr>
+    </w:lvl>
+    <w:lvl w:ilvl="2">
+      <w:start w:val="1"/>
+      <w:numFmt w:val="bullet"/>
+      <w:lvlText w:val=""/>
+      <w:lvlJc w:val="left"/>
+      <w:pPr>
+        <w:tabs>
+          <w:tab w:val="num" w:pos="2127"/>
+        </w:tabs>
+        <w:ind w:left="2127" w:hanging="283"/>
+      </w:pPr>
+      <w:rPr>
+        <w:rFonts w:ascii="Symbol" w:hAnsi="Symbol" w:cs="Symbol" w:hint="default"/>
+      </w:rPr>
+    </w:lvl>
+    <w:lvl w:ilvl="3">
+      <w:start w:val="1"/>
+      <w:numFmt w:val="bullet"/>
+      <w:lvlText w:val=""/>
+      <w:lvlJc w:val="left"/>
+      <w:pPr>
+        <w:tabs>
+          <w:tab w:val="num" w:pos="2836"/>
+        </w:tabs>
+        <w:ind w:left="2836" w:hanging="283"/>
+      </w:pPr>
+      <w:rPr>
+        <w:rFonts w:ascii="Symbol" w:hAnsi="Symbol" w:cs="Symbol" w:hint="default"/>
+      </w:rPr>
+    </w:lvl>
+    <w:lvl w:ilvl="4">
+      <w:start w:val="1"/>
+      <w:numFmt w:val="bullet"/>
+      <w:lvlText w:val=""/>
+      <w:lvlJc w:val="left"/>
+      <w:pPr>
+        <w:tabs>
+          <w:tab w:val="num" w:pos="3545"/>
+        </w:tabs>
+        <w:ind w:left="3545" w:hanging="283"/>
+      </w:pPr>
+      <w:rPr>
+        <w:rFonts w:ascii="Symbol" w:hAnsi="Symbol" w:cs="Symbol" w:hint="default"/>
+      </w:rPr>
+    </w:lvl>
+    <w:lvl w:ilvl="5">
+      <w:start w:val="1"/>
+      <w:numFmt w:val="bullet"/>
+      <w:lvlText w:val=""/>
+      <w:lvlJc w:val="left"/>
+      <w:pPr>
+        <w:tabs>
+          <w:tab w:val="num" w:pos="4254"/>
+        </w:tabs>
+        <w:ind w:left="4254" w:hanging="283"/>
+      </w:pPr>
+      <w:rPr>
+        <w:rFonts w:ascii="Symbol" w:hAnsi="Symbol" w:cs="Symbol" w:hint="default"/>
+      </w:rPr>
+    </w:lvl>
+    <w:lvl w:ilvl="6">
+      <w:start w:val="1"/>
+      <w:numFmt w:val="bullet"/>
+      <w:lvlText w:val=""/>
+      <w:lvlJc w:val="left"/>
+      <w:pPr>
+        <w:tabs>
+          <w:tab w:val="num" w:pos="4963"/>
+        </w:tabs>
+        <w:ind w:left="4963" w:hanging="283"/>
+      </w:pPr>
+      <w:rPr>
+        <w:rFonts w:ascii="Symbol" w:hAnsi="Symbol" w:cs="Symbol" w:hint="default"/>
+      </w:rPr>
+    </w:lvl>
+    <w:lvl w:ilvl="7">
+      <w:start w:val="1"/>
+      <w:numFmt w:val="bullet"/>
+      <w:lvlText w:val=""/>
+      <w:lvlJc w:val="left"/>
+      <w:pPr>
+        <w:tabs>
+          <w:tab w:val="num" w:pos="5672"/>
+        </w:tabs>
+        <w:ind w:left="5672" w:hanging="283"/>
+      </w:pPr>
+      <w:rPr>
+        <w:rFonts w:ascii="Symbol" w:hAnsi="Symbol" w:cs="Symbol" w:hint="default"/>
+      </w:rPr>
+    </w:lvl>
+    <w:lvl w:ilvl="8">
+      <w:start w:val="1"/>
+      <w:numFmt w:val="bullet"/>
+      <w:lvlText w:val=""/>
+      <w:lvlJc w:val="left"/>
+      <w:pPr>
+        <w:tabs>
+          <w:tab w:val="num" w:pos="6381"/>
+        </w:tabs>
+        <w:ind w:left="6381" w:hanging="283"/>
+      </w:pPr>
+      <w:rPr>
+        <w:rFonts w:ascii="Symbol" w:hAnsi="Symbol" w:cs="Symbol" w:hint="default"/>
+      </w:rPr>
+    </w:lvl>
+  </w:abstractNum>
+  <w:abstractNum w:abstractNumId="10">
+    <w:lvl w:ilvl="0">
+      <w:start w:val="1"/>
       <w:numFmt w:val="none"/>
       <w:suff w:val="nothing"/>
       <w:lvlText w:val=""/>
@@ -5344,1071 +6852,6 @@
         </w:tabs>
         <w:ind w:left="0" w:hanging="0"/>
       </w:pPr>
-    </w:lvl>
-  </w:abstractNum>
-  <w:abstractNum w:abstractNumId="2">
-    <w:lvl w:ilvl="0">
-      <w:start w:val="1"/>
-      <w:numFmt w:val="bullet"/>
-      <w:suff w:val="nothing"/>
-      <w:lvlText w:val=""/>
-      <w:lvlJc w:val="left"/>
-      <w:pPr>
-        <w:tabs>
-          <w:tab w:val="num" w:pos="0"/>
-        </w:tabs>
-        <w:ind w:left="709" w:hanging="0"/>
-      </w:pPr>
-      <w:rPr>
-        <w:rFonts w:ascii="Symbol" w:hAnsi="Symbol" w:cs="Symbol" w:hint="default"/>
-      </w:rPr>
-    </w:lvl>
-    <w:lvl w:ilvl="1">
-      <w:start w:val="1"/>
-      <w:numFmt w:val="bullet"/>
-      <w:lvlText w:val=""/>
-      <w:lvlJc w:val="left"/>
-      <w:pPr>
-        <w:tabs>
-          <w:tab w:val="num" w:pos="1418"/>
-        </w:tabs>
-        <w:ind w:left="1418" w:hanging="283"/>
-      </w:pPr>
-      <w:rPr>
-        <w:rFonts w:ascii="Symbol" w:hAnsi="Symbol" w:cs="Symbol" w:hint="default"/>
-      </w:rPr>
-    </w:lvl>
-    <w:lvl w:ilvl="2">
-      <w:start w:val="1"/>
-      <w:numFmt w:val="bullet"/>
-      <w:lvlText w:val=""/>
-      <w:lvlJc w:val="left"/>
-      <w:pPr>
-        <w:tabs>
-          <w:tab w:val="num" w:pos="2127"/>
-        </w:tabs>
-        <w:ind w:left="2127" w:hanging="283"/>
-      </w:pPr>
-      <w:rPr>
-        <w:rFonts w:ascii="Symbol" w:hAnsi="Symbol" w:cs="Symbol" w:hint="default"/>
-      </w:rPr>
-    </w:lvl>
-    <w:lvl w:ilvl="3">
-      <w:start w:val="1"/>
-      <w:numFmt w:val="bullet"/>
-      <w:lvlText w:val=""/>
-      <w:lvlJc w:val="left"/>
-      <w:pPr>
-        <w:tabs>
-          <w:tab w:val="num" w:pos="2836"/>
-        </w:tabs>
-        <w:ind w:left="2836" w:hanging="283"/>
-      </w:pPr>
-      <w:rPr>
-        <w:rFonts w:ascii="Symbol" w:hAnsi="Symbol" w:cs="Symbol" w:hint="default"/>
-      </w:rPr>
-    </w:lvl>
-    <w:lvl w:ilvl="4">
-      <w:start w:val="1"/>
-      <w:numFmt w:val="bullet"/>
-      <w:lvlText w:val=""/>
-      <w:lvlJc w:val="left"/>
-      <w:pPr>
-        <w:tabs>
-          <w:tab w:val="num" w:pos="3545"/>
-        </w:tabs>
-        <w:ind w:left="3545" w:hanging="283"/>
-      </w:pPr>
-      <w:rPr>
-        <w:rFonts w:ascii="Symbol" w:hAnsi="Symbol" w:cs="Symbol" w:hint="default"/>
-      </w:rPr>
-    </w:lvl>
-    <w:lvl w:ilvl="5">
-      <w:start w:val="1"/>
-      <w:numFmt w:val="bullet"/>
-      <w:lvlText w:val=""/>
-      <w:lvlJc w:val="left"/>
-      <w:pPr>
-        <w:tabs>
-          <w:tab w:val="num" w:pos="4254"/>
-        </w:tabs>
-        <w:ind w:left="4254" w:hanging="283"/>
-      </w:pPr>
-      <w:rPr>
-        <w:rFonts w:ascii="Symbol" w:hAnsi="Symbol" w:cs="Symbol" w:hint="default"/>
-      </w:rPr>
-    </w:lvl>
-    <w:lvl w:ilvl="6">
-      <w:start w:val="1"/>
-      <w:numFmt w:val="bullet"/>
-      <w:lvlText w:val=""/>
-      <w:lvlJc w:val="left"/>
-      <w:pPr>
-        <w:tabs>
-          <w:tab w:val="num" w:pos="4963"/>
-        </w:tabs>
-        <w:ind w:left="4963" w:hanging="283"/>
-      </w:pPr>
-      <w:rPr>
-        <w:rFonts w:ascii="Symbol" w:hAnsi="Symbol" w:cs="Symbol" w:hint="default"/>
-      </w:rPr>
-    </w:lvl>
-    <w:lvl w:ilvl="7">
-      <w:start w:val="1"/>
-      <w:numFmt w:val="bullet"/>
-      <w:lvlText w:val=""/>
-      <w:lvlJc w:val="left"/>
-      <w:pPr>
-        <w:tabs>
-          <w:tab w:val="num" w:pos="5672"/>
-        </w:tabs>
-        <w:ind w:left="5672" w:hanging="283"/>
-      </w:pPr>
-      <w:rPr>
-        <w:rFonts w:ascii="Symbol" w:hAnsi="Symbol" w:cs="Symbol" w:hint="default"/>
-      </w:rPr>
-    </w:lvl>
-    <w:lvl w:ilvl="8">
-      <w:start w:val="1"/>
-      <w:numFmt w:val="bullet"/>
-      <w:lvlText w:val=""/>
-      <w:lvlJc w:val="left"/>
-      <w:pPr>
-        <w:tabs>
-          <w:tab w:val="num" w:pos="6381"/>
-        </w:tabs>
-        <w:ind w:left="6381" w:hanging="283"/>
-      </w:pPr>
-      <w:rPr>
-        <w:rFonts w:ascii="Symbol" w:hAnsi="Symbol" w:cs="Symbol" w:hint="default"/>
-      </w:rPr>
-    </w:lvl>
-  </w:abstractNum>
-  <w:abstractNum w:abstractNumId="3">
-    <w:lvl w:ilvl="0">
-      <w:start w:val="1"/>
-      <w:numFmt w:val="bullet"/>
-      <w:suff w:val="nothing"/>
-      <w:lvlText w:val=""/>
-      <w:lvlJc w:val="left"/>
-      <w:pPr>
-        <w:tabs>
-          <w:tab w:val="num" w:pos="0"/>
-        </w:tabs>
-        <w:ind w:left="709" w:hanging="0"/>
-      </w:pPr>
-      <w:rPr>
-        <w:rFonts w:ascii="Symbol" w:hAnsi="Symbol" w:cs="Symbol" w:hint="default"/>
-      </w:rPr>
-    </w:lvl>
-    <w:lvl w:ilvl="1">
-      <w:start w:val="1"/>
-      <w:numFmt w:val="bullet"/>
-      <w:lvlText w:val=""/>
-      <w:lvlJc w:val="left"/>
-      <w:pPr>
-        <w:tabs>
-          <w:tab w:val="num" w:pos="1418"/>
-        </w:tabs>
-        <w:ind w:left="1418" w:hanging="283"/>
-      </w:pPr>
-      <w:rPr>
-        <w:rFonts w:ascii="Symbol" w:hAnsi="Symbol" w:cs="Symbol" w:hint="default"/>
-      </w:rPr>
-    </w:lvl>
-    <w:lvl w:ilvl="2">
-      <w:start w:val="1"/>
-      <w:numFmt w:val="bullet"/>
-      <w:lvlText w:val=""/>
-      <w:lvlJc w:val="left"/>
-      <w:pPr>
-        <w:tabs>
-          <w:tab w:val="num" w:pos="2127"/>
-        </w:tabs>
-        <w:ind w:left="2127" w:hanging="283"/>
-      </w:pPr>
-      <w:rPr>
-        <w:rFonts w:ascii="Symbol" w:hAnsi="Symbol" w:cs="Symbol" w:hint="default"/>
-      </w:rPr>
-    </w:lvl>
-    <w:lvl w:ilvl="3">
-      <w:start w:val="1"/>
-      <w:numFmt w:val="bullet"/>
-      <w:lvlText w:val=""/>
-      <w:lvlJc w:val="left"/>
-      <w:pPr>
-        <w:tabs>
-          <w:tab w:val="num" w:pos="2836"/>
-        </w:tabs>
-        <w:ind w:left="2836" w:hanging="283"/>
-      </w:pPr>
-      <w:rPr>
-        <w:rFonts w:ascii="Symbol" w:hAnsi="Symbol" w:cs="Symbol" w:hint="default"/>
-      </w:rPr>
-    </w:lvl>
-    <w:lvl w:ilvl="4">
-      <w:start w:val="1"/>
-      <w:numFmt w:val="bullet"/>
-      <w:lvlText w:val=""/>
-      <w:lvlJc w:val="left"/>
-      <w:pPr>
-        <w:tabs>
-          <w:tab w:val="num" w:pos="3545"/>
-        </w:tabs>
-        <w:ind w:left="3545" w:hanging="283"/>
-      </w:pPr>
-      <w:rPr>
-        <w:rFonts w:ascii="Symbol" w:hAnsi="Symbol" w:cs="Symbol" w:hint="default"/>
-      </w:rPr>
-    </w:lvl>
-    <w:lvl w:ilvl="5">
-      <w:start w:val="1"/>
-      <w:numFmt w:val="bullet"/>
-      <w:lvlText w:val=""/>
-      <w:lvlJc w:val="left"/>
-      <w:pPr>
-        <w:tabs>
-          <w:tab w:val="num" w:pos="4254"/>
-        </w:tabs>
-        <w:ind w:left="4254" w:hanging="283"/>
-      </w:pPr>
-      <w:rPr>
-        <w:rFonts w:ascii="Symbol" w:hAnsi="Symbol" w:cs="Symbol" w:hint="default"/>
-      </w:rPr>
-    </w:lvl>
-    <w:lvl w:ilvl="6">
-      <w:start w:val="1"/>
-      <w:numFmt w:val="bullet"/>
-      <w:lvlText w:val=""/>
-      <w:lvlJc w:val="left"/>
-      <w:pPr>
-        <w:tabs>
-          <w:tab w:val="num" w:pos="4963"/>
-        </w:tabs>
-        <w:ind w:left="4963" w:hanging="283"/>
-      </w:pPr>
-      <w:rPr>
-        <w:rFonts w:ascii="Symbol" w:hAnsi="Symbol" w:cs="Symbol" w:hint="default"/>
-      </w:rPr>
-    </w:lvl>
-    <w:lvl w:ilvl="7">
-      <w:start w:val="1"/>
-      <w:numFmt w:val="bullet"/>
-      <w:lvlText w:val=""/>
-      <w:lvlJc w:val="left"/>
-      <w:pPr>
-        <w:tabs>
-          <w:tab w:val="num" w:pos="5672"/>
-        </w:tabs>
-        <w:ind w:left="5672" w:hanging="283"/>
-      </w:pPr>
-      <w:rPr>
-        <w:rFonts w:ascii="Symbol" w:hAnsi="Symbol" w:cs="Symbol" w:hint="default"/>
-      </w:rPr>
-    </w:lvl>
-    <w:lvl w:ilvl="8">
-      <w:start w:val="1"/>
-      <w:numFmt w:val="bullet"/>
-      <w:lvlText w:val=""/>
-      <w:lvlJc w:val="left"/>
-      <w:pPr>
-        <w:tabs>
-          <w:tab w:val="num" w:pos="6381"/>
-        </w:tabs>
-        <w:ind w:left="6381" w:hanging="283"/>
-      </w:pPr>
-      <w:rPr>
-        <w:rFonts w:ascii="Symbol" w:hAnsi="Symbol" w:cs="Symbol" w:hint="default"/>
-      </w:rPr>
-    </w:lvl>
-  </w:abstractNum>
-  <w:abstractNum w:abstractNumId="4">
-    <w:lvl w:ilvl="0">
-      <w:start w:val="1"/>
-      <w:numFmt w:val="decimal"/>
-      <w:lvlText w:val="%1."/>
-      <w:lvlJc w:val="left"/>
-      <w:pPr>
-        <w:tabs>
-          <w:tab w:val="num" w:pos="709"/>
-        </w:tabs>
-        <w:ind w:left="709" w:hanging="283"/>
-      </w:pPr>
-      <w:rPr/>
-    </w:lvl>
-    <w:lvl w:ilvl="1">
-      <w:start w:val="1"/>
-      <w:numFmt w:val="decimal"/>
-      <w:lvlText w:val="%2."/>
-      <w:lvlJc w:val="left"/>
-      <w:pPr>
-        <w:tabs>
-          <w:tab w:val="num" w:pos="1418"/>
-        </w:tabs>
-        <w:ind w:left="1418" w:hanging="283"/>
-      </w:pPr>
-      <w:rPr/>
-    </w:lvl>
-    <w:lvl w:ilvl="2">
-      <w:start w:val="1"/>
-      <w:numFmt w:val="decimal"/>
-      <w:lvlText w:val="%3."/>
-      <w:lvlJc w:val="left"/>
-      <w:pPr>
-        <w:tabs>
-          <w:tab w:val="num" w:pos="2127"/>
-        </w:tabs>
-        <w:ind w:left="2127" w:hanging="283"/>
-      </w:pPr>
-      <w:rPr/>
-    </w:lvl>
-    <w:lvl w:ilvl="3">
-      <w:start w:val="1"/>
-      <w:numFmt w:val="decimal"/>
-      <w:lvlText w:val="%4."/>
-      <w:lvlJc w:val="left"/>
-      <w:pPr>
-        <w:tabs>
-          <w:tab w:val="num" w:pos="2836"/>
-        </w:tabs>
-        <w:ind w:left="2836" w:hanging="283"/>
-      </w:pPr>
-      <w:rPr/>
-    </w:lvl>
-    <w:lvl w:ilvl="4">
-      <w:start w:val="1"/>
-      <w:numFmt w:val="decimal"/>
-      <w:lvlText w:val="%5."/>
-      <w:lvlJc w:val="left"/>
-      <w:pPr>
-        <w:tabs>
-          <w:tab w:val="num" w:pos="3545"/>
-        </w:tabs>
-        <w:ind w:left="3545" w:hanging="283"/>
-      </w:pPr>
-      <w:rPr/>
-    </w:lvl>
-    <w:lvl w:ilvl="5">
-      <w:start w:val="1"/>
-      <w:numFmt w:val="decimal"/>
-      <w:lvlText w:val="%6."/>
-      <w:lvlJc w:val="left"/>
-      <w:pPr>
-        <w:tabs>
-          <w:tab w:val="num" w:pos="4254"/>
-        </w:tabs>
-        <w:ind w:left="4254" w:hanging="283"/>
-      </w:pPr>
-      <w:rPr/>
-    </w:lvl>
-    <w:lvl w:ilvl="6">
-      <w:start w:val="1"/>
-      <w:numFmt w:val="decimal"/>
-      <w:lvlText w:val="%7."/>
-      <w:lvlJc w:val="left"/>
-      <w:pPr>
-        <w:tabs>
-          <w:tab w:val="num" w:pos="4963"/>
-        </w:tabs>
-        <w:ind w:left="4963" w:hanging="283"/>
-      </w:pPr>
-      <w:rPr/>
-    </w:lvl>
-    <w:lvl w:ilvl="7">
-      <w:start w:val="1"/>
-      <w:numFmt w:val="decimal"/>
-      <w:lvlText w:val="%8."/>
-      <w:lvlJc w:val="left"/>
-      <w:pPr>
-        <w:tabs>
-          <w:tab w:val="num" w:pos="5672"/>
-        </w:tabs>
-        <w:ind w:left="5672" w:hanging="283"/>
-      </w:pPr>
-      <w:rPr/>
-    </w:lvl>
-    <w:lvl w:ilvl="8">
-      <w:start w:val="1"/>
-      <w:numFmt w:val="decimal"/>
-      <w:lvlText w:val="%9."/>
-      <w:lvlJc w:val="left"/>
-      <w:pPr>
-        <w:tabs>
-          <w:tab w:val="num" w:pos="6381"/>
-        </w:tabs>
-        <w:ind w:left="6381" w:hanging="283"/>
-      </w:pPr>
-      <w:rPr/>
-    </w:lvl>
-  </w:abstractNum>
-  <w:abstractNum w:abstractNumId="5">
-    <w:lvl w:ilvl="0">
-      <w:start w:val="1"/>
-      <w:numFmt w:val="bullet"/>
-      <w:lvlText w:val=""/>
-      <w:lvlJc w:val="left"/>
-      <w:pPr>
-        <w:tabs>
-          <w:tab w:val="num" w:pos="709"/>
-        </w:tabs>
-        <w:ind w:left="709" w:hanging="283"/>
-      </w:pPr>
-      <w:rPr>
-        <w:rFonts w:ascii="Symbol" w:hAnsi="Symbol" w:cs="Symbol" w:hint="default"/>
-      </w:rPr>
-    </w:lvl>
-    <w:lvl w:ilvl="1">
-      <w:start w:val="1"/>
-      <w:numFmt w:val="bullet"/>
-      <w:lvlText w:val=""/>
-      <w:lvlJc w:val="left"/>
-      <w:pPr>
-        <w:tabs>
-          <w:tab w:val="num" w:pos="1418"/>
-        </w:tabs>
-        <w:ind w:left="1418" w:hanging="283"/>
-      </w:pPr>
-      <w:rPr>
-        <w:rFonts w:ascii="Symbol" w:hAnsi="Symbol" w:cs="Symbol" w:hint="default"/>
-      </w:rPr>
-    </w:lvl>
-    <w:lvl w:ilvl="2">
-      <w:start w:val="1"/>
-      <w:numFmt w:val="bullet"/>
-      <w:lvlText w:val=""/>
-      <w:lvlJc w:val="left"/>
-      <w:pPr>
-        <w:tabs>
-          <w:tab w:val="num" w:pos="2127"/>
-        </w:tabs>
-        <w:ind w:left="2127" w:hanging="283"/>
-      </w:pPr>
-      <w:rPr>
-        <w:rFonts w:ascii="Symbol" w:hAnsi="Symbol" w:cs="Symbol" w:hint="default"/>
-      </w:rPr>
-    </w:lvl>
-    <w:lvl w:ilvl="3">
-      <w:start w:val="1"/>
-      <w:numFmt w:val="bullet"/>
-      <w:lvlText w:val=""/>
-      <w:lvlJc w:val="left"/>
-      <w:pPr>
-        <w:tabs>
-          <w:tab w:val="num" w:pos="2836"/>
-        </w:tabs>
-        <w:ind w:left="2836" w:hanging="283"/>
-      </w:pPr>
-      <w:rPr>
-        <w:rFonts w:ascii="Symbol" w:hAnsi="Symbol" w:cs="Symbol" w:hint="default"/>
-      </w:rPr>
-    </w:lvl>
-    <w:lvl w:ilvl="4">
-      <w:start w:val="1"/>
-      <w:numFmt w:val="bullet"/>
-      <w:lvlText w:val=""/>
-      <w:lvlJc w:val="left"/>
-      <w:pPr>
-        <w:tabs>
-          <w:tab w:val="num" w:pos="3545"/>
-        </w:tabs>
-        <w:ind w:left="3545" w:hanging="283"/>
-      </w:pPr>
-      <w:rPr>
-        <w:rFonts w:ascii="Symbol" w:hAnsi="Symbol" w:cs="Symbol" w:hint="default"/>
-      </w:rPr>
-    </w:lvl>
-    <w:lvl w:ilvl="5">
-      <w:start w:val="1"/>
-      <w:numFmt w:val="bullet"/>
-      <w:lvlText w:val=""/>
-      <w:lvlJc w:val="left"/>
-      <w:pPr>
-        <w:tabs>
-          <w:tab w:val="num" w:pos="4254"/>
-        </w:tabs>
-        <w:ind w:left="4254" w:hanging="283"/>
-      </w:pPr>
-      <w:rPr>
-        <w:rFonts w:ascii="Symbol" w:hAnsi="Symbol" w:cs="Symbol" w:hint="default"/>
-      </w:rPr>
-    </w:lvl>
-    <w:lvl w:ilvl="6">
-      <w:start w:val="1"/>
-      <w:numFmt w:val="bullet"/>
-      <w:lvlText w:val=""/>
-      <w:lvlJc w:val="left"/>
-      <w:pPr>
-        <w:tabs>
-          <w:tab w:val="num" w:pos="4963"/>
-        </w:tabs>
-        <w:ind w:left="4963" w:hanging="283"/>
-      </w:pPr>
-      <w:rPr>
-        <w:rFonts w:ascii="Symbol" w:hAnsi="Symbol" w:cs="Symbol" w:hint="default"/>
-      </w:rPr>
-    </w:lvl>
-    <w:lvl w:ilvl="7">
-      <w:start w:val="1"/>
-      <w:numFmt w:val="bullet"/>
-      <w:lvlText w:val=""/>
-      <w:lvlJc w:val="left"/>
-      <w:pPr>
-        <w:tabs>
-          <w:tab w:val="num" w:pos="5672"/>
-        </w:tabs>
-        <w:ind w:left="5672" w:hanging="283"/>
-      </w:pPr>
-      <w:rPr>
-        <w:rFonts w:ascii="Symbol" w:hAnsi="Symbol" w:cs="Symbol" w:hint="default"/>
-      </w:rPr>
-    </w:lvl>
-    <w:lvl w:ilvl="8">
-      <w:start w:val="1"/>
-      <w:numFmt w:val="bullet"/>
-      <w:lvlText w:val=""/>
-      <w:lvlJc w:val="left"/>
-      <w:pPr>
-        <w:tabs>
-          <w:tab w:val="num" w:pos="6381"/>
-        </w:tabs>
-        <w:ind w:left="6381" w:hanging="283"/>
-      </w:pPr>
-      <w:rPr>
-        <w:rFonts w:ascii="Symbol" w:hAnsi="Symbol" w:cs="Symbol" w:hint="default"/>
-      </w:rPr>
-    </w:lvl>
-  </w:abstractNum>
-  <w:abstractNum w:abstractNumId="6">
-    <w:lvl w:ilvl="0">
-      <w:start w:val="1"/>
-      <w:numFmt w:val="bullet"/>
-      <w:lvlText w:val=""/>
-      <w:lvlJc w:val="left"/>
-      <w:pPr>
-        <w:tabs>
-          <w:tab w:val="num" w:pos="709"/>
-        </w:tabs>
-        <w:ind w:left="709" w:hanging="283"/>
-      </w:pPr>
-      <w:rPr>
-        <w:rFonts w:ascii="Symbol" w:hAnsi="Symbol" w:cs="Symbol" w:hint="default"/>
-      </w:rPr>
-    </w:lvl>
-    <w:lvl w:ilvl="1">
-      <w:start w:val="1"/>
-      <w:numFmt w:val="bullet"/>
-      <w:lvlText w:val=""/>
-      <w:lvlJc w:val="left"/>
-      <w:pPr>
-        <w:tabs>
-          <w:tab w:val="num" w:pos="1418"/>
-        </w:tabs>
-        <w:ind w:left="1418" w:hanging="283"/>
-      </w:pPr>
-      <w:rPr>
-        <w:rFonts w:ascii="Symbol" w:hAnsi="Symbol" w:cs="Symbol" w:hint="default"/>
-      </w:rPr>
-    </w:lvl>
-    <w:lvl w:ilvl="2">
-      <w:start w:val="1"/>
-      <w:numFmt w:val="bullet"/>
-      <w:lvlText w:val=""/>
-      <w:lvlJc w:val="left"/>
-      <w:pPr>
-        <w:tabs>
-          <w:tab w:val="num" w:pos="2127"/>
-        </w:tabs>
-        <w:ind w:left="2127" w:hanging="283"/>
-      </w:pPr>
-      <w:rPr>
-        <w:rFonts w:ascii="Symbol" w:hAnsi="Symbol" w:cs="Symbol" w:hint="default"/>
-      </w:rPr>
-    </w:lvl>
-    <w:lvl w:ilvl="3">
-      <w:start w:val="1"/>
-      <w:numFmt w:val="bullet"/>
-      <w:lvlText w:val=""/>
-      <w:lvlJc w:val="left"/>
-      <w:pPr>
-        <w:tabs>
-          <w:tab w:val="num" w:pos="2836"/>
-        </w:tabs>
-        <w:ind w:left="2836" w:hanging="283"/>
-      </w:pPr>
-      <w:rPr>
-        <w:rFonts w:ascii="Symbol" w:hAnsi="Symbol" w:cs="Symbol" w:hint="default"/>
-      </w:rPr>
-    </w:lvl>
-    <w:lvl w:ilvl="4">
-      <w:start w:val="1"/>
-      <w:numFmt w:val="bullet"/>
-      <w:lvlText w:val=""/>
-      <w:lvlJc w:val="left"/>
-      <w:pPr>
-        <w:tabs>
-          <w:tab w:val="num" w:pos="3545"/>
-        </w:tabs>
-        <w:ind w:left="3545" w:hanging="283"/>
-      </w:pPr>
-      <w:rPr>
-        <w:rFonts w:ascii="Symbol" w:hAnsi="Symbol" w:cs="Symbol" w:hint="default"/>
-      </w:rPr>
-    </w:lvl>
-    <w:lvl w:ilvl="5">
-      <w:start w:val="1"/>
-      <w:numFmt w:val="bullet"/>
-      <w:lvlText w:val=""/>
-      <w:lvlJc w:val="left"/>
-      <w:pPr>
-        <w:tabs>
-          <w:tab w:val="num" w:pos="4254"/>
-        </w:tabs>
-        <w:ind w:left="4254" w:hanging="283"/>
-      </w:pPr>
-      <w:rPr>
-        <w:rFonts w:ascii="Symbol" w:hAnsi="Symbol" w:cs="Symbol" w:hint="default"/>
-      </w:rPr>
-    </w:lvl>
-    <w:lvl w:ilvl="6">
-      <w:start w:val="1"/>
-      <w:numFmt w:val="bullet"/>
-      <w:lvlText w:val=""/>
-      <w:lvlJc w:val="left"/>
-      <w:pPr>
-        <w:tabs>
-          <w:tab w:val="num" w:pos="4963"/>
-        </w:tabs>
-        <w:ind w:left="4963" w:hanging="283"/>
-      </w:pPr>
-      <w:rPr>
-        <w:rFonts w:ascii="Symbol" w:hAnsi="Symbol" w:cs="Symbol" w:hint="default"/>
-      </w:rPr>
-    </w:lvl>
-    <w:lvl w:ilvl="7">
-      <w:start w:val="1"/>
-      <w:numFmt w:val="bullet"/>
-      <w:lvlText w:val=""/>
-      <w:lvlJc w:val="left"/>
-      <w:pPr>
-        <w:tabs>
-          <w:tab w:val="num" w:pos="5672"/>
-        </w:tabs>
-        <w:ind w:left="5672" w:hanging="283"/>
-      </w:pPr>
-      <w:rPr>
-        <w:rFonts w:ascii="Symbol" w:hAnsi="Symbol" w:cs="Symbol" w:hint="default"/>
-      </w:rPr>
-    </w:lvl>
-    <w:lvl w:ilvl="8">
-      <w:start w:val="1"/>
-      <w:numFmt w:val="bullet"/>
-      <w:lvlText w:val=""/>
-      <w:lvlJc w:val="left"/>
-      <w:pPr>
-        <w:tabs>
-          <w:tab w:val="num" w:pos="6381"/>
-        </w:tabs>
-        <w:ind w:left="6381" w:hanging="283"/>
-      </w:pPr>
-      <w:rPr>
-        <w:rFonts w:ascii="Symbol" w:hAnsi="Symbol" w:cs="Symbol" w:hint="default"/>
-      </w:rPr>
-    </w:lvl>
-  </w:abstractNum>
-  <w:abstractNum w:abstractNumId="7">
-    <w:lvl w:ilvl="0">
-      <w:start w:val="1"/>
-      <w:numFmt w:val="bullet"/>
-      <w:suff w:val="nothing"/>
-      <w:lvlText w:val=""/>
-      <w:lvlJc w:val="left"/>
-      <w:pPr>
-        <w:tabs>
-          <w:tab w:val="num" w:pos="0"/>
-        </w:tabs>
-        <w:ind w:left="709" w:hanging="0"/>
-      </w:pPr>
-      <w:rPr>
-        <w:rFonts w:ascii="Symbol" w:hAnsi="Symbol" w:cs="Symbol" w:hint="default"/>
-      </w:rPr>
-    </w:lvl>
-    <w:lvl w:ilvl="1">
-      <w:start w:val="1"/>
-      <w:numFmt w:val="bullet"/>
-      <w:lvlText w:val=""/>
-      <w:lvlJc w:val="left"/>
-      <w:pPr>
-        <w:tabs>
-          <w:tab w:val="num" w:pos="1418"/>
-        </w:tabs>
-        <w:ind w:left="1418" w:hanging="283"/>
-      </w:pPr>
-      <w:rPr>
-        <w:rFonts w:ascii="Symbol" w:hAnsi="Symbol" w:cs="Symbol" w:hint="default"/>
-      </w:rPr>
-    </w:lvl>
-    <w:lvl w:ilvl="2">
-      <w:start w:val="1"/>
-      <w:numFmt w:val="bullet"/>
-      <w:lvlText w:val=""/>
-      <w:lvlJc w:val="left"/>
-      <w:pPr>
-        <w:tabs>
-          <w:tab w:val="num" w:pos="2127"/>
-        </w:tabs>
-        <w:ind w:left="2127" w:hanging="283"/>
-      </w:pPr>
-      <w:rPr>
-        <w:rFonts w:ascii="Symbol" w:hAnsi="Symbol" w:cs="Symbol" w:hint="default"/>
-      </w:rPr>
-    </w:lvl>
-    <w:lvl w:ilvl="3">
-      <w:start w:val="1"/>
-      <w:numFmt w:val="bullet"/>
-      <w:lvlText w:val=""/>
-      <w:lvlJc w:val="left"/>
-      <w:pPr>
-        <w:tabs>
-          <w:tab w:val="num" w:pos="2836"/>
-        </w:tabs>
-        <w:ind w:left="2836" w:hanging="283"/>
-      </w:pPr>
-      <w:rPr>
-        <w:rFonts w:ascii="Symbol" w:hAnsi="Symbol" w:cs="Symbol" w:hint="default"/>
-      </w:rPr>
-    </w:lvl>
-    <w:lvl w:ilvl="4">
-      <w:start w:val="1"/>
-      <w:numFmt w:val="bullet"/>
-      <w:lvlText w:val=""/>
-      <w:lvlJc w:val="left"/>
-      <w:pPr>
-        <w:tabs>
-          <w:tab w:val="num" w:pos="3545"/>
-        </w:tabs>
-        <w:ind w:left="3545" w:hanging="283"/>
-      </w:pPr>
-      <w:rPr>
-        <w:rFonts w:ascii="Symbol" w:hAnsi="Symbol" w:cs="Symbol" w:hint="default"/>
-      </w:rPr>
-    </w:lvl>
-    <w:lvl w:ilvl="5">
-      <w:start w:val="1"/>
-      <w:numFmt w:val="bullet"/>
-      <w:lvlText w:val=""/>
-      <w:lvlJc w:val="left"/>
-      <w:pPr>
-        <w:tabs>
-          <w:tab w:val="num" w:pos="4254"/>
-        </w:tabs>
-        <w:ind w:left="4254" w:hanging="283"/>
-      </w:pPr>
-      <w:rPr>
-        <w:rFonts w:ascii="Symbol" w:hAnsi="Symbol" w:cs="Symbol" w:hint="default"/>
-      </w:rPr>
-    </w:lvl>
-    <w:lvl w:ilvl="6">
-      <w:start w:val="1"/>
-      <w:numFmt w:val="bullet"/>
-      <w:lvlText w:val=""/>
-      <w:lvlJc w:val="left"/>
-      <w:pPr>
-        <w:tabs>
-          <w:tab w:val="num" w:pos="4963"/>
-        </w:tabs>
-        <w:ind w:left="4963" w:hanging="283"/>
-      </w:pPr>
-      <w:rPr>
-        <w:rFonts w:ascii="Symbol" w:hAnsi="Symbol" w:cs="Symbol" w:hint="default"/>
-      </w:rPr>
-    </w:lvl>
-    <w:lvl w:ilvl="7">
-      <w:start w:val="1"/>
-      <w:numFmt w:val="bullet"/>
-      <w:lvlText w:val=""/>
-      <w:lvlJc w:val="left"/>
-      <w:pPr>
-        <w:tabs>
-          <w:tab w:val="num" w:pos="5672"/>
-        </w:tabs>
-        <w:ind w:left="5672" w:hanging="283"/>
-      </w:pPr>
-      <w:rPr>
-        <w:rFonts w:ascii="Symbol" w:hAnsi="Symbol" w:cs="Symbol" w:hint="default"/>
-      </w:rPr>
-    </w:lvl>
-    <w:lvl w:ilvl="8">
-      <w:start w:val="1"/>
-      <w:numFmt w:val="bullet"/>
-      <w:lvlText w:val=""/>
-      <w:lvlJc w:val="left"/>
-      <w:pPr>
-        <w:tabs>
-          <w:tab w:val="num" w:pos="6381"/>
-        </w:tabs>
-        <w:ind w:left="6381" w:hanging="283"/>
-      </w:pPr>
-      <w:rPr>
-        <w:rFonts w:ascii="Symbol" w:hAnsi="Symbol" w:cs="Symbol" w:hint="default"/>
-      </w:rPr>
-    </w:lvl>
-  </w:abstractNum>
-  <w:abstractNum w:abstractNumId="8">
-    <w:lvl w:ilvl="0">
-      <w:start w:val="1"/>
-      <w:numFmt w:val="decimal"/>
-      <w:suff w:val="nothing"/>
-      <w:lvlText w:val="%1."/>
-      <w:lvlJc w:val="left"/>
-      <w:pPr>
-        <w:tabs>
-          <w:tab w:val="num" w:pos="709"/>
-        </w:tabs>
-        <w:ind w:left="709" w:hanging="0"/>
-      </w:pPr>
-      <w:rPr/>
-    </w:lvl>
-    <w:lvl w:ilvl="1">
-      <w:start w:val="1"/>
-      <w:numFmt w:val="decimal"/>
-      <w:lvlText w:val="%2."/>
-      <w:lvlJc w:val="left"/>
-      <w:pPr>
-        <w:tabs>
-          <w:tab w:val="num" w:pos="1418"/>
-        </w:tabs>
-        <w:ind w:left="1418" w:hanging="283"/>
-      </w:pPr>
-      <w:rPr/>
-    </w:lvl>
-    <w:lvl w:ilvl="2">
-      <w:start w:val="1"/>
-      <w:numFmt w:val="decimal"/>
-      <w:lvlText w:val="%3."/>
-      <w:lvlJc w:val="left"/>
-      <w:pPr>
-        <w:tabs>
-          <w:tab w:val="num" w:pos="2127"/>
-        </w:tabs>
-        <w:ind w:left="2127" w:hanging="283"/>
-      </w:pPr>
-      <w:rPr/>
-    </w:lvl>
-    <w:lvl w:ilvl="3">
-      <w:start w:val="1"/>
-      <w:numFmt w:val="decimal"/>
-      <w:lvlText w:val="%4."/>
-      <w:lvlJc w:val="left"/>
-      <w:pPr>
-        <w:tabs>
-          <w:tab w:val="num" w:pos="2836"/>
-        </w:tabs>
-        <w:ind w:left="2836" w:hanging="283"/>
-      </w:pPr>
-      <w:rPr/>
-    </w:lvl>
-    <w:lvl w:ilvl="4">
-      <w:start w:val="1"/>
-      <w:numFmt w:val="decimal"/>
-      <w:lvlText w:val="%5."/>
-      <w:lvlJc w:val="left"/>
-      <w:pPr>
-        <w:tabs>
-          <w:tab w:val="num" w:pos="3545"/>
-        </w:tabs>
-        <w:ind w:left="3545" w:hanging="283"/>
-      </w:pPr>
-      <w:rPr/>
-    </w:lvl>
-    <w:lvl w:ilvl="5">
-      <w:start w:val="1"/>
-      <w:numFmt w:val="decimal"/>
-      <w:lvlText w:val="%6."/>
-      <w:lvlJc w:val="left"/>
-      <w:pPr>
-        <w:tabs>
-          <w:tab w:val="num" w:pos="4254"/>
-        </w:tabs>
-        <w:ind w:left="4254" w:hanging="283"/>
-      </w:pPr>
-      <w:rPr/>
-    </w:lvl>
-    <w:lvl w:ilvl="6">
-      <w:start w:val="1"/>
-      <w:numFmt w:val="decimal"/>
-      <w:lvlText w:val="%7."/>
-      <w:lvlJc w:val="left"/>
-      <w:pPr>
-        <w:tabs>
-          <w:tab w:val="num" w:pos="4963"/>
-        </w:tabs>
-        <w:ind w:left="4963" w:hanging="283"/>
-      </w:pPr>
-      <w:rPr/>
-    </w:lvl>
-    <w:lvl w:ilvl="7">
-      <w:start w:val="1"/>
-      <w:numFmt w:val="decimal"/>
-      <w:lvlText w:val="%8."/>
-      <w:lvlJc w:val="left"/>
-      <w:pPr>
-        <w:tabs>
-          <w:tab w:val="num" w:pos="5672"/>
-        </w:tabs>
-        <w:ind w:left="5672" w:hanging="283"/>
-      </w:pPr>
-      <w:rPr/>
-    </w:lvl>
-    <w:lvl w:ilvl="8">
-      <w:start w:val="1"/>
-      <w:numFmt w:val="decimal"/>
-      <w:lvlText w:val="%9."/>
-      <w:lvlJc w:val="left"/>
-      <w:pPr>
-        <w:tabs>
-          <w:tab w:val="num" w:pos="6381"/>
-        </w:tabs>
-        <w:ind w:left="6381" w:hanging="283"/>
-      </w:pPr>
-      <w:rPr/>
-    </w:lvl>
-  </w:abstractNum>
-  <w:abstractNum w:abstractNumId="9">
-    <w:lvl w:ilvl="0">
-      <w:start w:val="1"/>
-      <w:numFmt w:val="bullet"/>
-      <w:suff w:val="nothing"/>
-      <w:lvlText w:val=""/>
-      <w:lvlJc w:val="left"/>
-      <w:pPr>
-        <w:tabs>
-          <w:tab w:val="num" w:pos="709"/>
-        </w:tabs>
-        <w:ind w:left="709" w:hanging="0"/>
-      </w:pPr>
-      <w:rPr>
-        <w:rFonts w:ascii="Symbol" w:hAnsi="Symbol" w:cs="Symbol" w:hint="default"/>
-      </w:rPr>
-    </w:lvl>
-    <w:lvl w:ilvl="1">
-      <w:start w:val="1"/>
-      <w:numFmt w:val="bullet"/>
-      <w:lvlText w:val=""/>
-      <w:lvlJc w:val="left"/>
-      <w:pPr>
-        <w:tabs>
-          <w:tab w:val="num" w:pos="1418"/>
-        </w:tabs>
-        <w:ind w:left="1418" w:hanging="283"/>
-      </w:pPr>
-      <w:rPr>
-        <w:rFonts w:ascii="Symbol" w:hAnsi="Symbol" w:cs="Symbol" w:hint="default"/>
-      </w:rPr>
-    </w:lvl>
-    <w:lvl w:ilvl="2">
-      <w:start w:val="1"/>
-      <w:numFmt w:val="bullet"/>
-      <w:lvlText w:val=""/>
-      <w:lvlJc w:val="left"/>
-      <w:pPr>
-        <w:tabs>
-          <w:tab w:val="num" w:pos="2127"/>
-        </w:tabs>
-        <w:ind w:left="2127" w:hanging="283"/>
-      </w:pPr>
-      <w:rPr>
-        <w:rFonts w:ascii="Symbol" w:hAnsi="Symbol" w:cs="Symbol" w:hint="default"/>
-      </w:rPr>
-    </w:lvl>
-    <w:lvl w:ilvl="3">
-      <w:start w:val="1"/>
-      <w:numFmt w:val="bullet"/>
-      <w:lvlText w:val=""/>
-      <w:lvlJc w:val="left"/>
-      <w:pPr>
-        <w:tabs>
-          <w:tab w:val="num" w:pos="2836"/>
-        </w:tabs>
-        <w:ind w:left="2836" w:hanging="283"/>
-      </w:pPr>
-      <w:rPr>
-        <w:rFonts w:ascii="Symbol" w:hAnsi="Symbol" w:cs="Symbol" w:hint="default"/>
-      </w:rPr>
-    </w:lvl>
-    <w:lvl w:ilvl="4">
-      <w:start w:val="1"/>
-      <w:numFmt w:val="bullet"/>
-      <w:lvlText w:val=""/>
-      <w:lvlJc w:val="left"/>
-      <w:pPr>
-        <w:tabs>
-          <w:tab w:val="num" w:pos="3545"/>
-        </w:tabs>
-        <w:ind w:left="3545" w:hanging="283"/>
-      </w:pPr>
-      <w:rPr>
-        <w:rFonts w:ascii="Symbol" w:hAnsi="Symbol" w:cs="Symbol" w:hint="default"/>
-      </w:rPr>
-    </w:lvl>
-    <w:lvl w:ilvl="5">
-      <w:start w:val="1"/>
-      <w:numFmt w:val="bullet"/>
-      <w:lvlText w:val=""/>
-      <w:lvlJc w:val="left"/>
-      <w:pPr>
-        <w:tabs>
-          <w:tab w:val="num" w:pos="4254"/>
-        </w:tabs>
-        <w:ind w:left="4254" w:hanging="283"/>
-      </w:pPr>
-      <w:rPr>
-        <w:rFonts w:ascii="Symbol" w:hAnsi="Symbol" w:cs="Symbol" w:hint="default"/>
-      </w:rPr>
-    </w:lvl>
-    <w:lvl w:ilvl="6">
-      <w:start w:val="1"/>
-      <w:numFmt w:val="bullet"/>
-      <w:lvlText w:val=""/>
-      <w:lvlJc w:val="left"/>
-      <w:pPr>
-        <w:tabs>
-          <w:tab w:val="num" w:pos="4963"/>
-        </w:tabs>
-        <w:ind w:left="4963" w:hanging="283"/>
-      </w:pPr>
-      <w:rPr>
-        <w:rFonts w:ascii="Symbol" w:hAnsi="Symbol" w:cs="Symbol" w:hint="default"/>
-      </w:rPr>
-    </w:lvl>
-    <w:lvl w:ilvl="7">
-      <w:start w:val="1"/>
-      <w:numFmt w:val="bullet"/>
-      <w:lvlText w:val=""/>
-      <w:lvlJc w:val="left"/>
-      <w:pPr>
-        <w:tabs>
-          <w:tab w:val="num" w:pos="5672"/>
-        </w:tabs>
-        <w:ind w:left="5672" w:hanging="283"/>
-      </w:pPr>
-      <w:rPr>
-        <w:rFonts w:ascii="Symbol" w:hAnsi="Symbol" w:cs="Symbol" w:hint="default"/>
-      </w:rPr>
-    </w:lvl>
-    <w:lvl w:ilvl="8">
-      <w:start w:val="1"/>
-      <w:numFmt w:val="bullet"/>
-      <w:lvlText w:val=""/>
-      <w:lvlJc w:val="left"/>
-      <w:pPr>
-        <w:tabs>
-          <w:tab w:val="num" w:pos="6381"/>
-        </w:tabs>
-        <w:ind w:left="6381" w:hanging="283"/>
-      </w:pPr>
-      <w:rPr>
-        <w:rFonts w:ascii="Symbol" w:hAnsi="Symbol" w:cs="Symbol" w:hint="default"/>
-      </w:rPr>
     </w:lvl>
   </w:abstractNum>
   <w:num w:numId="1">
@@ -6437,6 +6880,9 @@
   </w:num>
   <w:num w:numId="9">
     <w:abstractNumId w:val="9"/>
+  </w:num>
+  <w:num w:numId="10">
+    <w:abstractNumId w:val="10"/>
   </w:num>
 </w:numbering>
 </file>
@@ -6520,8 +6966,8 @@
       <w:bCs/>
     </w:rPr>
   </w:style>
-  <w:style w:type="character" w:styleId="Bulletsuser">
-    <w:name w:val="Bullets (user)"/>
+  <w:style w:type="character" w:styleId="Bullets">
+    <w:name w:val="Bullets"/>
     <w:qFormat/>
     <w:rPr>
       <w:rFonts w:ascii="OpenSymbol" w:hAnsi="OpenSymbol" w:eastAsia="OpenSymbol" w:cs="OpenSymbol"/>
@@ -6539,8 +6985,8 @@
     <w:qFormat/>
     <w:rPr/>
   </w:style>
-  <w:style w:type="character" w:styleId="Bullets">
-    <w:name w:val="Bullets"/>
+  <w:style w:type="character" w:styleId="Bulletsuser">
+    <w:name w:val="Bullets (user)"/>
     <w:qFormat/>
     <w:rPr>
       <w:rFonts w:ascii="OpenSymbol" w:hAnsi="OpenSymbol" w:eastAsia="OpenSymbol" w:cs="OpenSymbol"/>

</xml_diff>